<commit_message>
Milestone submission-ready: finalna walidacja jezyk+merytoryka+formatowanie
Praca dyplomowa po pelnej walidacji, gotowa do oddania:
- ujednolicenie terminologii impact/impakt/high-impact -> "wplyw"
  (zachowane "Impact Factor" jako nazwa wskaznika)
- naprawa 3 niespojnych cudzyslowow zamykajacych (U+0022 -> U+201D)
- dodane brakujace odwolanie @fig-klastry (rysunek PCA byl osierocony)
- naprawa cross-refa "w Tabela 1" -> "w tabeli [-@tbl-proba]"
- doprecyzowanie 452 vs 462 (osoby z dostepnym sum_IF) + k=3 srednie/mediana
- nowy punkt Ograniczen: prog decyla liczony na pelnej probie (model 08)
- README Python: dopisany scrape_publications.py
- re-render PDF+DOCX (35 stron, exit 0)

Walidacja: hunspell pl_PL 0 literowek, wszystkie liczby zgodne z artefaktami,
bibliografia 28/28, cross-refy spojne, brak data leakage w modelu jakosciowym.

Co-Authored-By: Claude Opus 4.8 (1M context) <noreply@anthropic.com>
</commit_message>
<xml_diff>
--- a/Praca_dyplomowa/praca_dyplomowa.docx
+++ b/Praca_dyplomowa/praca_dyplomowa.docx
@@ -95,7 +95,7 @@
         <w:t xml:space="preserve">współpraca między autorami zależy głównie od uczelni</w:t>
       </w:r>
       <w:r>
-        <w:t xml:space="preserve">: badacze najczęściej współpracują w ramach swojej afiliacji, a nie według stanowiska. Wysoki impact można dość dobrze przewidzieć na podstawie cech badacza. Najważniejsze są produktywność i pozycja w sieci współpracy, a nie samo stanowisko formalne. Model rozróżnia osoby o wysokim i niższym impakcie skumulowanym bardzo skutecznie, osiągając AUC około 0,97, przy czym ten cel jest po części pochodną liczby publikacji. Gdy celem jest jakość niekumulatywna (intensywność cytowań niezależna od dorobku), predykcja jest wyraźnie trudniejsza (AUC około 0,81) i zależy nie od stażu, lecz od struktury współpracy. Wyniki potwierdzają także, że jednorodność i kompletność danych są warunkiem wiarygodnego wnioskowania, ważniejszym niż wygoda gotowych indeksów globalnych: ten sam wskaźnik tempa rozwoju prowadzi do przeciwnych wniosków, gdy dane są niepełne. W polskim szkolnictwie wyższym systemy klasy CRIS, takie jak Omega-PSIR, są więc bezpieczniejszą podstawą porównań międzyuczelnianych niż bazy globalne.</w:t>
+        <w:t xml:space="preserve">: badacze najczęściej współpracują w ramach swojej afiliacji, a nie według stanowiska. Wysoki wpływ można dość dobrze przewidzieć na podstawie cech badacza. Najważniejsze są produktywność i pozycja w sieci współpracy, a nie samo stanowisko formalne. Model rozróżnia osoby o wysokim i niższym wpływie skumulowanym bardzo skutecznie, osiągając AUC około 0,97, przy czym ten cel jest po części pochodną liczby publikacji. Gdy celem jest jakość niekumulatywna (intensywność cytowań niezależna od dorobku), predykcja jest wyraźnie trudniejsza (AUC około 0,81) i zależy nie od stażu, lecz od struktury współpracy. Wyniki potwierdzają także, że jednorodność i kompletność danych są warunkiem wiarygodnego wnioskowania, ważniejszym niż wygoda gotowych indeksów globalnych: ten sam wskaźnik tempa rozwoju prowadzi do przeciwnych wniosków, gdy dane są niepełne. W polskim szkolnictwie wyższym systemy klasy CRIS, takie jak Omega-PSIR, są więc bezpieczniejszą podstawą porównań międzyuczelnianych niż bazy globalne.</w:t>
       </w:r>
     </w:p>
     <w:p>
@@ -1203,7 +1203,7 @@
         <w:t xml:space="preserve"> </w:t>
       </w:r>
       <w:r>
-        <w:t xml:space="preserve">do przewidywania wysokiego impactu zastosowano modele Random Forest</w:t>
+        <w:t xml:space="preserve">do przewidywania wysokiego wpływu zastosowano modele Random Forest</w:t>
       </w:r>
       <w:r>
         <w:t xml:space="preserve"> </w:t>
@@ -1282,7 +1282,7 @@
         <w:t xml:space="preserve"> </w:t>
       </w:r>
       <w:r>
-        <w:t xml:space="preserve">(wysoki sumaryczny impact, kumulatywny) oraz</w:t>
+        <w:t xml:space="preserve">(wysoki sumaryczny wpływ, kumulatywny) oraz</w:t>
       </w:r>
       <w:r>
         <w:t xml:space="preserve"> </w:t>
@@ -5367,7 +5367,7 @@
         <w:pStyle w:val="BodyText"/>
       </w:pPr>
       <w:r>
-        <w:t xml:space="preserve">W analizie porównującej uczelnie i stanowiska (analizie dwuczynnikowej) uwzględniono 420 osób z przypisanym jednym z trzech stanowisk: adiunkt, profesor uczelni lub profesor. Rozkład liczebności pokazano w</w:t>
+        <w:t xml:space="preserve">W analizie porównującej uczelnie i stanowiska (analizie dwuczynnikowej) uwzględniono 420 osób z przypisanym jednym z trzech stanowisk: adiunkt, profesor uczelni lub profesor. Rozkład liczebności pokazano w tabeli</w:t>
       </w:r>
       <w:r>
         <w:t xml:space="preserve"> </w:t>
@@ -5377,7 +5377,7 @@
           <w:rPr>
             <w:rStyle w:val="Hyperlink"/>
           </w:rPr>
-          <w:t xml:space="preserve">Tabela 1</w:t>
+          <w:t xml:space="preserve">1</w:t>
         </w:r>
       </w:hyperlink>
       <w:r>
@@ -5426,7 +5426,7 @@
         <w:t xml:space="preserve">wielkość dorobku</w:t>
       </w:r>
       <w:r>
-        <w:t xml:space="preserve">, w obrębie której najściślej powiązane są trzy metryki skumulowanego impactu: h-index WoS, sumaryczny IF i punktacja MEiN (wzajemne korelacje 0,82–0,95). Korelacja sumarycznego IF z punktacją MEiN wynosi r = 0,95; punktacja ministerialna jest niemal liniową funkcją sumarycznego IF, co potwierdza, że oba wskaźniki mierzą zbliżony konstrukt.</w:t>
+        <w:t xml:space="preserve">, w obrębie której najściślej powiązane są trzy metryki skumulowanego wpływu: h-index WoS, sumaryczny IF i punktacja MEiN (wzajemne korelacje 0,82–0,95). Korelacja sumarycznego IF z punktacją MEiN wynosi r = 0,95; punktacja ministerialna jest niemal liniową funkcją sumarycznego IF, co potwierdza, że oba wskaźniki mierzą zbliżony konstrukt.</w:t>
       </w:r>
       <w:r>
         <w:t xml:space="preserve"> </w:t>
@@ -5442,7 +5442,7 @@
         <w:t xml:space="preserve"> </w:t>
       </w:r>
       <w:r>
-        <w:t xml:space="preserve">należy do tej samej osi wielkości, lecz wiąże się z metrykami impactu jedynie umiarkowanie (r = 0,36–0,44), odzwierciedla bowiem objętość dorobku, a nie jego skumulowane oddziaływanie. Drugą, prawie niezależną osią jest jakość pojedynczej publikacji, mierzona IF na publikację. Wskaźnik ten jest słabo związany z ogólną wielkością dorobku. Jego ujemna korelacja z liczbą publikacji (r = -0,37) oznacza, że osoby publikujące najwięcej mają przeciętnie niższy IF przypadający na jedną publikację. Widać więc kompromis między liczbą publikacji a ich przeciętną jakością.</w:t>
+        <w:t xml:space="preserve">należy do tej samej osi wielkości, lecz wiąże się z metrykami wpływu jedynie umiarkowanie (r = 0,36–0,44), odzwierciedla bowiem objętość dorobku, a nie jego skumulowane oddziaływanie. Drugą, prawie niezależną osią jest jakość pojedynczej publikacji, mierzona IF na publikację. Wskaźnik ten jest słabo związany z ogólną wielkością dorobku. Jego ujemna korelacja z liczbą publikacji (r = -0,37) oznacza, że osoby publikujące najwięcej mają przeciętnie niższy IF przypadający na jedną publikację. Widać więc kompromis między liczbą publikacji a ich przeciętną jakością.</w:t>
       </w:r>
     </w:p>
     <w:tbl>
@@ -5517,7 +5517,7 @@
               <w:pStyle w:val="ImageCaption"/>
             </w:pPr>
             <w:r>
-              <w:t xml:space="preserve">Rysunek 2: Macierz korelacji Pearsona sześciu wskaźników bibliometrycznych. Wyraźny blok metryk skumulowanego impactu (h-index, sumaryczny IF, punktacja MEiN; r 0,82–0,95) kontrastuje z liczbą publikacji, powiązaną z nim tylko umiarkowanie (r 0,36–0,44), oraz z IF na publikację, tworzącym odrębną oś jakości, ujemnie skorelowaną z liczbą publikacji.</w:t>
+              <w:t xml:space="preserve">Rysunek 2: Macierz korelacji Pearsona sześciu wskaźników bibliometrycznych. Wyraźny blok metryk skumulowanego wpływu (h-index, sumaryczny IF, punktacja MEiN; r 0,82–0,95) kontrastuje z liczbą publikacji, powiązaną z nim tylko umiarkowanie (r 0,36–0,44), oraz z IF na publikację, tworzącym odrębną oś jakości, ujemnie skorelowaną z liczbą publikacji.</w:t>
             </w:r>
           </w:p>
           <w:bookmarkEnd w:id="41"/>
@@ -8149,7 +8149,21 @@
         <w:t xml:space="preserve">dwa klastry</w:t>
       </w:r>
       <w:r>
-        <w:t xml:space="preserve">.</w:t>
+        <w:t xml:space="preserve"> </w:t>
+      </w:r>
+      <w:r>
+        <w:t xml:space="preserve">(</w:t>
+      </w:r>
+      <w:hyperlink w:anchor="fig-klastry">
+        <w:r>
+          <w:rPr>
+            <w:rStyle w:val="Hyperlink"/>
+          </w:rPr>
+          <w:t xml:space="preserve">Rysunek 7</w:t>
+        </w:r>
+      </w:hyperlink>
+      <w:r>
+        <w:t xml:space="preserve">).</w:t>
       </w:r>
     </w:p>
     <w:tbl>
@@ -9429,7 +9443,7 @@
               <w:pStyle w:val="ImageCaption"/>
             </w:pPr>
             <w:r>
-              <w:t xml:space="preserve">Tabela 4: Replikacja typologii w obrębie uczelni: centroidy klastra „wysoki dorobek” (k = 2 wymuszone, z-score na skali puli) i zgodność z rozwiązaniem na puli (ARI).</w:t>
+              <w:t xml:space="preserve">Tabela 4: Porównanie klastra „wysokiego dorobku” między uczelniami (k = 2, zgodność mierzona ARI).</w:t>
             </w:r>
           </w:p>
           <w:tbl xmlns:w="http://schemas.openxmlformats.org/wordprocessingml/2006/main" xmlns:r="http://schemas.openxmlformats.org/officeDocument/2006/relationships" xmlns:w14="http://schemas.microsoft.com/office/word/2010/wordml" xmlns:wp="http://schemas.openxmlformats.org/drawingml/2006/wordprocessingDrawing" xmlns:a="http://schemas.openxmlformats.org/drawingml/2006/main" xmlns:pic="http://schemas.openxmlformats.org/drawingml/2006/picture">
@@ -11605,7 +11619,7 @@
               <w:pStyle w:val="ImageCaption"/>
             </w:pPr>
             <w:r>
-              <w:t xml:space="preserve">Tabela 5: Profile trzech klastrów w wariancie eksploracyjnym k = 3.</w:t>
+              <w:t xml:space="preserve">Tabela 5: Profile trzech klastrów (wartości średnie) w wariancie eksploracyjnym k = 3.</w:t>
             </w:r>
           </w:p>
           <w:tbl xmlns:w="http://schemas.openxmlformats.org/wordprocessingml/2006/main" xmlns:r="http://schemas.openxmlformats.org/officeDocument/2006/relationships" xmlns:w14="http://schemas.microsoft.com/office/word/2010/wordml" xmlns:wp="http://schemas.openxmlformats.org/drawingml/2006/wordprocessingDrawing" xmlns:a="http://schemas.openxmlformats.org/drawingml/2006/main" xmlns:pic="http://schemas.openxmlformats.org/drawingml/2006/picture">
@@ -12668,7 +12682,7 @@
                       <w:szCs w:val="20"/>
                       <w:color w:val="000000"/>
                     </w:rPr>
-                    <w:t xml:space="preserve">Profil jakościowy (mało prac, wysoki impact)</w:t>
+                    <w:t xml:space="preserve">Profil jakościowy (mało prac, wysoki wpływ)</w:t>
                   </w:r>
                 </w:p>
               </w:tc>
@@ -13075,7 +13089,7 @@
         <w:pStyle w:val="BodyText"/>
       </w:pPr>
       <w:r>
-        <w:t xml:space="preserve">Trzeci klaster można określić jako profil jakościowy. Obejmuje on badaczy o najmniejszym dorobku ilościowym (mediana 19,5 publikacji), ale jednocześnie o najwyższych wskaźnikach jakościowych: IF na publikację wynosi 2,68, a FWCI 2,32. Są to najwyższe wartości spośród wszystkich klastrów. W tej grupie przeważają osoby na wcześniejszym etapie kariery: 63 z 88 osób to asystenci i adiunkci.</w:t>
+        <w:t xml:space="preserve">Trzeci klaster można określić jako profil jakościowy. Obejmuje on badaczy o najmniejszym dorobku ilościowym (przeciętnie 23,8 publikacji, mediana 19,5), ale jednocześnie o najwyższych wskaźnikach jakościowych: średni IF na publikację wynosi 2,68, a FWCI 2,32. Są to najwyższe wartości spośród wszystkich klastrów. W tej grupie przeważają osoby na wcześniejszym etapie kariery: 63 z 88 osób to asystenci i adiunkci.</w:t>
       </w:r>
     </w:p>
     <w:p>
@@ -13101,7 +13115,7 @@
         <w:pStyle w:val="FirstParagraph"/>
       </w:pPr>
       <w:r>
-        <w:t xml:space="preserve">Zmienną celu było zaliczenie badacza do grupy 10 % osób o najwyższym sumarycznym IF w całej próbie. Do tej grupy należało 46 z 452 osób, czyli 10,2 % badanych. Model miał więc przewidywać, którzy badacze należą do grupy o najwyższym skumulowanym wpływie publikacyjnym.</w:t>
+        <w:t xml:space="preserve">Zmienną celu było zaliczenie badacza do grupy 10 % osób o najwyższym sumarycznym IF w całej próbie. Do tej grupy należało 46 z 452 osób z dostępną wartością sumarycznego IF (10 osób bez tej metryki pominięto), czyli 10,2 % badanych. Model miał więc przewidywać, którzy badacze należą do grupy o najwyższym skumulowanym wpływie publikacyjnym.</w:t>
       </w:r>
     </w:p>
     <w:p>
@@ -14163,7 +14177,7 @@
                       <w:szCs w:val="18"/>
                       <w:color w:val="000000"/>
                     </w:rPr>
-                    <w:t xml:space="preserve">Trafność = odsetek wszystkich poprawnych klasyfikacji; czułość = odsetek poprawnie wykrytych osób o wysokim impakcie; swoistość = odsetek poprawnie rozpoznanych osób o niższym impakcie (wszystkie przy progu 0,5).</w:t>
+                    <w:t xml:space="preserve">Trafność = odsetek wszystkich poprawnych klasyfikacji; czułość = odsetek poprawnie wykrytych osób o wysokim wpływie; swoistość = odsetek poprawnie rozpoznanych osób o niższym wpływie (wszystkie przy progu 0,5).</w:t>
                   </w:r>
                 </w:p>
               </w:tc>
@@ -14178,7 +14192,7 @@
         <w:pStyle w:val="BodyText"/>
       </w:pPr>
       <w:r>
-        <w:t xml:space="preserve">Oba modele dobrze rozróżniają osoby o wysokim i niższym wpływie naukowym, o czym świadczy wysoka wartość AUC (ok. 0,93–0,97). Problem pojawia się jednak przy domyślnym progu klasyfikacji 0,5. Ponieważ grupa high-impact jest mała i obejmuje tylko 10 % badanych, modele rzadko przypisują osoby do tej klasy. W efekcie czułość jest niska (0,20–0,30), czyli modele wykrywają tylko część osób o wysokim wpływie.</w:t>
+        <w:t xml:space="preserve">Oba modele dobrze rozróżniają osoby o wysokim i niższym wpływie naukowym, o czym świadczy wysoka wartość AUC (ok. 0,93–0,97). Problem pojawia się jednak przy domyślnym progu klasyfikacji 0,5. Ponieważ grupa wysokiego wpływu jest mała i obejmuje tylko 10 % badanych, modele rzadko przypisują osoby do tej klasy. W efekcie czułość jest niska (0,20–0,30), czyli modele wykrywają tylko część osób o wysokim wpływie.</w:t>
       </w:r>
     </w:p>
     <w:p>
@@ -14186,7 +14200,7 @@
         <w:pStyle w:val="BodyText"/>
       </w:pPr>
       <w:r>
-        <w:t xml:space="preserve">Oznacza to, że modele dobrze porządkują badaczy według prawdopodobieństwa wysokiego impactu, ale przy progu 0,5 są zbyt ostrożne w przypisywaniu ich do klasy high-impact. Dlatego sama trafność na poziomie ok. 0,90 może być myląca: podobny wynik można uzyskać, klasyfikując prawie wszystkich badaczy jako osoby spoza grupy wysokiego impactu.</w:t>
+        <w:t xml:space="preserve">Oznacza to, że modele dobrze porządkują badaczy według prawdopodobieństwa wysokiego wpływu, ale przy progu 0,5 są zbyt ostrożne w przypisywaniu ich do klasy wysokiego wpływu. Dlatego sama trafność na poziomie ok. 0,90 może być myląca: podobny wynik można uzyskać, klasyfikując prawie wszystkich badaczy jako osoby spoza grupy wysokiego wpływu.</w:t>
       </w:r>
     </w:p>
     <w:p>
@@ -14222,7 +14236,7 @@
         <w:pStyle w:val="BodyText"/>
       </w:pPr>
       <w:r>
-        <w:t xml:space="preserve">Próg wyznaczono na podstawie predykcji z walidacji krzyżowej, a nie na zbiorze testowym. Dzięki temu zbiór testowy pozostał niezależny. Otrzymany próg wyniósł 0,054, czyli był znacznie niższy niż 0,5. Jest to uzasadnione, ponieważ klasa high-impact obejmuje tylko około 10 % badanych.</w:t>
+        <w:t xml:space="preserve">Próg wyznaczono na podstawie predykcji z walidacji krzyżowej, a nie na zbiorze testowym. Dzięki temu zbiór testowy pozostał niezależny. Otrzymany próg wyniósł 0,054, czyli był znacznie niższy niż 0,5. Jest to uzasadnione, ponieważ klasa wysokiego wpływu obejmuje tylko około 10 % badanych.</w:t>
       </w:r>
     </w:p>
     <w:p>
@@ -14230,7 +14244,7 @@
         <w:pStyle w:val="BodyText"/>
       </w:pPr>
       <w:r>
-        <w:t xml:space="preserve">Po zastosowaniu tego progu na zbiorze testowym model Random Forest poprawnie wykrył wszystkie osoby z grupy wysokiego impactu (czułość = 1,00), przy swoistości 0,74. Oznacza to, że model nie pominął żadnej osoby rzeczywiście należącej do tej grupy, ale jednocześnie zaklasyfikował jako high-impact 21 osób, które faktycznie do niej nie należały (</w:t>
+        <w:t xml:space="preserve">Po zastosowaniu tego progu na zbiorze testowym model Random Forest poprawnie wykrył wszystkie osoby z grupy wysokiego wpływu (czułość = 1,00), przy swoistości 0,74. Oznacza to, że model nie pominął żadnej osoby rzeczywiście należącej do tej grupy, ale jednocześnie zaklasyfikował do klasy wysokiego wpływu 21 osób, które faktycznie do niej nie należały (</w:t>
       </w:r>
       <w:hyperlink w:anchor="tbl-prog">
         <w:r>
@@ -15267,7 +15281,7 @@
         </w:r>
       </w:hyperlink>
       <w:r>
-        <w:t xml:space="preserve">) pokazały, że największe znaczenie dla przewidywania wysokiego wpływu naukowego miała liczba publikacji. Oznacza to, że osoby z większym dorobkiem publikacyjnym częściej należały do grupy wysokiego impactu. W dalszej kolejności znaczenie miały cechy związane ze współpracą naukową, zwłaszcza liczba unikalnych współautorów, średnia liczba autorów jednej publikacji oraz średni FWCI.</w:t>
+        <w:t xml:space="preserve">) pokazały, że największe znaczenie dla przewidywania wysokiego wpływu naukowego miała liczba publikacji. Oznacza to, że osoby z większym dorobkiem publikacyjnym częściej należały do grupy wysokiego wpływu. W dalszej kolejności znaczenie miały cechy związane ze współpracą naukową, zwłaszcza liczba unikalnych współautorów, średnia liczba autorów jednej publikacji oraz średni FWCI.</w:t>
       </w:r>
     </w:p>
     <w:p>
@@ -15275,7 +15289,7 @@
         <w:pStyle w:val="BodyText"/>
       </w:pPr>
       <w:r>
-        <w:t xml:space="preserve">Stanowisko i uczelnia miały znacznie mniejsze znaczenie dla predykcji. Wynik ten wskazuje, że model przewidywał wysoki impact głównie na podstawie produktywności badacza i jego powiązań współautorskich, a nie na podstawie formalnej pozycji akademickiej czy afiliacji uczelnianej.</w:t>
+        <w:t xml:space="preserve">Stanowisko i uczelnia miały znacznie mniejsze znaczenie dla predykcji. Wynik ten wskazuje, że model przewidywał wysoki wpływ głównie na podstawie produktywności badacza i jego powiązań współautorskich, a nie na podstawie formalnej pozycji akademickiej czy afiliacji uczelnianej.</w:t>
       </w:r>
     </w:p>
     <w:tbl>
@@ -16538,7 +16552,7 @@
         <w:pStyle w:val="BodyText"/>
       </w:pPr>
       <w:r>
-        <w:t xml:space="preserve">Wynik ten sugeruje, że wysoki skumulowany wpływ publikacyjny wiąże się przede wszystkim z produktywnością oraz udziałem w sieci współpracy, a nie bezpośrednio z formalną pozycją akademicką czy afiliacją. Niska czułość modelu przy domyślnym progu klasyfikacji 0,5 wynikała głównie z niedopasowania progu do rzadkiej klasy high-impact, a nie ze słabej jakości modelu. Po obniżeniu progu na podstawie danych walidacyjnych model poprawnie identyfikował wszystkie osoby z grupy wysokiego wpływu publikacyjnego (czułość = 1,00), przy zbalansowanej trafności 0,87.</w:t>
+        <w:t xml:space="preserve">Wynik ten sugeruje, że wysoki skumulowany wpływ publikacyjny wiąże się przede wszystkim z produktywnością oraz udziałem w sieci współpracy, a nie bezpośrednio z formalną pozycją akademicką czy afiliacją. Niska czułość modelu przy domyślnym progu klasyfikacji 0,5 wynikała głównie z niedopasowania progu do rzadkiej klasy wysokiego wpływu, a nie ze słabej jakości modelu. Po obniżeniu progu na podstawie danych walidacyjnych model poprawnie identyfikował wszystkie osoby z grupy wysokiego wpływu publikacyjnego (czułość = 1,00), przy zbalansowanej trafności 0,87.</w:t>
       </w:r>
     </w:p>
     <w:p>
@@ -16875,6 +16889,18 @@
       </w:pPr>
       <w:r>
         <w:t xml:space="preserve">Model ilościowy miał małą klasę pozytywną. W modelu przewidującym wysoki wpływ publikacyjny grupa pozytywna liczyła 46 osób. Mimo zastosowania walidacji krzyżowej i kalibracji progu wyniki tego modelu należy traktować jako orientacyjne.</w:t>
+      </w:r>
+    </w:p>
+    <w:p>
+      <w:pPr>
+        <w:pStyle w:val="Compact"/>
+        <w:numPr>
+          <w:ilvl w:val="0"/>
+          <w:numId w:val="1003"/>
+        </w:numPr>
+      </w:pPr>
+      <w:r>
+        <w:t xml:space="preserve">Próg klasy w modelu ilościowym wyznaczono na pełnej próbie. Granicę górnego decyla sumarycznego IF policzono na całym zbiorze przed podziałem na część uczącą i testową, co może nieznacznie optymistycznie obciążać ocenę tego modelu. Model jakościowy jest wolny od tego problemu, ponieważ próg FWCI = 1 jest stałą zewnętrzną (średnia światowa w dziedzinie), niezależną od rozkładu wartości w próbie.</w:t>
       </w:r>
     </w:p>
     <w:p>

</xml_diff>

<commit_message>
Auto sync z dom - 2026-06-20 23:45
</commit_message>
<xml_diff>
--- a/Praca_dyplomowa/praca_dyplomowa.docx
+++ b/Praca_dyplomowa/praca_dyplomowa.docx
@@ -39,7 +39,7 @@
         <w:br w:type="page"/>
       </w:r>
     </w:p>
-    <w:bookmarkStart w:id="20" w:name="streszczenie"/>
+    <w:bookmarkStart w:id="9" w:name="streszczenie"/>
     <w:p>
       <w:pPr>
         <w:pStyle w:val="Heading1"/>
@@ -121,8 +121,8 @@
         <w:br w:type="page"/>
       </w:r>
     </w:p>
-    <w:bookmarkEnd w:id="20"/>
-    <w:bookmarkStart w:id="24" w:name="wprowadzenie"/>
+    <w:bookmarkEnd w:id="9"/>
+    <w:bookmarkStart w:id="13" w:name="wprowadzenie"/>
     <w:p>
       <w:pPr>
         <w:pStyle w:val="Heading1"/>
@@ -131,7 +131,7 @@
         <w:t xml:space="preserve">Wprowadzenie</w:t>
       </w:r>
     </w:p>
-    <w:bookmarkStart w:id="21" w:name="Xbef39e353cf405a5f8b815f593e50b94b49cae3"/>
+    <w:bookmarkStart w:id="10" w:name="Xbef39e353cf405a5f8b815f593e50b94b49cae3"/>
     <w:p>
       <w:pPr>
         <w:pStyle w:val="Heading2"/>
@@ -349,7 +349,7 @@
           <w:rPr>
             <w:rStyle w:val="Hyperlink"/>
           </w:rPr>
-          <w:t xml:space="preserve">Grygiel, Rębisz, i Humenny 2009</w:t>
+          <w:t xml:space="preserve">Grygiel et al. 2009</w:t>
         </w:r>
       </w:hyperlink>
       <w:r>
@@ -384,8 +384,8 @@
         <w:br w:type="page"/>
       </w:r>
     </w:p>
-    <w:bookmarkEnd w:id="21"/>
-    <w:bookmarkStart w:id="22" w:name="cel-pracy"/>
+    <w:bookmarkEnd w:id="10"/>
+    <w:bookmarkStart w:id="11" w:name="cel-pracy"/>
     <w:p>
       <w:pPr>
         <w:pStyle w:val="Heading2"/>
@@ -430,7 +430,7 @@
           <w:rPr>
             <w:rStyle w:val="Hyperlink"/>
           </w:rPr>
-          <w:t xml:space="preserve">Koperwas i in. 2015</w:t>
+          <w:t xml:space="preserve">Koperwas et al. 2015</w:t>
         </w:r>
       </w:hyperlink>
       <w:r>
@@ -450,7 +450,7 @@
           <w:rPr>
             <w:rStyle w:val="Hyperlink"/>
           </w:rPr>
-          <w:t xml:space="preserve">Rybiński i in. 2018</w:t>
+          <w:t xml:space="preserve">Rybiński et al. 2018</w:t>
         </w:r>
       </w:hyperlink>
       <w:r>
@@ -549,8 +549,8 @@
         <w:br w:type="page"/>
       </w:r>
     </w:p>
-    <w:bookmarkEnd w:id="22"/>
-    <w:bookmarkStart w:id="23" w:name="pytania-badawcze"/>
+    <w:bookmarkEnd w:id="11"/>
+    <w:bookmarkStart w:id="12" w:name="pytania-badawcze"/>
     <w:p>
       <w:pPr>
         <w:pStyle w:val="Heading2"/>
@@ -631,9 +631,9 @@
         <w:t xml:space="preserve">Czy sieć współautorstwa ma charakter głównie wewnątrzuczelniany, czy widoczne są także wspólnoty międzyuczelniane?</w:t>
       </w:r>
     </w:p>
-    <w:bookmarkEnd w:id="23"/>
-    <w:bookmarkEnd w:id="24"/>
-    <w:bookmarkStart w:id="35" w:name="materiał-i-metodyka"/>
+    <w:bookmarkEnd w:id="12"/>
+    <w:bookmarkEnd w:id="13"/>
+    <w:bookmarkStart w:id="24" w:name="materiał-i-metodyka"/>
     <w:p>
       <w:pPr>
         <w:pStyle w:val="Heading1"/>
@@ -642,7 +642,7 @@
         <w:t xml:space="preserve">Materiał i metodyka</w:t>
       </w:r>
     </w:p>
-    <w:bookmarkStart w:id="25" w:name="źródła-danych"/>
+    <w:bookmarkStart w:id="14" w:name="źródła-danych"/>
     <w:p>
       <w:pPr>
         <w:pStyle w:val="Heading2"/>
@@ -771,7 +771,7 @@
           <w:rPr>
             <w:rStyle w:val="Hyperlink"/>
           </w:rPr>
-          <w:t xml:space="preserve">Priem, Piwowar, i Orr 2022</w:t>
+          <w:t xml:space="preserve">Priem et al. 2022</w:t>
         </w:r>
       </w:hyperlink>
       <w:r>
@@ -827,7 +827,19 @@
           <w:rPr>
             <w:rStyle w:val="Hyperlink"/>
           </w:rPr>
-          <w:t xml:space="preserve">Hicks i in. 2015</w:t>
+          <w:t xml:space="preserve">Hicks et al.</w:t>
+        </w:r>
+        <w:r>
+          <w:rPr>
+            <w:rStyle w:val="Hyperlink"/>
+          </w:rPr>
+          <w:t xml:space="preserve"> </w:t>
+        </w:r>
+        <w:r>
+          <w:rPr>
+            <w:rStyle w:val="Hyperlink"/>
+          </w:rPr>
+          <w:t xml:space="preserve">2015</w:t>
         </w:r>
       </w:hyperlink>
       <w:r>
@@ -865,8 +877,8 @@
         <w:t xml:space="preserve">Wskaźniki wykorzystane w tej pracy wybrano dlatego, że są dostępne w porównywalnej formie dla badanych uczelni i pozwalają opisać profil bibliometryczny naukowca.</w:t>
       </w:r>
     </w:p>
-    <w:bookmarkEnd w:id="25"/>
-    <w:bookmarkStart w:id="30" w:name="procedura-pozyskania-danych"/>
+    <w:bookmarkEnd w:id="14"/>
+    <w:bookmarkStart w:id="19" w:name="procedura-pozyskania-danych"/>
     <w:p>
       <w:pPr>
         <w:pStyle w:val="Heading2"/>
@@ -952,7 +964,7 @@
           <w:rPr>
             <w:rStyle w:val="Hyperlink"/>
           </w:rPr>
-          <w:t xml:space="preserve">Aria i in. 2024</w:t>
+          <w:t xml:space="preserve">Aria et al. 2024</w:t>
         </w:r>
       </w:hyperlink>
       <w:r>
@@ -982,17 +994,17 @@
     <w:tbl>
       <w:tblPr>
         <w:tblStyle w:val="Table"/>
-        <w:tblW w:type="pct" w:w="5000"/>
-        <w:tblLayout w:type="fixed"/>
+        <w:tblW w:type="dxa" w:w="9638"/>
+        <w:tblLayout w:type="autofit"/>
         <w:tblLook w:firstRow="0" w:lastRow="0" w:firstColumn="0" w:lastColumn="0" w:noHBand="0" w:noVBand="0" w:val="0000"/>
       </w:tblPr>
       <w:tblGrid>
-        <w:gridCol w:w="7920"/>
+        <w:gridCol w:w="9638"/>
       </w:tblGrid>
       <w:tr>
         <w:tc>
           <w:tcPr/>
-          <w:bookmarkStart w:id="29" w:name="fig-pipeline"/>
+          <w:bookmarkStart w:id="18" w:name="fig-pipeline"/>
           <w:p>
             <w:pPr>
               <w:pStyle w:val="Compact"/>
@@ -1003,18 +1015,18 @@
                 <wp:inline>
                   <wp:extent cx="4480560" cy="7101092"/>
                   <wp:effectExtent b="0" l="0" r="0" t="0"/>
-                  <wp:docPr descr="" title="" id="27" name="Picture"/>
+                  <wp:docPr descr="" title="" id="16" name="Picture"/>
                   <a:graphic>
                     <a:graphicData uri="http://schemas.openxmlformats.org/drawingml/2006/picture">
                       <pic:pic>
                         <pic:nvPicPr>
-                          <pic:cNvPr descr="../Wykresy/praca/fig_00_pipeline.png" id="28" name="Picture"/>
+                          <pic:cNvPr descr="../Wykresy/praca/fig_00_pipeline.png" id="17" name="Picture"/>
                           <pic:cNvPicPr>
                             <a:picLocks noChangeArrowheads="1" noChangeAspect="1"/>
                           </pic:cNvPicPr>
                         </pic:nvPicPr>
                         <pic:blipFill>
-                          <a:blip r:embed="rId26"/>
+                          <a:blip r:embed="rId15"/>
                           <a:stretch>
                             <a:fillRect/>
                           </a:stretch>
@@ -1046,7 +1058,7 @@
               <w:jc w:val="center"/>
             </w:pPr>
             <w:pPr>
-              <w:jc w:val="start"/>
+              <w:jc w:val="left"/>
               <w:spacing w:before="200"/>
               <w:pStyle w:val="ImageCaption"/>
             </w:pPr>
@@ -1054,12 +1066,12 @@
               <w:t xml:space="preserve">Rysunek 1: Schemat przepływu danych: od czterech instancji Omega-PSIR przez scraping (Python) i przetwarzanie (R) z uzupełnieniem OpenAlex do zbioru analitycznego i warstw modelowania.</w:t>
             </w:r>
           </w:p>
-          <w:bookmarkEnd w:id="29"/>
+          <w:bookmarkEnd w:id="18"/>
         </w:tc>
       </w:tr>
     </w:tbl>
-    <w:bookmarkEnd w:id="30"/>
-    <w:bookmarkStart w:id="31" w:name="metody-analityczne"/>
+    <w:bookmarkEnd w:id="19"/>
+    <w:bookmarkStart w:id="20" w:name="metody-analityczne"/>
     <w:p>
       <w:pPr>
         <w:pStyle w:val="Heading2"/>
@@ -1369,7 +1381,7 @@
           <w:rPr>
             <w:rStyle w:val="Hyperlink"/>
           </w:rPr>
-          <w:t xml:space="preserve">Blondel i in. 2008</w:t>
+          <w:t xml:space="preserve">Blondel et al. 2008</w:t>
         </w:r>
       </w:hyperlink>
       <w:r>
@@ -1402,8 +1414,8 @@
         <w:t xml:space="preserve">wykorzystano do oceny, jak wyraźnie sieć dzieli się na wspólnoty. Dzięki temu można było sprawdzić, czy współpraca przebiega głównie w obrębie jednej uczelni, czy także między uczelniami.</w:t>
       </w:r>
     </w:p>
-    <w:bookmarkEnd w:id="31"/>
-    <w:bookmarkStart w:id="32" w:name="narzędzia-i-środowisko-obliczeniowe"/>
+    <w:bookmarkEnd w:id="20"/>
+    <w:bookmarkStart w:id="21" w:name="narzędzia-i-środowisko-obliczeniowe"/>
     <w:p>
       <w:pPr>
         <w:pStyle w:val="Heading2"/>
@@ -1428,8 +1440,8 @@
         <w:t xml:space="preserve">W pracy pomocniczo wykorzystano duże modele językowe (LLM): Claude (Anthropic), Codex (OpenAI) oraz Gemini (Google). Posłużyły one jako narzędzia wsparcia technicznego i redakcyjnego: do przeglądu i porządkowania kodu, wykrywania niespójności w tekście i danych, redakcyjnego dopracowania języka oraz krytycznej rewizji fragmentów pracy. Modele nie były źródłem danych empirycznych ani nie prowadziły samodzielnego wnioskowania statystycznego; wszystkie obliczenia, decyzje metodyczne i interpretacje wyników pozostają autorskie i wykonano je opisanymi skryptami Python i R. Informacja odnosi się do stanu z okresu przygotowania pracy (2026); wykorzystano model Claude Opus 4.8 (środowisko Claude Code), Codex oparty na modelu GPT-5.5 (OpenAI) oraz model Gemini 3.5 Flash (Gemini CLI, Google).</w:t>
       </w:r>
     </w:p>
-    <w:bookmarkEnd w:id="32"/>
-    <w:bookmarkStart w:id="34" w:name="dostępność-kodu-i-danych"/>
+    <w:bookmarkEnd w:id="21"/>
+    <w:bookmarkStart w:id="23" w:name="dostępność-kodu-i-danych"/>
     <w:p>
       <w:pPr>
         <w:pStyle w:val="Heading2"/>
@@ -1448,7 +1460,7 @@
       <w:r>
         <w:t xml:space="preserve"> </w:t>
       </w:r>
-      <w:hyperlink r:id="rId33">
+      <w:hyperlink r:id="rId22">
         <w:r>
           <w:rPr>
             <w:rStyle w:val="Hyperlink"/>
@@ -1468,9 +1480,9 @@
         <w:t xml:space="preserve">Wykorzystane dane pochodzą z publicznie dostępnych uczelnianych Baz Wiedzy (systemów CRIS Omega-PSIR) oraz z otwartej bazy OpenAlex i dotyczą wyłącznie działalności naukowej pracowników (dorobek publikacyjny, afiliacje, identyfikatory ORCID), czyli danych zawodowych jawnie udostępnionych przez same uczelnie. Nie obejmują one danych szczególnych kategorii w rozumieniu art. 9 RODO. Przetwarzania dokonano wyłącznie w celach naukowo-badawczych i w formie zagregowanej, w oparciu o prawnie uzasadniony interes administratora (art. 6 ust. 1 lit. f RODO) oraz z uwzględnieniem zasad przetwarzania danych do celów badań naukowych (art. 89 RODO); analiza nie służy ocenie ani profilowaniu poszczególnych osób.</w:t>
       </w:r>
     </w:p>
-    <w:bookmarkEnd w:id="34"/>
-    <w:bookmarkEnd w:id="35"/>
-    <w:bookmarkStart w:id="91" w:name="wyniki"/>
+    <w:bookmarkEnd w:id="23"/>
+    <w:bookmarkEnd w:id="24"/>
+    <w:bookmarkStart w:id="80" w:name="wyniki"/>
     <w:p>
       <w:pPr>
         <w:pStyle w:val="Heading1"/>
@@ -1479,7 +1491,7 @@
         <w:t xml:space="preserve">Wyniki</w:t>
       </w:r>
     </w:p>
-    <w:bookmarkStart w:id="37" w:name="charakterystyka-próby"/>
+    <w:bookmarkStart w:id="26" w:name="charakterystyka-próby"/>
     <w:p>
       <w:pPr>
         <w:pStyle w:val="Heading2"/>
@@ -1591,23 +1603,23 @@
     <w:tbl>
       <w:tblPr>
         <w:tblStyle w:val="Table"/>
-        <w:tblW w:type="pct" w:w="5000"/>
-        <w:tblLayout w:type="fixed"/>
+        <w:tblW w:type="dxa" w:w="9638"/>
+        <w:tblLayout w:type="autofit"/>
         <w:tblLook w:firstRow="0" w:lastRow="0" w:firstColumn="0" w:lastColumn="0" w:noHBand="0" w:noVBand="0" w:val="0000"/>
       </w:tblPr>
       <w:tblGrid>
-        <w:gridCol w:w="7920"/>
+        <w:gridCol w:w="9638"/>
       </w:tblGrid>
       <w:tr>
         <w:tc>
           <w:tcPr/>
-          <w:bookmarkStart w:id="36" w:name="tbl-proba"/>
+          <w:bookmarkStart w:id="25" w:name="tbl-proba"/>
           <w:p>
             <w:pPr>
               <w:jc w:val="center"/>
             </w:pPr>
             <w:pPr>
-              <w:jc w:val="start"/>
+              <w:jc w:val="left"/>
               <w:spacing w:before="200"/>
               <w:pStyle w:val="ImageCaption"/>
             </w:pPr>
@@ -1617,29 +1629,28 @@
           </w:p>
           <w:tbl xmlns:w="http://schemas.openxmlformats.org/wordprocessingml/2006/main" xmlns:r="http://schemas.openxmlformats.org/officeDocument/2006/relationships" xmlns:w14="http://schemas.microsoft.com/office/word/2010/wordml" xmlns:wp="http://schemas.openxmlformats.org/drawingml/2006/wordprocessingDrawing" xmlns:a="http://schemas.openxmlformats.org/drawingml/2006/main" xmlns:pic="http://schemas.openxmlformats.org/drawingml/2006/picture">
             <w:tblPr>
-              <w:tblLayout w:type="fixed"/>
+              <w:tblLayout w:type="autofit"/>
               <w:jc w:val="center"/>
               <w:tblLook w:firstRow="1" w:lastRow="0" w:firstColumn="0" w:lastColumn="0" w:noHBand="0" w:noVBand="1"/>
             </w:tblPr>
             <w:tblGrid>
-              <w:gridCol w:w="893"/>
-              <w:gridCol w:w="605"/>
-              <w:gridCol w:w="475"/>
-              <w:gridCol w:w="835"/>
-              <w:gridCol w:w="835"/>
-              <w:gridCol w:w="835"/>
-              <w:gridCol w:w="835"/>
-              <w:gridCol w:w="1094"/>
-              <w:gridCol w:w="922"/>
-              <w:gridCol w:w="749"/>
-              <w:gridCol w:w="835"/>
+              <w:gridCol w:w="966"/>
+              <w:gridCol w:w="654"/>
+              <w:gridCol w:w="514"/>
+              <w:gridCol w:w="903"/>
+              <w:gridCol w:w="903"/>
+              <w:gridCol w:w="903"/>
+              <w:gridCol w:w="903"/>
+              <w:gridCol w:w="1183"/>
+              <w:gridCol w:w="997"/>
+              <w:gridCol w:w="810"/>
+              <w:gridCol w:w="902"/>
             </w:tblGrid>
             <w:tr>
               <w:trPr>
                 <w:trHeight w:val="360" w:hRule="auto"/>
                 <w:tblHeader/>
               </w:trPr>
-              header1
               <w:tc>
                 <w:tcPr>
                   <w:tcBorders>
@@ -2239,7 +2250,6 @@
               <w:trPr>
                 <w:trHeight w:val="360" w:hRule="auto"/>
               </w:trPr>
-              body1
               <w:tc>
                 <w:tcPr>
                   <w:tcBorders>
@@ -2839,7 +2849,6 @@
               <w:trPr>
                 <w:trHeight w:val="360" w:hRule="auto"/>
               </w:trPr>
-              body2
               <w:tc>
                 <w:tcPr>
                   <w:tcBorders>
@@ -3439,7 +3448,6 @@
               <w:trPr>
                 <w:trHeight w:val="360" w:hRule="auto"/>
               </w:trPr>
-              body3
               <w:tc>
                 <w:tcPr>
                   <w:tcBorders>
@@ -4039,7 +4047,6 @@
               <w:trPr>
                 <w:trHeight w:val="360" w:hRule="auto"/>
               </w:trPr>
-              body4
               <w:tc>
                 <w:tcPr>
                   <w:tcBorders>
@@ -4639,7 +4646,6 @@
               <w:trPr>
                 <w:trHeight w:val="360" w:hRule="auto"/>
               </w:trPr>
-              body5
               <w:tc>
                 <w:tcPr>
                   <w:tcBorders>
@@ -5239,7 +5245,6 @@
               <w:trPr>
                 <w:trHeight w:val="360" w:hRule="auto"/>
               </w:trPr>
-              footer1
               <w:tc>
                 <w:tcPr>
                   <w:gridSpan w:val="11"/>
@@ -5300,7 +5305,6 @@
               <w:trPr>
                 <w:trHeight w:val="360" w:hRule="auto"/>
               </w:trPr>
-              footer2
               <w:tc>
                 <w:tcPr>
                   <w:gridSpan w:val="11"/>
@@ -5358,7 +5362,7 @@
               </w:tc>
             </w:tr>
           </w:tbl>
-          <w:bookmarkEnd w:id="36"/>
+          <w:bookmarkEnd w:id="25"/>
         </w:tc>
       </w:tr>
     </w:tbl>
@@ -5384,8 +5388,8 @@
         <w:t xml:space="preserve">. Najmniejsza grupa liczyła 13 osób, więc możliwe było porównanie stanowisk między uczelniami.</w:t>
       </w:r>
     </w:p>
-    <w:bookmarkEnd w:id="37"/>
-    <w:bookmarkStart w:id="42" w:name="X02db023cedd07580e5dfe409dd487ced35067e3"/>
+    <w:bookmarkEnd w:id="26"/>
+    <w:bookmarkStart w:id="31" w:name="X02db023cedd07580e5dfe409dd487ced35067e3"/>
     <w:p>
       <w:pPr>
         <w:pStyle w:val="Heading2"/>
@@ -5448,17 +5452,17 @@
     <w:tbl>
       <w:tblPr>
         <w:tblStyle w:val="Table"/>
-        <w:tblW w:type="pct" w:w="5000"/>
-        <w:tblLayout w:type="fixed"/>
+        <w:tblW w:type="dxa" w:w="9638"/>
+        <w:tblLayout w:type="autofit"/>
         <w:tblLook w:firstRow="0" w:lastRow="0" w:firstColumn="0" w:lastColumn="0" w:noHBand="0" w:noVBand="0" w:val="0000"/>
       </w:tblPr>
       <w:tblGrid>
-        <w:gridCol w:w="7920"/>
+        <w:gridCol w:w="9638"/>
       </w:tblGrid>
       <w:tr>
         <w:tc>
           <w:tcPr/>
-          <w:bookmarkStart w:id="41" w:name="fig-korelacje"/>
+          <w:bookmarkStart w:id="30" w:name="fig-korelacje"/>
           <w:p>
             <w:pPr>
               <w:pStyle w:val="Compact"/>
@@ -5469,18 +5473,18 @@
                 <wp:inline>
                   <wp:extent cx="5334000" cy="4533900"/>
                   <wp:effectExtent b="0" l="0" r="0" t="0"/>
-                  <wp:docPr descr="" title="" id="39" name="Picture"/>
+                  <wp:docPr descr="" title="" id="28" name="Picture"/>
                   <a:graphic>
                     <a:graphicData uri="http://schemas.openxmlformats.org/drawingml/2006/picture">
                       <pic:pic>
                         <pic:nvPicPr>
-                          <pic:cNvPr descr="../Wykresy/praca/fig_01b_korelacje.png" id="40" name="Picture"/>
+                          <pic:cNvPr descr="../Wykresy/praca/fig_01b_korelacje.png" id="29" name="Picture"/>
                           <pic:cNvPicPr>
                             <a:picLocks noChangeArrowheads="1" noChangeAspect="1"/>
                           </pic:cNvPicPr>
                         </pic:nvPicPr>
                         <pic:blipFill>
-                          <a:blip r:embed="rId38"/>
+                          <a:blip r:embed="rId27"/>
                           <a:stretch>
                             <a:fillRect/>
                           </a:stretch>
@@ -5512,7 +5516,7 @@
               <w:jc w:val="center"/>
             </w:pPr>
             <w:pPr>
-              <w:jc w:val="start"/>
+              <w:jc w:val="left"/>
               <w:spacing w:before="200"/>
               <w:pStyle w:val="ImageCaption"/>
             </w:pPr>
@@ -5520,12 +5524,12 @@
               <w:t xml:space="preserve">Rysunek 2: Macierz korelacji Pearsona sześciu wskaźników bibliometrycznych. Wyraźny blok metryk skumulowanego wpływu (h-index, sumaryczny IF, punktacja MEiN; r 0,82–0,95) kontrastuje z liczbą publikacji, powiązaną z nim tylko umiarkowanie (r 0,36–0,44), oraz z IF na publikację, tworzącym odrębną oś jakości, ujemnie skorelowaną z liczbą publikacji.</w:t>
             </w:r>
           </w:p>
-          <w:bookmarkEnd w:id="41"/>
+          <w:bookmarkEnd w:id="30"/>
         </w:tc>
       </w:tr>
     </w:tbl>
-    <w:bookmarkEnd w:id="42"/>
-    <w:bookmarkStart w:id="60" w:name="X149f1659b4627f11ad84fb72c3cc10571fd0864"/>
+    <w:bookmarkEnd w:id="31"/>
+    <w:bookmarkStart w:id="49" w:name="X149f1659b4627f11ad84fb72c3cc10571fd0864"/>
     <w:p>
       <w:pPr>
         <w:pStyle w:val="Heading2"/>
@@ -5567,17 +5571,17 @@
     <w:tbl>
       <w:tblPr>
         <w:tblStyle w:val="Table"/>
-        <w:tblW w:type="pct" w:w="5000"/>
-        <w:tblLayout w:type="fixed"/>
+        <w:tblW w:type="dxa" w:w="9638"/>
+        <w:tblLayout w:type="autofit"/>
         <w:tblLook w:firstRow="0" w:lastRow="0" w:firstColumn="0" w:lastColumn="0" w:noHBand="0" w:noVBand="0" w:val="0000"/>
       </w:tblPr>
       <w:tblGrid>
-        <w:gridCol w:w="7920"/>
+        <w:gridCol w:w="9638"/>
       </w:tblGrid>
       <w:tr>
         <w:tc>
           <w:tcPr/>
-          <w:bookmarkStart w:id="46" w:name="fig-rozklady"/>
+          <w:bookmarkStart w:id="35" w:name="fig-rozklady"/>
           <w:p>
             <w:pPr>
               <w:pStyle w:val="Compact"/>
@@ -5588,18 +5592,18 @@
                 <wp:inline>
                   <wp:extent cx="5334000" cy="3081866"/>
                   <wp:effectExtent b="0" l="0" r="0" t="0"/>
-                  <wp:docPr descr="" title="" id="44" name="Picture"/>
+                  <wp:docPr descr="" title="" id="33" name="Picture"/>
                   <a:graphic>
                     <a:graphicData uri="http://schemas.openxmlformats.org/drawingml/2006/picture">
                       <pic:pic>
                         <pic:nvPicPr>
-                          <pic:cNvPr descr="../Wykresy/praca/fig_01c_rozklady.png" id="45" name="Picture"/>
+                          <pic:cNvPr descr="../Wykresy/praca/fig_01c_rozklady.png" id="34" name="Picture"/>
                           <pic:cNvPicPr>
                             <a:picLocks noChangeArrowheads="1" noChangeAspect="1"/>
                           </pic:cNvPicPr>
                         </pic:nvPicPr>
                         <pic:blipFill>
-                          <a:blip r:embed="rId43"/>
+                          <a:blip r:embed="rId32"/>
                           <a:stretch>
                             <a:fillRect/>
                           </a:stretch>
@@ -5631,7 +5635,7 @@
               <w:jc w:val="center"/>
             </w:pPr>
             <w:pPr>
-              <w:jc w:val="start"/>
+              <w:jc w:val="left"/>
               <w:spacing w:before="200"/>
               <w:pStyle w:val="ImageCaption"/>
             </w:pPr>
@@ -5639,7 +5643,7 @@
               <w:t xml:space="preserve">Rysunek 3: Rozkłady (gęstości jądrowe) sześciu wskaźników bibliometrycznych w całej próbie. Przewaga długich prawych ogonów i położenie mediany (czerwona linia przerywana) poniżej średniej potwierdzają silną prawoskośność, uzasadniającą wybór testów nieparametrycznych.</w:t>
             </w:r>
           </w:p>
-          <w:bookmarkEnd w:id="46"/>
+          <w:bookmarkEnd w:id="35"/>
         </w:tc>
       </w:tr>
     </w:tbl>
@@ -5725,17 +5729,17 @@
     <w:tbl>
       <w:tblPr>
         <w:tblStyle w:val="Table"/>
-        <w:tblW w:type="pct" w:w="5000"/>
-        <w:tblLayout w:type="fixed"/>
+        <w:tblW w:type="dxa" w:w="9638"/>
+        <w:tblLayout w:type="autofit"/>
         <w:tblLook w:firstRow="0" w:lastRow="0" w:firstColumn="0" w:lastColumn="0" w:noHBand="0" w:noVBand="0" w:val="0000"/>
       </w:tblPr>
       <w:tblGrid>
-        <w:gridCol w:w="7920"/>
+        <w:gridCol w:w="9638"/>
       </w:tblGrid>
       <w:tr>
         <w:tc>
           <w:tcPr/>
-          <w:bookmarkStart w:id="50" w:name="fig-hindex"/>
+          <w:bookmarkStart w:id="39" w:name="fig-hindex"/>
           <w:p>
             <w:pPr>
               <w:pStyle w:val="Compact"/>
@@ -5746,18 +5750,18 @@
                 <wp:inline>
                   <wp:extent cx="5334000" cy="3388658"/>
                   <wp:effectExtent b="0" l="0" r="0" t="0"/>
-                  <wp:docPr descr="" title="" id="48" name="Picture"/>
+                  <wp:docPr descr="" title="" id="37" name="Picture"/>
                   <a:graphic>
                     <a:graphicData uri="http://schemas.openxmlformats.org/drawingml/2006/picture">
                       <pic:pic>
                         <pic:nvPicPr>
-                          <pic:cNvPr descr="../Wykresy/praca/fig_02a_hindex.png" id="49" name="Picture"/>
+                          <pic:cNvPr descr="../Wykresy/praca/fig_02a_hindex.png" id="38" name="Picture"/>
                           <pic:cNvPicPr>
                             <a:picLocks noChangeArrowheads="1" noChangeAspect="1"/>
                           </pic:cNvPicPr>
                         </pic:nvPicPr>
                         <pic:blipFill>
-                          <a:blip r:embed="rId47"/>
+                          <a:blip r:embed="rId36"/>
                           <a:stretch>
                             <a:fillRect/>
                           </a:stretch>
@@ -5789,7 +5793,7 @@
               <w:jc w:val="center"/>
             </w:pPr>
             <w:pPr>
-              <w:jc w:val="start"/>
+              <w:jc w:val="left"/>
               <w:spacing w:before="200"/>
               <w:pStyle w:val="ImageCaption"/>
             </w:pPr>
@@ -5797,7 +5801,7 @@
               <w:t xml:space="preserve">Rysunek 4: Wykres pudełkowy h-index (WoS) w dwuczynnikowym układzie uczelnia × stanowisko; oznaczenia grup jednorodnych (CLD) opisano w tekście powyżej.</w:t>
             </w:r>
           </w:p>
-          <w:bookmarkEnd w:id="50"/>
+          <w:bookmarkEnd w:id="39"/>
         </w:tc>
       </w:tr>
     </w:tbl>
@@ -5812,17 +5816,17 @@
     <w:tbl>
       <w:tblPr>
         <w:tblStyle w:val="Table"/>
-        <w:tblW w:type="pct" w:w="5000"/>
-        <w:tblLayout w:type="fixed"/>
+        <w:tblW w:type="dxa" w:w="9638"/>
+        <w:tblLayout w:type="autofit"/>
         <w:tblLook w:firstRow="0" w:lastRow="0" w:firstColumn="0" w:lastColumn="0" w:noHBand="0" w:noVBand="0" w:val="0000"/>
       </w:tblPr>
       <w:tblGrid>
-        <w:gridCol w:w="7920"/>
+        <w:gridCol w:w="9638"/>
       </w:tblGrid>
       <w:tr>
         <w:tc>
           <w:tcPr/>
-          <w:bookmarkStart w:id="54" w:name="fig-sumif"/>
+          <w:bookmarkStart w:id="43" w:name="fig-sumif"/>
           <w:p>
             <w:pPr>
               <w:pStyle w:val="Compact"/>
@@ -5833,18 +5837,18 @@
                 <wp:inline>
                   <wp:extent cx="5334000" cy="3388658"/>
                   <wp:effectExtent b="0" l="0" r="0" t="0"/>
-                  <wp:docPr descr="" title="" id="52" name="Picture"/>
+                  <wp:docPr descr="" title="" id="41" name="Picture"/>
                   <a:graphic>
                     <a:graphicData uri="http://schemas.openxmlformats.org/drawingml/2006/picture">
                       <pic:pic>
                         <pic:nvPicPr>
-                          <pic:cNvPr descr="../Wykresy/praca/fig_02b_sumif.png" id="53" name="Picture"/>
+                          <pic:cNvPr descr="../Wykresy/praca/fig_02b_sumif.png" id="42" name="Picture"/>
                           <pic:cNvPicPr>
                             <a:picLocks noChangeArrowheads="1" noChangeAspect="1"/>
                           </pic:cNvPicPr>
                         </pic:nvPicPr>
                         <pic:blipFill>
-                          <a:blip r:embed="rId51"/>
+                          <a:blip r:embed="rId40"/>
                           <a:stretch>
                             <a:fillRect/>
                           </a:stretch>
@@ -5876,7 +5880,7 @@
               <w:jc w:val="center"/>
             </w:pPr>
             <w:pPr>
-              <w:jc w:val="start"/>
+              <w:jc w:val="left"/>
               <w:spacing w:before="200"/>
               <w:pStyle w:val="ImageCaption"/>
             </w:pPr>
@@ -5884,7 +5888,7 @@
               <w:t xml:space="preserve">Rysunek 5: Wykres pudełkowy sumarycznego Impact Factor w dwuczynnikowym układzie uczelnia × stanowisko; oznaczenia grup jednorodnych (CLD) opisano w tekście powyżej.</w:t>
             </w:r>
           </w:p>
-          <w:bookmarkEnd w:id="54"/>
+          <w:bookmarkEnd w:id="43"/>
         </w:tc>
       </w:tr>
     </w:tbl>
@@ -5899,17 +5903,17 @@
     <w:tbl>
       <w:tblPr>
         <w:tblStyle w:val="Table"/>
-        <w:tblW w:type="pct" w:w="5000"/>
-        <w:tblLayout w:type="fixed"/>
+        <w:tblW w:type="dxa" w:w="9638"/>
+        <w:tblLayout w:type="autofit"/>
         <w:tblLook w:firstRow="0" w:lastRow="0" w:firstColumn="0" w:lastColumn="0" w:noHBand="0" w:noVBand="0" w:val="0000"/>
       </w:tblPr>
       <w:tblGrid>
-        <w:gridCol w:w="7920"/>
+        <w:gridCol w:w="9638"/>
       </w:tblGrid>
       <w:tr>
         <w:tc>
           <w:tcPr/>
-          <w:bookmarkStart w:id="58" w:name="fig-npub"/>
+          <w:bookmarkStart w:id="47" w:name="fig-npub"/>
           <w:p>
             <w:pPr>
               <w:pStyle w:val="Compact"/>
@@ -5920,18 +5924,18 @@
                 <wp:inline>
                   <wp:extent cx="5334000" cy="3388658"/>
                   <wp:effectExtent b="0" l="0" r="0" t="0"/>
-                  <wp:docPr descr="" title="" id="56" name="Picture"/>
+                  <wp:docPr descr="" title="" id="45" name="Picture"/>
                   <a:graphic>
                     <a:graphicData uri="http://schemas.openxmlformats.org/drawingml/2006/picture">
                       <pic:pic>
                         <pic:nvPicPr>
-                          <pic:cNvPr descr="../Wykresy/praca/fig_02c_npub.png" id="57" name="Picture"/>
+                          <pic:cNvPr descr="../Wykresy/praca/fig_02c_npub.png" id="46" name="Picture"/>
                           <pic:cNvPicPr>
                             <a:picLocks noChangeArrowheads="1" noChangeAspect="1"/>
                           </pic:cNvPicPr>
                         </pic:nvPicPr>
                         <pic:blipFill>
-                          <a:blip r:embed="rId55"/>
+                          <a:blip r:embed="rId44"/>
                           <a:stretch>
                             <a:fillRect/>
                           </a:stretch>
@@ -5963,7 +5967,7 @@
               <w:jc w:val="center"/>
             </w:pPr>
             <w:pPr>
-              <w:jc w:val="start"/>
+              <w:jc w:val="left"/>
               <w:spacing w:before="200"/>
               <w:pStyle w:val="ImageCaption"/>
             </w:pPr>
@@ -5971,7 +5975,7 @@
               <w:t xml:space="preserve">Rysunek 6: Wykres pudełkowy liczby publikacji w dwuczynnikowym układzie uczelnia × stanowisko; oznaczenia grup jednorodnych (CLD) opisano w tekście powyżej.</w:t>
             </w:r>
           </w:p>
-          <w:bookmarkEnd w:id="58"/>
+          <w:bookmarkEnd w:id="47"/>
         </w:tc>
       </w:tr>
     </w:tbl>
@@ -6024,23 +6028,23 @@
     <w:tbl>
       <w:tblPr>
         <w:tblStyle w:val="Table"/>
-        <w:tblW w:type="pct" w:w="5000"/>
-        <w:tblLayout w:type="fixed"/>
+        <w:tblW w:type="dxa" w:w="9638"/>
+        <w:tblLayout w:type="autofit"/>
         <w:tblLook w:firstRow="0" w:lastRow="0" w:firstColumn="0" w:lastColumn="0" w:noHBand="0" w:noVBand="0" w:val="0000"/>
       </w:tblPr>
       <w:tblGrid>
-        <w:gridCol w:w="7920"/>
+        <w:gridCol w:w="9638"/>
       </w:tblGrid>
       <w:tr>
         <w:tc>
           <w:tcPr/>
-          <w:bookmarkStart w:id="59" w:name="tbl-roznicowanie"/>
+          <w:bookmarkStart w:id="48" w:name="tbl-roznicowanie"/>
           <w:p>
             <w:pPr>
               <w:jc w:val="center"/>
             </w:pPr>
             <w:pPr>
-              <w:jc w:val="start"/>
+              <w:jc w:val="left"/>
               <w:spacing w:before="200"/>
               <w:pStyle w:val="ImageCaption"/>
             </w:pPr>
@@ -6050,23 +6054,22 @@
           </w:p>
           <w:tbl xmlns:w="http://schemas.openxmlformats.org/wordprocessingml/2006/main" xmlns:r="http://schemas.openxmlformats.org/officeDocument/2006/relationships" xmlns:w14="http://schemas.microsoft.com/office/word/2010/wordml" xmlns:wp="http://schemas.openxmlformats.org/drawingml/2006/wordprocessingDrawing" xmlns:a="http://schemas.openxmlformats.org/drawingml/2006/main" xmlns:pic="http://schemas.openxmlformats.org/drawingml/2006/picture">
             <w:tblPr>
-              <w:tblLayout w:type="fixed"/>
+              <w:tblLayout w:type="autofit"/>
               <w:jc w:val="center"/>
               <w:tblLook w:firstRow="1" w:lastRow="0" w:firstColumn="0" w:lastColumn="0" w:noHBand="0" w:noVBand="1"/>
             </w:tblPr>
             <w:tblGrid>
-              <w:gridCol w:w="2664"/>
-              <w:gridCol w:w="1368"/>
-              <w:gridCol w:w="1224"/>
-              <w:gridCol w:w="1584"/>
-              <w:gridCol w:w="1512"/>
+              <w:gridCol w:w="3074"/>
+              <w:gridCol w:w="1579"/>
+              <w:gridCol w:w="1412"/>
+              <w:gridCol w:w="1828"/>
+              <w:gridCol w:w="1745"/>
             </w:tblGrid>
             <w:tr>
               <w:trPr>
                 <w:trHeight w:val="360" w:hRule="auto"/>
                 <w:tblHeader/>
               </w:trPr>
-              header1
               <w:tc>
                 <w:tcPr>
                   <w:tcBorders>
@@ -6342,7 +6345,6 @@
               <w:trPr>
                 <w:trHeight w:val="360" w:hRule="auto"/>
               </w:trPr>
-              body1
               <w:tc>
                 <w:tcPr>
                   <w:tcBorders>
@@ -6618,7 +6620,6 @@
               <w:trPr>
                 <w:trHeight w:val="360" w:hRule="auto"/>
               </w:trPr>
-              body2
               <w:tc>
                 <w:tcPr>
                   <w:tcBorders>
@@ -6894,7 +6895,6 @@
               <w:trPr>
                 <w:trHeight w:val="360" w:hRule="auto"/>
               </w:trPr>
-              body3
               <w:tc>
                 <w:tcPr>
                   <w:tcBorders>
@@ -7170,7 +7170,6 @@
               <w:trPr>
                 <w:trHeight w:val="360" w:hRule="auto"/>
               </w:trPr>
-              body4
               <w:tc>
                 <w:tcPr>
                   <w:tcBorders>
@@ -7446,7 +7445,6 @@
               <w:trPr>
                 <w:trHeight w:val="360" w:hRule="auto"/>
               </w:trPr>
-              body5
               <w:tc>
                 <w:tcPr>
                   <w:tcBorders>
@@ -7722,7 +7720,6 @@
               <w:trPr>
                 <w:trHeight w:val="360" w:hRule="auto"/>
               </w:trPr>
-              body6
               <w:tc>
                 <w:tcPr>
                   <w:tcBorders>
@@ -7998,7 +7995,6 @@
               <w:trPr>
                 <w:trHeight w:val="360" w:hRule="auto"/>
               </w:trPr>
-              footer1
               <w:tc>
                 <w:tcPr>
                   <w:gridSpan w:val="5"/>
@@ -8056,7 +8052,7 @@
               </w:tc>
             </w:tr>
           </w:tbl>
-          <w:bookmarkEnd w:id="59"/>
+          <w:bookmarkEnd w:id="48"/>
         </w:tc>
       </w:tr>
     </w:tbl>
@@ -8084,8 +8080,8 @@
         <w:t xml:space="preserve">Podsumowując, wraz z wyższym stanowiskiem rosną wartości większości wskaźników bibliometrycznych. Zależność ta była istotna statystycznie dla pięciu z sześciu analizowanych metryk.</w:t>
       </w:r>
     </w:p>
-    <w:bookmarkEnd w:id="60"/>
-    <w:bookmarkStart w:id="68" w:name="X88ab428eb81e048ab5c69c902d08d12ccb60c6c"/>
+    <w:bookmarkEnd w:id="49"/>
+    <w:bookmarkStart w:id="57" w:name="X88ab428eb81e048ab5c69c902d08d12ccb60c6c"/>
     <w:p>
       <w:pPr>
         <w:pStyle w:val="Heading2"/>
@@ -8169,17 +8165,17 @@
     <w:tbl>
       <w:tblPr>
         <w:tblStyle w:val="Table"/>
-        <w:tblW w:type="pct" w:w="5000"/>
-        <w:tblLayout w:type="fixed"/>
+        <w:tblW w:type="dxa" w:w="9638"/>
+        <w:tblLayout w:type="autofit"/>
         <w:tblLook w:firstRow="0" w:lastRow="0" w:firstColumn="0" w:lastColumn="0" w:noHBand="0" w:noVBand="0" w:val="0000"/>
       </w:tblPr>
       <w:tblGrid>
-        <w:gridCol w:w="7920"/>
+        <w:gridCol w:w="9638"/>
       </w:tblGrid>
       <w:tr>
         <w:tc>
           <w:tcPr/>
-          <w:bookmarkStart w:id="64" w:name="fig-klastry"/>
+          <w:bookmarkStart w:id="53" w:name="fig-klastry"/>
           <w:p>
             <w:pPr>
               <w:pStyle w:val="Compact"/>
@@ -8190,18 +8186,18 @@
                 <wp:inline>
                   <wp:extent cx="5334000" cy="4000499"/>
                   <wp:effectExtent b="0" l="0" r="0" t="0"/>
-                  <wp:docPr descr="" title="" id="62" name="Picture"/>
+                  <wp:docPr descr="" title="" id="51" name="Picture"/>
                   <a:graphic>
                     <a:graphicData uri="http://schemas.openxmlformats.org/drawingml/2006/picture">
                       <pic:pic>
                         <pic:nvPicPr>
-                          <pic:cNvPr descr="../Wykresy/praca/fig_03a_klastry.png" id="63" name="Picture"/>
+                          <pic:cNvPr descr="../Wykresy/praca/fig_03a_klastry.png" id="52" name="Picture"/>
                           <pic:cNvPicPr>
                             <a:picLocks noChangeArrowheads="1" noChangeAspect="1"/>
                           </pic:cNvPicPr>
                         </pic:nvPicPr>
                         <pic:blipFill>
-                          <a:blip r:embed="rId61"/>
+                          <a:blip r:embed="rId50"/>
                           <a:stretch>
                             <a:fillRect/>
                           </a:stretch>
@@ -8233,7 +8229,7 @@
               <w:jc w:val="center"/>
             </w:pPr>
             <w:pPr>
-              <w:jc w:val="start"/>
+              <w:jc w:val="left"/>
               <w:spacing w:before="200"/>
               <w:pStyle w:val="ImageCaption"/>
             </w:pPr>
@@ -8241,7 +8237,7 @@
               <w:t xml:space="preserve">Rysunek 7: Klastrowanie k-means w przestrzeni dwóch pierwszych składowych głównych (PCA).</w:t>
             </w:r>
           </w:p>
-          <w:bookmarkEnd w:id="64"/>
+          <w:bookmarkEnd w:id="53"/>
         </w:tc>
       </w:tr>
     </w:tbl>
@@ -8299,23 +8295,23 @@
     <w:tbl>
       <w:tblPr>
         <w:tblStyle w:val="Table"/>
-        <w:tblW w:type="pct" w:w="5000"/>
-        <w:tblLayout w:type="fixed"/>
+        <w:tblW w:type="dxa" w:w="9638"/>
+        <w:tblLayout w:type="autofit"/>
         <w:tblLook w:firstRow="0" w:lastRow="0" w:firstColumn="0" w:lastColumn="0" w:noHBand="0" w:noVBand="0" w:val="0000"/>
       </w:tblPr>
       <w:tblGrid>
-        <w:gridCol w:w="7920"/>
+        <w:gridCol w:w="9638"/>
       </w:tblGrid>
       <w:tr>
         <w:tc>
           <w:tcPr/>
-          <w:bookmarkStart w:id="65" w:name="tbl-klastry2"/>
+          <w:bookmarkStart w:id="54" w:name="tbl-klastry2"/>
           <w:p>
             <w:pPr>
               <w:jc w:val="center"/>
             </w:pPr>
             <w:pPr>
-              <w:jc w:val="start"/>
+              <w:jc w:val="left"/>
               <w:spacing w:before="200"/>
               <w:pStyle w:val="ImageCaption"/>
             </w:pPr>
@@ -8325,24 +8321,23 @@
           </w:p>
           <w:tbl xmlns:w="http://schemas.openxmlformats.org/wordprocessingml/2006/main" xmlns:r="http://schemas.openxmlformats.org/officeDocument/2006/relationships" xmlns:w14="http://schemas.microsoft.com/office/word/2010/wordml" xmlns:wp="http://schemas.openxmlformats.org/drawingml/2006/wordprocessingDrawing" xmlns:a="http://schemas.openxmlformats.org/drawingml/2006/main" xmlns:pic="http://schemas.openxmlformats.org/drawingml/2006/picture">
             <w:tblPr>
-              <w:tblLayout w:type="fixed"/>
+              <w:tblLayout w:type="autofit"/>
               <w:jc w:val="center"/>
               <w:tblLook w:firstRow="1" w:lastRow="0" w:firstColumn="0" w:lastColumn="0" w:noHBand="0" w:noVBand="1"/>
             </w:tblPr>
             <w:tblGrid>
-              <w:gridCol w:w="2232"/>
-              <w:gridCol w:w="720"/>
-              <w:gridCol w:w="1368"/>
-              <w:gridCol w:w="1512"/>
-              <w:gridCol w:w="1512"/>
-              <w:gridCol w:w="1512"/>
+              <w:gridCol w:w="2429"/>
+              <w:gridCol w:w="784"/>
+              <w:gridCol w:w="1489"/>
+              <w:gridCol w:w="1646"/>
+              <w:gridCol w:w="1646"/>
+              <w:gridCol w:w="1644"/>
             </w:tblGrid>
             <w:tr>
               <w:trPr>
                 <w:trHeight w:val="360" w:hRule="auto"/>
                 <w:tblHeader/>
               </w:trPr>
-              header1
               <w:tc>
                 <w:tcPr>
                   <w:tcBorders>
@@ -8672,7 +8667,6 @@
               <w:trPr>
                 <w:trHeight w:val="360" w:hRule="auto"/>
               </w:trPr>
-              body1
               <w:tc>
                 <w:tcPr>
                   <w:tcBorders>
@@ -9002,7 +8996,6 @@
               <w:trPr>
                 <w:trHeight w:val="360" w:hRule="auto"/>
               </w:trPr>
-              body2
               <w:tc>
                 <w:tcPr>
                   <w:tcBorders>
@@ -9329,7 +9322,7 @@
               </w:tc>
             </w:tr>
           </w:tbl>
-          <w:bookmarkEnd w:id="65"/>
+          <w:bookmarkEnd w:id="54"/>
         </w:tc>
       </w:tr>
     </w:tbl>
@@ -9422,23 +9415,23 @@
     <w:tbl>
       <w:tblPr>
         <w:tblStyle w:val="Table"/>
-        <w:tblW w:type="pct" w:w="5000"/>
-        <w:tblLayout w:type="fixed"/>
+        <w:tblW w:type="dxa" w:w="9638"/>
+        <w:tblLayout w:type="autofit"/>
         <w:tblLook w:firstRow="0" w:lastRow="0" w:firstColumn="0" w:lastColumn="0" w:noHBand="0" w:noVBand="0" w:val="0000"/>
       </w:tblPr>
       <w:tblGrid>
-        <w:gridCol w:w="7920"/>
+        <w:gridCol w:w="9638"/>
       </w:tblGrid>
       <w:tr>
         <w:tc>
           <w:tcPr/>
-          <w:bookmarkStart w:id="66" w:name="tbl-replikacja"/>
+          <w:bookmarkStart w:id="55" w:name="tbl-replikacja"/>
           <w:p>
             <w:pPr>
               <w:jc w:val="center"/>
             </w:pPr>
             <w:pPr>
-              <w:jc w:val="start"/>
+              <w:jc w:val="left"/>
               <w:spacing w:before="200"/>
               <w:pStyle w:val="ImageCaption"/>
             </w:pPr>
@@ -9448,24 +9441,23 @@
           </w:p>
           <w:tbl xmlns:w="http://schemas.openxmlformats.org/wordprocessingml/2006/main" xmlns:r="http://schemas.openxmlformats.org/officeDocument/2006/relationships" xmlns:w14="http://schemas.microsoft.com/office/word/2010/wordml" xmlns:wp="http://schemas.openxmlformats.org/drawingml/2006/wordprocessingDrawing" xmlns:a="http://schemas.openxmlformats.org/drawingml/2006/main" xmlns:pic="http://schemas.openxmlformats.org/drawingml/2006/picture">
             <w:tblPr>
-              <w:tblLayout w:type="fixed"/>
+              <w:tblLayout w:type="autofit"/>
               <w:jc w:val="center"/>
               <w:tblLook w:firstRow="1" w:lastRow="0" w:firstColumn="0" w:lastColumn="0" w:noHBand="0" w:noVBand="1"/>
             </w:tblPr>
             <w:tblGrid>
-              <w:gridCol w:w="1368"/>
-              <w:gridCol w:w="1512"/>
-              <w:gridCol w:w="1368"/>
-              <w:gridCol w:w="1440"/>
-              <w:gridCol w:w="1584"/>
-              <w:gridCol w:w="1512"/>
+              <w:gridCol w:w="1501"/>
+              <w:gridCol w:w="1659"/>
+              <w:gridCol w:w="1501"/>
+              <w:gridCol w:w="1580"/>
+              <w:gridCol w:w="1738"/>
+              <w:gridCol w:w="1659"/>
             </w:tblGrid>
             <w:tr>
               <w:trPr>
                 <w:trHeight w:val="360" w:hRule="auto"/>
                 <w:tblHeader/>
               </w:trPr>
-              header1
               <w:tc>
                 <w:tcPr>
                   <w:tcBorders>
@@ -9795,7 +9787,6 @@
               <w:trPr>
                 <w:trHeight w:val="360" w:hRule="auto"/>
               </w:trPr>
-              body1
               <w:tc>
                 <w:tcPr>
                   <w:tcBorders>
@@ -10125,7 +10116,6 @@
               <w:trPr>
                 <w:trHeight w:val="360" w:hRule="auto"/>
               </w:trPr>
-              body2
               <w:tc>
                 <w:tcPr>
                   <w:tcBorders>
@@ -10455,7 +10445,6 @@
               <w:trPr>
                 <w:trHeight w:val="360" w:hRule="auto"/>
               </w:trPr>
-              body3
               <w:tc>
                 <w:tcPr>
                   <w:tcBorders>
@@ -10785,7 +10774,6 @@
               <w:trPr>
                 <w:trHeight w:val="360" w:hRule="auto"/>
               </w:trPr>
-              body4
               <w:tc>
                 <w:tcPr>
                   <w:tcBorders>
@@ -11115,7 +11103,6 @@
               <w:trPr>
                 <w:trHeight w:val="360" w:hRule="auto"/>
               </w:trPr>
-              body5
               <w:tc>
                 <w:tcPr>
                   <w:tcBorders>
@@ -11445,7 +11432,6 @@
               <w:trPr>
                 <w:trHeight w:val="360" w:hRule="auto"/>
               </w:trPr>
-              footer1
               <w:tc>
                 <w:tcPr>
                   <w:gridSpan w:val="6"/>
@@ -11506,7 +11492,6 @@
               <w:trPr>
                 <w:trHeight w:val="360" w:hRule="auto"/>
               </w:trPr>
-              footer2
               <w:tc>
                 <w:tcPr>
                   <w:gridSpan w:val="6"/>
@@ -11564,7 +11549,7 @@
               </w:tc>
             </w:tr>
           </w:tbl>
-          <w:bookmarkEnd w:id="66"/>
+          <w:bookmarkEnd w:id="55"/>
         </w:tc>
       </w:tr>
     </w:tbl>
@@ -11598,23 +11583,23 @@
     <w:tbl>
       <w:tblPr>
         <w:tblStyle w:val="Table"/>
-        <w:tblW w:type="pct" w:w="5000"/>
-        <w:tblLayout w:type="fixed"/>
+        <w:tblW w:type="dxa" w:w="9638"/>
+        <w:tblLayout w:type="autofit"/>
         <w:tblLook w:firstRow="0" w:lastRow="0" w:firstColumn="0" w:lastColumn="0" w:noHBand="0" w:noVBand="0" w:val="0000"/>
       </w:tblPr>
       <w:tblGrid>
-        <w:gridCol w:w="7920"/>
+        <w:gridCol w:w="9638"/>
       </w:tblGrid>
       <w:tr>
         <w:tc>
           <w:tcPr/>
-          <w:bookmarkStart w:id="67" w:name="tbl-klastry3"/>
+          <w:bookmarkStart w:id="56" w:name="tbl-klastry3"/>
           <w:p>
             <w:pPr>
               <w:jc w:val="center"/>
             </w:pPr>
             <w:pPr>
-              <w:jc w:val="start"/>
+              <w:jc w:val="left"/>
               <w:spacing w:before="200"/>
               <w:pStyle w:val="ImageCaption"/>
             </w:pPr>
@@ -11624,24 +11609,23 @@
           </w:p>
           <w:tbl xmlns:w="http://schemas.openxmlformats.org/wordprocessingml/2006/main" xmlns:r="http://schemas.openxmlformats.org/officeDocument/2006/relationships" xmlns:w14="http://schemas.microsoft.com/office/word/2010/wordml" xmlns:wp="http://schemas.openxmlformats.org/drawingml/2006/wordprocessingDrawing" xmlns:a="http://schemas.openxmlformats.org/drawingml/2006/main" xmlns:pic="http://schemas.openxmlformats.org/drawingml/2006/picture">
             <w:tblPr>
-              <w:tblLayout w:type="fixed"/>
+              <w:tblLayout w:type="autofit"/>
               <w:jc w:val="center"/>
               <w:tblLook w:firstRow="1" w:lastRow="0" w:firstColumn="0" w:lastColumn="0" w:noHBand="0" w:noVBand="1"/>
             </w:tblPr>
             <w:tblGrid>
-              <w:gridCol w:w="2736"/>
-              <w:gridCol w:w="576"/>
-              <w:gridCol w:w="1296"/>
-              <w:gridCol w:w="1296"/>
-              <w:gridCol w:w="1152"/>
-              <w:gridCol w:w="2016"/>
+              <w:gridCol w:w="2907"/>
+              <w:gridCol w:w="612"/>
+              <w:gridCol w:w="1377"/>
+              <w:gridCol w:w="1377"/>
+              <w:gridCol w:w="1224"/>
+              <w:gridCol w:w="2141"/>
             </w:tblGrid>
             <w:tr>
               <w:trPr>
                 <w:trHeight w:val="360" w:hRule="auto"/>
                 <w:tblHeader/>
               </w:trPr>
-              header1
               <w:tc>
                 <w:tcPr>
                   <w:tcBorders>
@@ -11971,7 +11955,6 @@
               <w:trPr>
                 <w:trHeight w:val="360" w:hRule="auto"/>
               </w:trPr>
-              body1
               <w:tc>
                 <w:tcPr>
                   <w:tcBorders>
@@ -12301,7 +12284,6 @@
               <w:trPr>
                 <w:trHeight w:val="360" w:hRule="auto"/>
               </w:trPr>
-              body2
               <w:tc>
                 <w:tcPr>
                   <w:tcBorders>
@@ -12631,7 +12613,6 @@
               <w:trPr>
                 <w:trHeight w:val="360" w:hRule="auto"/>
               </w:trPr>
-              body3
               <w:tc>
                 <w:tcPr>
                   <w:tcBorders>
@@ -12961,7 +12942,6 @@
               <w:trPr>
                 <w:trHeight w:val="360" w:hRule="auto"/>
               </w:trPr>
-              footer1
               <w:tc>
                 <w:tcPr>
                   <w:gridSpan w:val="6"/>
@@ -13022,7 +13002,6 @@
               <w:trPr>
                 <w:trHeight w:val="360" w:hRule="auto"/>
               </w:trPr>
-              footer2
               <w:tc>
                 <w:tcPr>
                   <w:gridSpan w:val="6"/>
@@ -13080,7 +13059,7 @@
               </w:tc>
             </w:tr>
           </w:tbl>
-          <w:bookmarkEnd w:id="67"/>
+          <w:bookmarkEnd w:id="56"/>
         </w:tc>
       </w:tr>
     </w:tbl>
@@ -13100,8 +13079,8 @@
         <w:t xml:space="preserve">Wynik ten pokazuje, że wysoki wpływ naukowy nie musi wynikać wyłącznie z długiego stażu i dużej liczby publikacji. Poza wielkością dorobku znaczenie ma także jego jakość: wysokie wartości wskaźników osiągają również młodsi badacze z mniejszą liczbą publikacji. Także w wariancie z trzema klastrami typologia pozostaje niezależna od uczelni (Craméra V = 0,10). Jej związek ze stanowiskiem jest natomiast słabszy niż w podziale na dwa klastry (V = 0,38), ponieważ profil jakościowy obejmuje osoby z różnych poziomów hierarchii akademickiej.</w:t>
       </w:r>
     </w:p>
-    <w:bookmarkEnd w:id="68"/>
-    <w:bookmarkStart w:id="80" w:name="Xbd5b45b451445d4809baed400770e4b8ffa7ad0"/>
+    <w:bookmarkEnd w:id="57"/>
+    <w:bookmarkStart w:id="69" w:name="Xbd5b45b451445d4809baed400770e4b8ffa7ad0"/>
     <w:p>
       <w:pPr>
         <w:pStyle w:val="Heading2"/>
@@ -13194,23 +13173,23 @@
     <w:tbl>
       <w:tblPr>
         <w:tblStyle w:val="Table"/>
-        <w:tblW w:type="pct" w:w="5000"/>
-        <w:tblLayout w:type="fixed"/>
+        <w:tblW w:type="dxa" w:w="9638"/>
+        <w:tblLayout w:type="autofit"/>
         <w:tblLook w:firstRow="0" w:lastRow="0" w:firstColumn="0" w:lastColumn="0" w:noHBand="0" w:noVBand="0" w:val="0000"/>
       </w:tblPr>
       <w:tblGrid>
-        <w:gridCol w:w="7920"/>
+        <w:gridCol w:w="9638"/>
       </w:tblGrid>
       <w:tr>
         <w:tc>
           <w:tcPr/>
-          <w:bookmarkStart w:id="69" w:name="tbl-modele"/>
+          <w:bookmarkStart w:id="58" w:name="tbl-modele"/>
           <w:p>
             <w:pPr>
               <w:jc w:val="center"/>
             </w:pPr>
             <w:pPr>
-              <w:jc w:val="start"/>
+              <w:jc w:val="left"/>
               <w:spacing w:before="200"/>
               <w:pStyle w:val="ImageCaption"/>
             </w:pPr>
@@ -13220,23 +13199,22 @@
           </w:p>
           <w:tbl xmlns:w="http://schemas.openxmlformats.org/wordprocessingml/2006/main" xmlns:r="http://schemas.openxmlformats.org/officeDocument/2006/relationships" xmlns:w14="http://schemas.microsoft.com/office/word/2010/wordml" xmlns:wp="http://schemas.openxmlformats.org/drawingml/2006/wordprocessingDrawing" xmlns:a="http://schemas.openxmlformats.org/drawingml/2006/main" xmlns:pic="http://schemas.openxmlformats.org/drawingml/2006/picture">
             <w:tblPr>
-              <w:tblLayout w:type="fixed"/>
+              <w:tblLayout w:type="autofit"/>
               <w:jc w:val="center"/>
               <w:tblLook w:firstRow="1" w:lastRow="0" w:firstColumn="0" w:lastColumn="0" w:noHBand="0" w:noVBand="1"/>
             </w:tblPr>
             <w:tblGrid>
-              <w:gridCol w:w="2304"/>
-              <w:gridCol w:w="1584"/>
-              <w:gridCol w:w="1584"/>
-              <w:gridCol w:w="1584"/>
-              <w:gridCol w:w="1584"/>
+              <w:gridCol w:w="2570"/>
+              <w:gridCol w:w="1767"/>
+              <w:gridCol w:w="1767"/>
+              <w:gridCol w:w="1767"/>
+              <w:gridCol w:w="1767"/>
             </w:tblGrid>
             <w:tr>
               <w:trPr>
                 <w:trHeight w:val="360" w:hRule="auto"/>
                 <w:tblHeader/>
               </w:trPr>
-              header1
               <w:tc>
                 <w:tcPr>
                   <w:tcBorders>
@@ -13512,7 +13490,6 @@
               <w:trPr>
                 <w:trHeight w:val="360" w:hRule="auto"/>
               </w:trPr>
-              body1
               <w:tc>
                 <w:tcPr>
                   <w:tcBorders>
@@ -13788,7 +13765,6 @@
               <w:trPr>
                 <w:trHeight w:val="360" w:hRule="auto"/>
               </w:trPr>
-              body2
               <w:tc>
                 <w:tcPr>
                   <w:tcBorders>
@@ -14064,7 +14040,6 @@
               <w:trPr>
                 <w:trHeight w:val="360" w:hRule="auto"/>
               </w:trPr>
-              footer1
               <w:tc>
                 <w:tcPr>
                   <w:gridSpan w:val="5"/>
@@ -14125,7 +14100,6 @@
               <w:trPr>
                 <w:trHeight w:val="360" w:hRule="auto"/>
               </w:trPr>
-              footer2
               <w:tc>
                 <w:tcPr>
                   <w:gridSpan w:val="5"/>
@@ -14183,7 +14157,7 @@
               </w:tc>
             </w:tr>
           </w:tbl>
-          <w:bookmarkEnd w:id="69"/>
+          <w:bookmarkEnd w:id="58"/>
         </w:tc>
       </w:tr>
     </w:tbl>
@@ -14261,23 +14235,23 @@
     <w:tbl>
       <w:tblPr>
         <w:tblStyle w:val="Table"/>
-        <w:tblW w:type="pct" w:w="5000"/>
-        <w:tblLayout w:type="fixed"/>
+        <w:tblW w:type="dxa" w:w="9638"/>
+        <w:tblLayout w:type="autofit"/>
         <w:tblLook w:firstRow="0" w:lastRow="0" w:firstColumn="0" w:lastColumn="0" w:noHBand="0" w:noVBand="0" w:val="0000"/>
       </w:tblPr>
       <w:tblGrid>
-        <w:gridCol w:w="7920"/>
+        <w:gridCol w:w="9638"/>
       </w:tblGrid>
       <w:tr>
         <w:tc>
           <w:tcPr/>
-          <w:bookmarkStart w:id="70" w:name="tbl-prog"/>
+          <w:bookmarkStart w:id="59" w:name="tbl-prog"/>
           <w:p>
             <w:pPr>
               <w:jc w:val="center"/>
             </w:pPr>
             <w:pPr>
-              <w:jc w:val="start"/>
+              <w:jc w:val="left"/>
               <w:spacing w:before="200"/>
               <w:pStyle w:val="ImageCaption"/>
             </w:pPr>
@@ -14287,23 +14261,22 @@
           </w:p>
           <w:tbl xmlns:w="http://schemas.openxmlformats.org/wordprocessingml/2006/main" xmlns:r="http://schemas.openxmlformats.org/officeDocument/2006/relationships" xmlns:w14="http://schemas.microsoft.com/office/word/2010/wordml" xmlns:wp="http://schemas.openxmlformats.org/drawingml/2006/wordprocessingDrawing" xmlns:a="http://schemas.openxmlformats.org/drawingml/2006/main" xmlns:pic="http://schemas.openxmlformats.org/drawingml/2006/picture">
             <w:tblPr>
-              <w:tblLayout w:type="fixed"/>
+              <w:tblLayout w:type="autofit"/>
               <w:jc w:val="center"/>
               <w:tblLook w:firstRow="1" w:lastRow="0" w:firstColumn="0" w:lastColumn="0" w:noHBand="0" w:noVBand="1"/>
             </w:tblPr>
             <w:tblGrid>
-              <w:gridCol w:w="2664"/>
-              <w:gridCol w:w="1296"/>
-              <w:gridCol w:w="1440"/>
-              <w:gridCol w:w="1224"/>
-              <w:gridCol w:w="2160"/>
+              <w:gridCol w:w="2923"/>
+              <w:gridCol w:w="1422"/>
+              <w:gridCol w:w="1580"/>
+              <w:gridCol w:w="1343"/>
+              <w:gridCol w:w="2370"/>
             </w:tblGrid>
             <w:tr>
               <w:trPr>
                 <w:trHeight w:val="360" w:hRule="auto"/>
                 <w:tblHeader/>
               </w:trPr>
-              header1
               <w:tc>
                 <w:tcPr>
                   <w:tcBorders>
@@ -14579,7 +14552,6 @@
               <w:trPr>
                 <w:trHeight w:val="360" w:hRule="auto"/>
               </w:trPr>
-              body1
               <w:tc>
                 <w:tcPr>
                   <w:tcBorders>
@@ -14855,7 +14827,6 @@
               <w:trPr>
                 <w:trHeight w:val="360" w:hRule="auto"/>
               </w:trPr>
-              body2
               <w:tc>
                 <w:tcPr>
                   <w:tcBorders>
@@ -15131,7 +15102,6 @@
               <w:trPr>
                 <w:trHeight w:val="360" w:hRule="auto"/>
               </w:trPr>
-              footer1
               <w:tc>
                 <w:tcPr>
                   <w:gridSpan w:val="5"/>
@@ -15192,7 +15162,6 @@
               <w:trPr>
                 <w:trHeight w:val="360" w:hRule="auto"/>
               </w:trPr>
-              footer2
               <w:tc>
                 <w:tcPr>
                   <w:gridSpan w:val="5"/>
@@ -15250,7 +15219,7 @@
               </w:tc>
             </w:tr>
           </w:tbl>
-          <w:bookmarkEnd w:id="70"/>
+          <w:bookmarkEnd w:id="59"/>
         </w:tc>
       </w:tr>
     </w:tbl>
@@ -15295,17 +15264,17 @@
     <w:tbl>
       <w:tblPr>
         <w:tblStyle w:val="Table"/>
-        <w:tblW w:type="pct" w:w="5000"/>
-        <w:tblLayout w:type="fixed"/>
+        <w:tblW w:type="dxa" w:w="9638"/>
+        <w:tblLayout w:type="autofit"/>
         <w:tblLook w:firstRow="0" w:lastRow="0" w:firstColumn="0" w:lastColumn="0" w:noHBand="0" w:noVBand="0" w:val="0000"/>
       </w:tblPr>
       <w:tblGrid>
-        <w:gridCol w:w="7920"/>
+        <w:gridCol w:w="9638"/>
       </w:tblGrid>
       <w:tr>
         <w:tc>
           <w:tcPr/>
-          <w:bookmarkStart w:id="74" w:name="fig-waznosc"/>
+          <w:bookmarkStart w:id="63" w:name="fig-waznosc"/>
           <w:p>
             <w:pPr>
               <w:pStyle w:val="Compact"/>
@@ -15316,18 +15285,18 @@
                 <wp:inline>
                   <wp:extent cx="5334000" cy="3006436"/>
                   <wp:effectExtent b="0" l="0" r="0" t="0"/>
-                  <wp:docPr descr="" title="" id="72" name="Picture"/>
+                  <wp:docPr descr="" title="" id="61" name="Picture"/>
                   <a:graphic>
                     <a:graphicData uri="http://schemas.openxmlformats.org/drawingml/2006/picture">
                       <pic:pic>
                         <pic:nvPicPr>
-                          <pic:cNvPr descr="../Wykresy/praca/fig_04b_waznosc.png" id="73" name="Picture"/>
+                          <pic:cNvPr descr="../Wykresy/praca/fig_04b_waznosc.png" id="62" name="Picture"/>
                           <pic:cNvPicPr>
                             <a:picLocks noChangeArrowheads="1" noChangeAspect="1"/>
                           </pic:cNvPicPr>
                         </pic:nvPicPr>
                         <pic:blipFill>
-                          <a:blip r:embed="rId71"/>
+                          <a:blip r:embed="rId60"/>
                           <a:stretch>
                             <a:fillRect/>
                           </a:stretch>
@@ -15359,7 +15328,7 @@
               <w:jc w:val="center"/>
             </w:pPr>
             <w:pPr>
-              <w:jc w:val="start"/>
+              <w:jc w:val="left"/>
               <w:spacing w:before="200"/>
               <w:pStyle w:val="ImageCaption"/>
             </w:pPr>
@@ -15367,7 +15336,7 @@
               <w:t xml:space="preserve">Rysunek 8: Najważniejsze predyktory wysokiego wpływu publikacyjnego w modelu Random Forest (ważność permutacyjna). Kolor oznacza kategorię cechy: produktywność, współpraca i cytowania oraz cechy formalne (uczelnia, stanowisko).</w:t>
             </w:r>
           </w:p>
-          <w:bookmarkEnd w:id="74"/>
+          <w:bookmarkEnd w:id="63"/>
         </w:tc>
       </w:tr>
     </w:tbl>
@@ -15379,7 +15348,7 @@
         <w:t xml:space="preserve">W odpowiedzi na pytanie 3 wyniki pokazują, że wysoki wpływ naukowy można przewidywać na podstawie cech badacza, takich jak stanowisko, uczelnia, liczba publikacji i współpraca naukowa. Model osiągnął bardzo dobrą zdolność rozróżniania osób o wysokim i niższym wpływie naukowym (AUC ok. 0,97).</w:t>
       </w:r>
     </w:p>
-    <w:bookmarkStart w:id="79" w:name="X799efba27fc6d09a0b5025f13f38b8866705e0f"/>
+    <w:bookmarkStart w:id="68" w:name="X799efba27fc6d09a0b5025f13f38b8866705e0f"/>
     <w:p>
       <w:pPr>
         <w:pStyle w:val="Heading3"/>
@@ -15434,17 +15403,17 @@
     <w:tbl>
       <w:tblPr>
         <w:tblStyle w:val="Table"/>
-        <w:tblW w:type="pct" w:w="5000"/>
-        <w:tblLayout w:type="fixed"/>
+        <w:tblW w:type="dxa" w:w="9638"/>
+        <w:tblLayout w:type="autofit"/>
         <w:tblLook w:firstRow="0" w:lastRow="0" w:firstColumn="0" w:lastColumn="0" w:noHBand="0" w:noVBand="0" w:val="0000"/>
       </w:tblPr>
       <w:tblGrid>
-        <w:gridCol w:w="7920"/>
+        <w:gridCol w:w="9638"/>
       </w:tblGrid>
       <w:tr>
         <w:tc>
           <w:tcPr/>
-          <w:bookmarkStart w:id="78" w:name="fig-waznosc-jakosc"/>
+          <w:bookmarkStart w:id="67" w:name="fig-waznosc-jakosc"/>
           <w:p>
             <w:pPr>
               <w:pStyle w:val="Compact"/>
@@ -15455,18 +15424,18 @@
                 <wp:inline>
                   <wp:extent cx="5334000" cy="3006436"/>
                   <wp:effectExtent b="0" l="0" r="0" t="0"/>
-                  <wp:docPr descr="" title="" id="76" name="Picture"/>
+                  <wp:docPr descr="" title="" id="65" name="Picture"/>
                   <a:graphic>
                     <a:graphicData uri="http://schemas.openxmlformats.org/drawingml/2006/picture">
                       <pic:pic>
                         <pic:nvPicPr>
-                          <pic:cNvPr descr="../Wykresy/praca/fig_04c_waznosc_jakosc.png" id="77" name="Picture"/>
+                          <pic:cNvPr descr="../Wykresy/praca/fig_04c_waznosc_jakosc.png" id="66" name="Picture"/>
                           <pic:cNvPicPr>
                             <a:picLocks noChangeArrowheads="1" noChangeAspect="1"/>
                           </pic:cNvPicPr>
                         </pic:nvPicPr>
                         <pic:blipFill>
-                          <a:blip r:embed="rId75"/>
+                          <a:blip r:embed="rId64"/>
                           <a:stretch>
                             <a:fillRect/>
                           </a:stretch>
@@ -15498,7 +15467,7 @@
               <w:jc w:val="center"/>
             </w:pPr>
             <w:pPr>
-              <w:jc w:val="start"/>
+              <w:jc w:val="left"/>
               <w:spacing w:before="200"/>
               <w:pStyle w:val="ImageCaption"/>
             </w:pPr>
@@ -15506,7 +15475,7 @@
               <w:t xml:space="preserve">Rysunek 9: Najważniejsze predyktory jakości dorobku w modelu Random Forest. Model przewidywał, czy średni FWCI badacza przekracza 1. Największe znaczenie miały cechy współpracy naukowej, zwłaszcza średnia liczba autorów jednej publikacji i liczba unikalnych współautorów. Wiek akademicki, liczba publikacji, stanowisko i uczelnia miały mniejsze znaczenie. Kolor oznacza kategorię zmiennej.</w:t>
             </w:r>
           </w:p>
-          <w:bookmarkEnd w:id="78"/>
+          <w:bookmarkEnd w:id="67"/>
         </w:tc>
       </w:tr>
     </w:tbl>
@@ -15518,9 +15487,9 @@
         <w:t xml:space="preserve">Oznacza to, że wysoki wpływ pojedynczych publikacji częściej wiąże się z pracą w szerszych, wieloautorskich zespołach niż ze stażem, liczbą publikacji czy formalnym stanowiskiem. Podobny wniosek wynikał już z analizy klastrów, w której wyróżniono profil jakościowy obejmujący wielu młodszych badaczy. Pokazuje to, że wysoka jakość dorobku nie musi być związana z długim stażem ani dużą liczbą publikacji.</w:t>
       </w:r>
     </w:p>
-    <w:bookmarkEnd w:id="79"/>
-    <w:bookmarkEnd w:id="80"/>
-    <w:bookmarkStart w:id="90" w:name="sieć-współautorstwa-pytanie-4"/>
+    <w:bookmarkEnd w:id="68"/>
+    <w:bookmarkEnd w:id="69"/>
+    <w:bookmarkStart w:id="79" w:name="sieć-współautorstwa-pytanie-4"/>
     <w:p>
       <w:pPr>
         <w:pStyle w:val="Heading2"/>
@@ -15548,17 +15517,17 @@
     <w:tbl>
       <w:tblPr>
         <w:tblStyle w:val="Table"/>
-        <w:tblW w:type="pct" w:w="5000"/>
-        <w:tblLayout w:type="fixed"/>
+        <w:tblW w:type="dxa" w:w="9638"/>
+        <w:tblLayout w:type="autofit"/>
         <w:tblLook w:firstRow="0" w:lastRow="0" w:firstColumn="0" w:lastColumn="0" w:noHBand="0" w:noVBand="0" w:val="0000"/>
       </w:tblPr>
       <w:tblGrid>
-        <w:gridCol w:w="7920"/>
+        <w:gridCol w:w="9638"/>
       </w:tblGrid>
       <w:tr>
         <w:tc>
           <w:tcPr/>
-          <w:bookmarkStart w:id="84" w:name="fig-siec"/>
+          <w:bookmarkStart w:id="73" w:name="fig-siec"/>
           <w:p>
             <w:pPr>
               <w:pStyle w:val="Compact"/>
@@ -15569,18 +15538,18 @@
                 <wp:inline>
                   <wp:extent cx="5067300" cy="4504266"/>
                   <wp:effectExtent b="0" l="0" r="0" t="0"/>
-                  <wp:docPr descr="" title="" id="82" name="Picture"/>
+                  <wp:docPr descr="" title="" id="71" name="Picture"/>
                   <a:graphic>
                     <a:graphicData uri="http://schemas.openxmlformats.org/drawingml/2006/picture">
                       <pic:pic>
                         <pic:nvPicPr>
-                          <pic:cNvPr descr="../Wykresy/praca/fig_05a_siec.png" id="83" name="Picture"/>
+                          <pic:cNvPr descr="../Wykresy/praca/fig_05a_siec.png" id="72" name="Picture"/>
                           <pic:cNvPicPr>
                             <a:picLocks noChangeArrowheads="1" noChangeAspect="1"/>
                           </pic:cNvPicPr>
                         </pic:nvPicPr>
                         <pic:blipFill>
-                          <a:blip r:embed="rId81"/>
+                          <a:blip r:embed="rId70"/>
                           <a:stretch>
                             <a:fillRect/>
                           </a:stretch>
@@ -15612,7 +15581,7 @@
               <w:jc w:val="center"/>
             </w:pPr>
             <w:pPr>
-              <w:jc w:val="start"/>
+              <w:jc w:val="left"/>
               <w:spacing w:before="200"/>
               <w:pStyle w:val="ImageCaption"/>
             </w:pPr>
@@ -15620,7 +15589,7 @@
               <w:t xml:space="preserve">Rysunek 10: Sieć współautorstwa naukowców badanej dyscypliny. Węzły to badacze (kolor oznacza uczelnię, wielkość liczbę połączeń), a krawędzie wspólne publikacje. Skupiska tej samej barwy pokazują, że współpraca koncentruje się wewnątrz uczelni.</w:t>
             </w:r>
           </w:p>
-          <w:bookmarkEnd w:id="84"/>
+          <w:bookmarkEnd w:id="73"/>
         </w:tc>
       </w:tr>
     </w:tbl>
@@ -15688,23 +15657,23 @@
     <w:tbl>
       <w:tblPr>
         <w:tblStyle w:val="Table"/>
-        <w:tblW w:type="pct" w:w="5000"/>
-        <w:tblLayout w:type="fixed"/>
+        <w:tblW w:type="dxa" w:w="9638"/>
+        <w:tblLayout w:type="autofit"/>
         <w:tblLook w:firstRow="0" w:lastRow="0" w:firstColumn="0" w:lastColumn="0" w:noHBand="0" w:noVBand="0" w:val="0000"/>
       </w:tblPr>
       <w:tblGrid>
-        <w:gridCol w:w="7920"/>
+        <w:gridCol w:w="9638"/>
       </w:tblGrid>
       <w:tr>
         <w:tc>
           <w:tcPr/>
-          <w:bookmarkStart w:id="85" w:name="tbl-spolecznosci"/>
+          <w:bookmarkStart w:id="74" w:name="tbl-spolecznosci"/>
           <w:p>
             <w:pPr>
               <w:jc w:val="center"/>
             </w:pPr>
             <w:pPr>
-              <w:jc w:val="start"/>
+              <w:jc w:val="left"/>
               <w:spacing w:before="200"/>
               <w:pStyle w:val="ImageCaption"/>
             </w:pPr>
@@ -15714,21 +15683,20 @@
           </w:p>
           <w:tbl xmlns:w="http://schemas.openxmlformats.org/wordprocessingml/2006/main" xmlns:r="http://schemas.openxmlformats.org/officeDocument/2006/relationships" xmlns:w14="http://schemas.microsoft.com/office/word/2010/wordml" xmlns:wp="http://schemas.openxmlformats.org/drawingml/2006/wordprocessingDrawing" xmlns:a="http://schemas.openxmlformats.org/drawingml/2006/main" xmlns:pic="http://schemas.openxmlformats.org/drawingml/2006/picture">
             <w:tblPr>
-              <w:tblLayout w:type="fixed"/>
+              <w:tblLayout w:type="autofit"/>
               <w:jc w:val="center"/>
               <w:tblLook w:firstRow="1" w:lastRow="0" w:firstColumn="0" w:lastColumn="0" w:noHBand="0" w:noVBand="1"/>
             </w:tblPr>
             <w:tblGrid>
-              <w:gridCol w:w="4752"/>
-              <w:gridCol w:w="1800"/>
-              <w:gridCol w:w="1800"/>
+              <w:gridCol w:w="5484"/>
+              <w:gridCol w:w="2077"/>
+              <w:gridCol w:w="2077"/>
             </w:tblGrid>
             <w:tr>
               <w:trPr>
                 <w:trHeight w:val="360" w:hRule="auto"/>
                 <w:tblHeader/>
               </w:trPr>
-              header1
               <w:tc>
                 <w:tcPr>
                   <w:tcBorders>
@@ -15896,7 +15864,6 @@
               <w:trPr>
                 <w:trHeight w:val="360" w:hRule="auto"/>
               </w:trPr>
-              body1
               <w:tc>
                 <w:tcPr>
                   <w:tcBorders>
@@ -16064,7 +16031,6 @@
               <w:trPr>
                 <w:trHeight w:val="360" w:hRule="auto"/>
               </w:trPr>
-              body2
               <w:tc>
                 <w:tcPr>
                   <w:tcBorders>
@@ -16232,7 +16198,6 @@
               <w:trPr>
                 <w:trHeight w:val="360" w:hRule="auto"/>
               </w:trPr>
-              footer1
               <w:tc>
                 <w:tcPr>
                   <w:gridSpan w:val="3"/>
@@ -16293,7 +16258,6 @@
               <w:trPr>
                 <w:trHeight w:val="360" w:hRule="auto"/>
               </w:trPr>
-              footer2
               <w:tc>
                 <w:tcPr>
                   <w:gridSpan w:val="3"/>
@@ -16351,24 +16315,24 @@
               </w:tc>
             </w:tr>
           </w:tbl>
-          <w:bookmarkEnd w:id="85"/>
+          <w:bookmarkEnd w:id="74"/>
         </w:tc>
       </w:tr>
     </w:tbl>
     <w:tbl>
       <w:tblPr>
         <w:tblStyle w:val="Table"/>
-        <w:tblW w:type="pct" w:w="5000"/>
-        <w:tblLayout w:type="fixed"/>
+        <w:tblW w:type="dxa" w:w="9638"/>
+        <w:tblLayout w:type="autofit"/>
         <w:tblLook w:firstRow="0" w:lastRow="0" w:firstColumn="0" w:lastColumn="0" w:noHBand="0" w:noVBand="0" w:val="0000"/>
       </w:tblPr>
       <w:tblGrid>
-        <w:gridCol w:w="7920"/>
+        <w:gridCol w:w="9638"/>
       </w:tblGrid>
       <w:tr>
         <w:tc>
           <w:tcPr/>
-          <w:bookmarkStart w:id="89" w:name="fig-spolecznosci"/>
+          <w:bookmarkStart w:id="78" w:name="fig-spolecznosci"/>
           <w:p>
             <w:pPr>
               <w:pStyle w:val="Compact"/>
@@ -16379,18 +16343,18 @@
                 <wp:inline>
                   <wp:extent cx="5334000" cy="6096000"/>
                   <wp:effectExtent b="0" l="0" r="0" t="0"/>
-                  <wp:docPr descr="" title="" id="87" name="Picture"/>
+                  <wp:docPr descr="" title="" id="76" name="Picture"/>
                   <a:graphic>
                     <a:graphicData uri="http://schemas.openxmlformats.org/drawingml/2006/picture">
                       <pic:pic>
                         <pic:nvPicPr>
-                          <pic:cNvPr descr="../Wykresy/praca/fig_05b_spolecznosci.png" id="88" name="Picture"/>
+                          <pic:cNvPr descr="../Wykresy/praca/fig_05b_spolecznosci.png" id="77" name="Picture"/>
                           <pic:cNvPicPr>
                             <a:picLocks noChangeArrowheads="1" noChangeAspect="1"/>
                           </pic:cNvPicPr>
                         </pic:nvPicPr>
                         <pic:blipFill>
-                          <a:blip r:embed="rId86"/>
+                          <a:blip r:embed="rId75"/>
                           <a:stretch>
                             <a:fillRect/>
                           </a:stretch>
@@ -16422,7 +16386,7 @@
               <w:jc w:val="center"/>
             </w:pPr>
             <w:pPr>
-              <w:jc w:val="start"/>
+              <w:jc w:val="left"/>
               <w:spacing w:before="200"/>
               <w:pStyle w:val="ImageCaption"/>
             </w:pPr>
@@ -16430,7 +16394,7 @@
               <w:t xml:space="preserve">Rysunek 11: Zgodność społeczności Louvain z uczelnią. Każdy wiersz to jedna społeczność (uporządkowane według wielkości); wartość i intensywność oznaczają udział danej uczelni, a kolor typ społeczności: czerwień to społeczność jednouczelniana, turkus to społeczność mieszana (współpraca międzyuczelniana). Niemal wszystkie społeczności są jednorodne uczelniano.</w:t>
             </w:r>
           </w:p>
-          <w:bookmarkEnd w:id="89"/>
+          <w:bookmarkEnd w:id="78"/>
         </w:tc>
       </w:tr>
     </w:tbl>
@@ -16469,9 +16433,9 @@
         <w:t xml:space="preserve">Najwyższą centralność stopnia, czyli największą liczbę bezpośrednich powiązań współautorskich, osiąga profesor z URK (S. Smoleń). Wśród najbardziej centralnych osób znajduje się także grupa badaczy gleboznawczych z UPWr.</w:t>
       </w:r>
     </w:p>
-    <w:bookmarkEnd w:id="90"/>
-    <w:bookmarkEnd w:id="91"/>
-    <w:bookmarkStart w:id="101" w:name="dyskusja"/>
+    <w:bookmarkEnd w:id="79"/>
+    <w:bookmarkEnd w:id="80"/>
+    <w:bookmarkStart w:id="90" w:name="dyskusja"/>
     <w:p>
       <w:pPr>
         <w:pStyle w:val="Heading1"/>
@@ -16480,7 +16444,7 @@
         <w:t xml:space="preserve">Dyskusja</w:t>
       </w:r>
     </w:p>
-    <w:bookmarkStart w:id="92" w:name="X8e8cd80b7d1e8d8e23d38bfd67a798253a95b88"/>
+    <w:bookmarkStart w:id="81" w:name="X8e8cd80b7d1e8d8e23d38bfd67a798253a95b88"/>
     <w:p>
       <w:pPr>
         <w:pStyle w:val="Heading2"/>
@@ -16529,8 +16493,8 @@
         <w:t xml:space="preserve">Taki układ może wynikać ze specyfiki nauk rolniczych. W tej dziedzinie część badań jest silnie związana z lokalną infrastrukturą i warunkami prowadzenia eksperymentów, takimi jak pola doświadczalne, stacje badawcze czy lokalne uwarunkowania glebowo-klimatyczne. Może to sprzyjać współpracy w obrębie tej samej uczelni lub ośrodka badawczego.</w:t>
       </w:r>
     </w:p>
-    <w:bookmarkEnd w:id="92"/>
-    <w:bookmarkStart w:id="93" w:name="X55d3951ebce5c318a1ba2b13bef613b3921736b"/>
+    <w:bookmarkEnd w:id="81"/>
+    <w:bookmarkStart w:id="82" w:name="X55d3951ebce5c318a1ba2b13bef613b3921736b"/>
     <w:p>
       <w:pPr>
         <w:pStyle w:val="Heading2"/>
@@ -16579,8 +16543,8 @@
         <w:t xml:space="preserve">Spójny obraz daje też wariant klastrowania k = 3, w którym wyodrębniono profil jakościowy zdominowany przez asystentów i adiunktów o wysokim FWCI i IF na publikację. Może to odzwierciedlać zmianę pokoleniową, w której młodsi badacze częściej publikują w prestiżowych czasopismach o szerokim zasięgu, w ramach większych zespołów współautorskich, zamiast budować dużą liczbę prac o niższym oddziaływaniu. Ponieważ dane mają charakter przekrojowy, interpretację tę należy traktować jako hipotezę: nie można odróżnić rzeczywistego efektu pokoleniowego od efektu etapu kariery ani od selekcji osób pozostających w nauce.</w:t>
       </w:r>
     </w:p>
-    <w:bookmarkEnd w:id="93"/>
-    <w:bookmarkStart w:id="94" w:name="kategoria-ewaluacyjna-mein"/>
+    <w:bookmarkEnd w:id="82"/>
+    <w:bookmarkStart w:id="83" w:name="kategoria-ewaluacyjna-mein"/>
     <w:p>
       <w:pPr>
         <w:pStyle w:val="Heading2"/>
@@ -16613,8 +16577,8 @@
         <w:t xml:space="preserve">Wniosek ten należy jednak traktować ostrożnie. W badaniu uwzględniono tylko jedną uczelnię z kategorią B+, dlatego zależność między kategorią ewaluacyjną a indywidualnym dorobkiem naukowców wymagałaby sprawdzenia na większej próbie uczelni.</w:t>
       </w:r>
     </w:p>
-    <w:bookmarkEnd w:id="94"/>
-    <w:bookmarkStart w:id="99" w:name="Xc8114be83f87911a3e825982079ac6b9186de2d"/>
+    <w:bookmarkEnd w:id="83"/>
+    <w:bookmarkStart w:id="88" w:name="Xc8114be83f87911a3e825982079ac6b9186de2d"/>
     <w:p>
       <w:pPr>
         <w:pStyle w:val="Heading2"/>
@@ -16669,17 +16633,17 @@
     <w:tbl>
       <w:tblPr>
         <w:tblStyle w:val="Table"/>
-        <w:tblW w:type="pct" w:w="5000"/>
-        <w:tblLayout w:type="fixed"/>
+        <w:tblW w:type="dxa" w:w="9638"/>
+        <w:tblLayout w:type="autofit"/>
         <w:tblLook w:firstRow="0" w:lastRow="0" w:firstColumn="0" w:lastColumn="0" w:noHBand="0" w:noVBand="0" w:val="0000"/>
       </w:tblPr>
       <w:tblGrid>
-        <w:gridCol w:w="7920"/>
+        <w:gridCol w:w="9638"/>
       </w:tblGrid>
       <w:tr>
         <w:tc>
           <w:tcPr/>
-          <w:bookmarkStart w:id="98" w:name="fig-dynamika"/>
+          <w:bookmarkStart w:id="87" w:name="fig-dynamika"/>
           <w:p>
             <w:pPr>
               <w:pStyle w:val="Compact"/>
@@ -16690,18 +16654,18 @@
                 <wp:inline>
                   <wp:extent cx="4267200" cy="2607733"/>
                   <wp:effectExtent b="0" l="0" r="0" t="0"/>
-                  <wp:docPr descr="" title="" id="96" name="Picture"/>
+                  <wp:docPr descr="" title="" id="85" name="Picture"/>
                   <a:graphic>
                     <a:graphicData uri="http://schemas.openxmlformats.org/drawingml/2006/picture">
                       <pic:pic>
                         <pic:nvPicPr>
-                          <pic:cNvPr descr="../Wykresy/praca/fig_06_dynamika_porownanie.png" id="97" name="Picture"/>
+                          <pic:cNvPr descr="../Wykresy/praca/fig_06_dynamika_porownanie.png" id="86" name="Picture"/>
                           <pic:cNvPicPr>
                             <a:picLocks noChangeArrowheads="1" noChangeAspect="1"/>
                           </pic:cNvPicPr>
                         </pic:nvPicPr>
                         <pic:blipFill>
-                          <a:blip r:embed="rId95"/>
+                          <a:blip r:embed="rId84"/>
                           <a:stretch>
                             <a:fillRect/>
                           </a:stretch>
@@ -16733,7 +16697,7 @@
               <w:jc w:val="center"/>
             </w:pPr>
             <w:pPr>
-              <w:jc w:val="start"/>
+              <w:jc w:val="left"/>
               <w:spacing w:before="200"/>
               <w:pStyle w:val="ImageCaption"/>
             </w:pPr>
@@ -16741,7 +16705,7 @@
               <w:t xml:space="preserve">Rysunek 12: Roczne tempo wzrostu liczby publikacji na badacza według danych OpenAlex i Omega-PSIR. Linie pokazują 95% przedziały ufności. Wyniki wskazują, że ocena dynamiki rozwoju uczelni zależy od źródła danych.</w:t>
             </w:r>
           </w:p>
-          <w:bookmarkEnd w:id="98"/>
+          <w:bookmarkEnd w:id="87"/>
         </w:tc>
       </w:tr>
     </w:tbl>
@@ -16777,8 +16741,8 @@
         <w:t xml:space="preserve">Różnice między uczelniami należy jednak interpretować ostrożnie, ponieważ przedziały ufności są szerokie i częściowo się nakładają. Bardziej wiarygodny jest ogólny podział na uczelnie o wyższym tempie wzrostu (URK, UWM) oraz uczelnie o bardziej ustabilizowanej produktywności (UPWr, SGGW), niż dokładny ranking uczelni.</w:t>
       </w:r>
     </w:p>
-    <w:bookmarkEnd w:id="99"/>
-    <w:bookmarkStart w:id="100" w:name="ograniczenia-badania"/>
+    <w:bookmarkEnd w:id="88"/>
+    <w:bookmarkStart w:id="89" w:name="ograniczenia-badania"/>
     <w:p>
       <w:pPr>
         <w:pStyle w:val="Heading2"/>
@@ -16949,7 +16913,7 @@
           <w:rPr>
             <w:rStyle w:val="Hyperlink"/>
           </w:rPr>
-          <w:t xml:space="preserve">Culbert i in. 2025</w:t>
+          <w:t xml:space="preserve">Culbert et al. 2025</w:t>
         </w:r>
       </w:hyperlink>
       <w:r>
@@ -16959,9 +16923,9 @@
         <w:t xml:space="preserve">. Dlatego Omega-PSIR przyjęto jako źródło podstawowe, a OpenAlex jako źródło uzupełniające.</w:t>
       </w:r>
     </w:p>
-    <w:bookmarkEnd w:id="100"/>
-    <w:bookmarkEnd w:id="101"/>
-    <w:bookmarkStart w:id="103" w:name="wnioski"/>
+    <w:bookmarkEnd w:id="89"/>
+    <w:bookmarkEnd w:id="90"/>
+    <w:bookmarkStart w:id="92" w:name="wnioski"/>
     <w:p>
       <w:pPr>
         <w:pStyle w:val="Heading1"/>
@@ -17026,7 +16990,7 @@
         <w:t xml:space="preserve">Łącznie wyniki pokazują, że indywidualny dorobek naukowców jest związany głównie z etapem kariery, natomiast współpraca naukowa przebiega przede wszystkim w obrębie uczelni. Praca potwierdza także znaczenie jednorodnego źródła danych. Wykorzystanie systemów Omega-PSIR umożliwiło porównywalne pozyskanie wskaźników bibliometrycznych z czterech uczelni, co byłoby znacznie trudniejsze przy użyciu różnych, niejednolitych repozytoriów.</w:t>
       </w:r>
     </w:p>
-    <w:bookmarkStart w:id="102" w:name="wnioski-dla-praktyki"/>
+    <w:bookmarkStart w:id="91" w:name="wnioski-dla-praktyki"/>
     <w:p>
       <w:pPr>
         <w:pStyle w:val="Heading2"/>
@@ -17072,9 +17036,9 @@
         <w:br w:type="page"/>
       </w:r>
     </w:p>
-    <w:bookmarkEnd w:id="102"/>
-    <w:bookmarkEnd w:id="103"/>
-    <w:bookmarkStart w:id="141" w:name="bibliografia"/>
+    <w:bookmarkEnd w:id="91"/>
+    <w:bookmarkEnd w:id="92"/>
+    <w:bookmarkStart w:id="130" w:name="bibliografia"/>
     <w:p>
       <w:pPr>
         <w:pStyle w:val="Heading1"/>
@@ -17083,8 +17047,8 @@
         <w:t xml:space="preserve">Bibliografia</w:t>
       </w:r>
     </w:p>
-    <w:bookmarkStart w:id="140" w:name="refs"/>
-    <w:bookmarkStart w:id="105" w:name="ref-ariaBibliometrix2017"/>
+    <w:bookmarkStart w:id="129" w:name="refs"/>
+    <w:bookmarkStart w:id="94" w:name="ref-ariaBibliometrix2017"/>
     <w:p>
       <w:pPr>
         <w:pStyle w:val="Bibliography"/>
@@ -17129,7 +17093,7 @@
       <w:r>
         <w:t xml:space="preserve"> </w:t>
       </w:r>
-      <w:hyperlink r:id="rId104">
+      <w:hyperlink r:id="rId93">
         <w:r>
           <w:rPr>
             <w:rStyle w:val="Hyperlink"/>
@@ -17141,8 +17105,8 @@
         <w:t xml:space="preserve">.</w:t>
       </w:r>
     </w:p>
-    <w:bookmarkEnd w:id="105"/>
-    <w:bookmarkStart w:id="107" w:name="ref-ariaOpenalexR2024"/>
+    <w:bookmarkEnd w:id="94"/>
+    <w:bookmarkStart w:id="96" w:name="ref-ariaOpenalexR2024"/>
     <w:p>
       <w:pPr>
         <w:pStyle w:val="Bibliography"/>
@@ -17202,7 +17166,7 @@
       <w:r>
         <w:t xml:space="preserve"> </w:t>
       </w:r>
-      <w:hyperlink r:id="rId106">
+      <w:hyperlink r:id="rId95">
         <w:r>
           <w:rPr>
             <w:rStyle w:val="Hyperlink"/>
@@ -17214,8 +17178,8 @@
         <w:t xml:space="preserve">.</w:t>
       </w:r>
     </w:p>
-    <w:bookmarkEnd w:id="107"/>
-    <w:bookmarkStart w:id="108" w:name="ref-blondel2008"/>
+    <w:bookmarkEnd w:id="96"/>
+    <w:bookmarkStart w:id="97" w:name="ref-blondel2008"/>
     <w:p>
       <w:pPr>
         <w:pStyle w:val="Bibliography"/>
@@ -17249,8 +17213,8 @@
         <w:t xml:space="preserve">2008 (10): P10008.</w:t>
       </w:r>
     </w:p>
-    <w:bookmarkEnd w:id="108"/>
-    <w:bookmarkStart w:id="109" w:name="ref-breiman2001"/>
+    <w:bookmarkEnd w:id="97"/>
+    <w:bookmarkStart w:id="98" w:name="ref-breiman2001"/>
     <w:p>
       <w:pPr>
         <w:pStyle w:val="Bibliography"/>
@@ -17284,8 +17248,8 @@
         <w:t xml:space="preserve">45 (1): 5–32.</w:t>
       </w:r>
     </w:p>
-    <w:bookmarkEnd w:id="109"/>
-    <w:bookmarkStart w:id="110" w:name="ref-chen2016"/>
+    <w:bookmarkEnd w:id="98"/>
+    <w:bookmarkStart w:id="99" w:name="ref-chen2016"/>
     <w:p>
       <w:pPr>
         <w:pStyle w:val="Bibliography"/>
@@ -17306,7 +17270,7 @@
         <w:t xml:space="preserve">: A scalable tree boosting system”</w:t>
       </w:r>
       <w:r>
-        <w:t xml:space="preserve">. W</w:t>
+        <w:t xml:space="preserve">.</w:t>
       </w:r>
       <w:r>
         <w:t xml:space="preserve"> </w:t>
@@ -17322,14 +17286,14 @@
         <w:t xml:space="preserve">, 785–94.</w:t>
       </w:r>
     </w:p>
-    <w:bookmarkEnd w:id="110"/>
-    <w:bookmarkStart w:id="112" w:name="ref-culbertReferenceCoverageAnalysis2025"/>
+    <w:bookmarkEnd w:id="99"/>
+    <w:bookmarkStart w:id="101" w:name="ref-culbertReferenceCoverageAnalysis2025"/>
     <w:p>
       <w:pPr>
         <w:pStyle w:val="Bibliography"/>
       </w:pPr>
       <w:r>
-        <w:t xml:space="preserve">Culbert, Jack H., Anne Hobert, Najko Jahn, Nick Haupka, Marion Schmidt, Paul Donner, i Philipp Mayr. 2025.</w:t>
+        <w:t xml:space="preserve">Culbert, Jack H., Anne Hobert, Najko Jahn, et al. 2025.</w:t>
       </w:r>
       <w:r>
         <w:t xml:space="preserve"> </w:t>
@@ -17392,7 +17356,7 @@
       <w:r>
         <w:t xml:space="preserve"> </w:t>
       </w:r>
-      <w:hyperlink r:id="rId111">
+      <w:hyperlink r:id="rId100">
         <w:r>
           <w:rPr>
             <w:rStyle w:val="Hyperlink"/>
@@ -17404,8 +17368,8 @@
         <w:t xml:space="preserve">.</w:t>
       </w:r>
     </w:p>
-    <w:bookmarkEnd w:id="112"/>
-    <w:bookmarkStart w:id="113" w:name="ref-Drabek2012"/>
+    <w:bookmarkEnd w:id="101"/>
+    <w:bookmarkStart w:id="102" w:name="ref-Drabek2012"/>
     <w:p>
       <w:pPr>
         <w:pStyle w:val="Bibliography"/>
@@ -17439,8 +17403,8 @@
         <w:t xml:space="preserve">130 (3).</w:t>
       </w:r>
     </w:p>
-    <w:bookmarkEnd w:id="113"/>
-    <w:bookmarkStart w:id="114" w:name="ref-garfield2006"/>
+    <w:bookmarkEnd w:id="102"/>
+    <w:bookmarkStart w:id="103" w:name="ref-garfield2006"/>
     <w:p>
       <w:pPr>
         <w:pStyle w:val="Bibliography"/>
@@ -17474,8 +17438,8 @@
         <w:t xml:space="preserve">295 (1): 90–93.</w:t>
       </w:r>
     </w:p>
-    <w:bookmarkEnd w:id="114"/>
-    <w:bookmarkStart w:id="115" w:name="ref-Grygiel2009"/>
+    <w:bookmarkEnd w:id="103"/>
+    <w:bookmarkStart w:id="104" w:name="ref-Grygiel2009"/>
     <w:p>
       <w:pPr>
         <w:pStyle w:val="Bibliography"/>
@@ -17518,14 +17482,17 @@
         <w:t xml:space="preserve">7 (3): 65–84.</w:t>
       </w:r>
     </w:p>
-    <w:bookmarkEnd w:id="115"/>
-    <w:bookmarkStart w:id="117" w:name="X0b33f87ae5ad4597f5248ccd3781f8ded4d6a31"/>
+    <w:bookmarkEnd w:id="104"/>
+    <w:bookmarkStart w:id="106" w:name="X0b33f87ae5ad4597f5248ccd3781f8ded4d6a31"/>
     <w:p>
       <w:pPr>
         <w:pStyle w:val="Bibliography"/>
       </w:pPr>
       <w:r>
-        <w:t xml:space="preserve">Hicks, Diana, Paul Wouters, Ludo Waltman, Sarah de Rijcke, i Ismael Rafols. 2015.</w:t>
+        <w:t xml:space="preserve">Hicks, Diana, Paul Wouters, Ludo Waltman, Sarah de Rijcke, i Ismael Rafols</w:t>
+      </w:r>
+      <w:r>
+        <w:t xml:space="preserve">. 2015.</w:t>
       </w:r>
       <w:r>
         <w:t xml:space="preserve"> </w:t>
@@ -17567,7 +17534,7 @@
       <w:r>
         <w:t xml:space="preserve"> </w:t>
       </w:r>
-      <w:hyperlink r:id="rId116">
+      <w:hyperlink r:id="rId105">
         <w:r>
           <w:rPr>
             <w:rStyle w:val="Hyperlink"/>
@@ -17579,8 +17546,8 @@
         <w:t xml:space="preserve">.</w:t>
       </w:r>
     </w:p>
-    <w:bookmarkEnd w:id="117"/>
-    <w:bookmarkStart w:id="118" w:name="ref-hirsch2005"/>
+    <w:bookmarkEnd w:id="106"/>
+    <w:bookmarkStart w:id="107" w:name="ref-hirsch2005"/>
     <w:p>
       <w:pPr>
         <w:pStyle w:val="Bibliography"/>
@@ -17614,8 +17581,8 @@
         <w:t xml:space="preserve">102 (46): 16569–72.</w:t>
       </w:r>
     </w:p>
-    <w:bookmarkEnd w:id="118"/>
-    <w:bookmarkStart w:id="119" w:name="ref-hubert1985"/>
+    <w:bookmarkEnd w:id="107"/>
+    <w:bookmarkStart w:id="108" w:name="ref-hubert1985"/>
     <w:p>
       <w:pPr>
         <w:pStyle w:val="Bibliography"/>
@@ -17649,8 +17616,8 @@
         <w:t xml:space="preserve">2 (1): 193–218.</w:t>
       </w:r>
     </w:p>
-    <w:bookmarkEnd w:id="119"/>
-    <w:bookmarkStart w:id="121" w:name="ref-koperwas2015omega"/>
+    <w:bookmarkEnd w:id="108"/>
+    <w:bookmarkStart w:id="110" w:name="ref-koperwas2015omega"/>
     <w:p>
       <w:pPr>
         <w:pStyle w:val="Bibliography"/>
@@ -17674,7 +17641,7 @@
         <w:t xml:space="preserve">– a solution for implementing university research knowledge base”</w:t>
       </w:r>
       <w:r>
-        <w:t xml:space="preserve">. W</w:t>
+        <w:t xml:space="preserve">.</w:t>
       </w:r>
       <w:r>
         <w:t xml:space="preserve"> </w:t>
@@ -17687,12 +17654,15 @@
         <w:t xml:space="preserve">Proceedings of the 21st EUNIS Congress</w:t>
       </w:r>
       <w:r>
-        <w:t xml:space="preserve">. Dundee: European University Information Systems Organisation (EUNIS).</w:t>
-      </w:r>
-      <w:r>
-        <w:t xml:space="preserve"> </w:t>
-      </w:r>
-      <w:hyperlink r:id="rId120">
+        <w:t xml:space="preserve"> </w:t>
+      </w:r>
+      <w:r>
+        <w:t xml:space="preserve">(Dundee).</w:t>
+      </w:r>
+      <w:r>
+        <w:t xml:space="preserve"> </w:t>
+      </w:r>
+      <w:hyperlink r:id="rId109">
         <w:r>
           <w:rPr>
             <w:rStyle w:val="Hyperlink"/>
@@ -17704,8 +17674,8 @@
         <w:t xml:space="preserve">.</w:t>
       </w:r>
     </w:p>
-    <w:bookmarkEnd w:id="121"/>
-    <w:bookmarkStart w:id="122" w:name="ref-Kulczycki2019"/>
+    <w:bookmarkEnd w:id="110"/>
+    <w:bookmarkStart w:id="111" w:name="ref-Kulczycki2019"/>
     <w:p>
       <w:pPr>
         <w:pStyle w:val="Bibliography"/>
@@ -17736,8 +17706,8 @@
         <w:t xml:space="preserve">, nr 6.</w:t>
       </w:r>
     </w:p>
-    <w:bookmarkEnd w:id="122"/>
-    <w:bookmarkStart w:id="123" w:name="ref-lundberg2017"/>
+    <w:bookmarkEnd w:id="111"/>
+    <w:bookmarkStart w:id="112" w:name="ref-lundberg2017"/>
     <w:p>
       <w:pPr>
         <w:pStyle w:val="Bibliography"/>
@@ -17752,7 +17722,7 @@
         <w:t xml:space="preserve">„A unified approach to interpreting model predictions”</w:t>
       </w:r>
       <w:r>
-        <w:t xml:space="preserve">. W</w:t>
+        <w:t xml:space="preserve">.</w:t>
       </w:r>
       <w:r>
         <w:t xml:space="preserve"> </w:t>
@@ -17765,11 +17735,14 @@
         <w:t xml:space="preserve">Advances in Neural Information Processing Systems</w:t>
       </w:r>
       <w:r>
-        <w:t xml:space="preserve">, 30:4765–74.</w:t>
-      </w:r>
-    </w:p>
-    <w:bookmarkEnd w:id="123"/>
-    <w:bookmarkStart w:id="124" w:name="ref-rozp_ewaluacja2022"/>
+        <w:t xml:space="preserve"> </w:t>
+      </w:r>
+      <w:r>
+        <w:t xml:space="preserve">30: 4765–74.</w:t>
+      </w:r>
+    </w:p>
+    <w:bookmarkEnd w:id="112"/>
+    <w:bookmarkStart w:id="113" w:name="ref-rozp_ewaluacja2022"/>
     <w:p>
       <w:pPr>
         <w:pStyle w:val="Bibliography"/>
@@ -17781,14 +17754,18 @@
         <w:t xml:space="preserve"> </w:t>
       </w:r>
       <w:r>
-        <w:t xml:space="preserve">„Obwieszczenie Ministra Edukacji i Nauki z dnia 23 lutego 2022 r. w sprawie ogłoszenia jednolitego tekstu rozporządzenia Ministra Nauki i Szkolnictwa Wyższego w sprawie ewaluacji jakości działalności naukowej”</w:t>
+        <w:rPr>
+          <w:i/>
+          <w:iCs/>
+        </w:rPr>
+        <w:t xml:space="preserve">Obwieszczenie Ministra Edukacji i Nauki z dnia 23 lutego 2022 r. w sprawie ogłoszenia jednolitego tekstu rozporządzenia Ministra Nauki i Szkolnictwa Wyższego w sprawie ewaluacji jakości działalności naukowej</w:t>
       </w:r>
       <w:r>
         <w:t xml:space="preserve">. Dz.U. 2022 poz. 661.</w:t>
       </w:r>
     </w:p>
-    <w:bookmarkEnd w:id="124"/>
-    <w:bookmarkStart w:id="125" w:name="ref-rozp_dyscypliny2025"/>
+    <w:bookmarkEnd w:id="113"/>
+    <w:bookmarkStart w:id="114" w:name="ref-rozp_dyscypliny2025"/>
     <w:p>
       <w:pPr>
         <w:pStyle w:val="Bibliography"/>
@@ -17800,33 +17777,41 @@
         <w:t xml:space="preserve"> </w:t>
       </w:r>
       <w:r>
-        <w:t xml:space="preserve">„Obwieszczenie Ministra Nauki i Szkolnictwa Wyższego z dnia 12 lutego 2025 r. w sprawie ogłoszenia jednolitego tekstu rozporządzenia Ministra Edukacji i Nauki w sprawie dziedzin nauki i dyscyplin naukowych oraz dyscyplin artystycznych”</w:t>
+        <w:rPr>
+          <w:i/>
+          <w:iCs/>
+        </w:rPr>
+        <w:t xml:space="preserve">Obwieszczenie Ministra Nauki i Szkolnictwa Wyższego z dnia 12 lutego 2025 r. w sprawie ogłoszenia jednolitego tekstu rozporządzenia Ministra Edukacji i Nauki w sprawie dziedzin nauki i dyscyplin naukowych oraz dyscyplin artystycznych</w:t>
       </w:r>
       <w:r>
         <w:t xml:space="preserve">. Dz.U. 2025 poz. 211.</w:t>
       </w:r>
     </w:p>
-    <w:bookmarkEnd w:id="125"/>
-    <w:bookmarkStart w:id="126" w:name="ref-rozp_ewaluacja_nowela2025"/>
+    <w:bookmarkEnd w:id="114"/>
+    <w:bookmarkStart w:id="115" w:name="ref-rozp_ewaluacja_nowela2025"/>
     <w:p>
       <w:pPr>
         <w:pStyle w:val="Bibliography"/>
       </w:pPr>
       <w:r>
-        <w:t xml:space="preserve">———. 2025b.</w:t>
-      </w:r>
-      <w:r>
-        <w:t xml:space="preserve"> </w:t>
-      </w:r>
-      <w:r>
-        <w:t xml:space="preserve">„Rozporządzenie Ministra Nauki i Szkolnictwa Wyższego z dnia 30 lipca 2025 r. zmieniające rozporządzenie w sprawie ewaluacji jakości działalności naukowej”</w:t>
+        <w:t xml:space="preserve">Minister Nauki i Szkolnictwa Wyższego. 2025b.</w:t>
+      </w:r>
+      <w:r>
+        <w:t xml:space="preserve"> </w:t>
+      </w:r>
+      <w:r>
+        <w:rPr>
+          <w:i/>
+          <w:iCs/>
+        </w:rPr>
+        <w:t xml:space="preserve">Rozporządzenie Ministra Nauki i Szkolnictwa Wyższego z dnia 30 lipca 2025 r. zmieniające rozporządzenie w sprawie ewaluacji jakości działalności naukowej</w:t>
       </w:r>
       <w:r>
         <w:t xml:space="preserve">. Dz.U. 2025 poz. 1053.</w:t>
       </w:r>
     </w:p>
-    <w:bookmarkEnd w:id="126"/>
-    <w:bookmarkStart w:id="127" w:name="ref-moed2010snip"/>
+    <w:bookmarkEnd w:id="115"/>
+    <w:bookmarkStart w:id="116" w:name="ref-moed2010snip"/>
     <w:p>
       <w:pPr>
         <w:pStyle w:val="Bibliography"/>
@@ -17860,8 +17845,8 @@
         <w:t xml:space="preserve">4 (3): 265–77.</w:t>
       </w:r>
     </w:p>
-    <w:bookmarkEnd w:id="127"/>
-    <w:bookmarkStart w:id="129" w:name="Xf57435758c1415795137dce9045dde0a68674c8"/>
+    <w:bookmarkEnd w:id="116"/>
+    <w:bookmarkStart w:id="118" w:name="Xf57435758c1415795137dce9045dde0a68674c8"/>
     <w:p>
       <w:pPr>
         <w:pStyle w:val="Bibliography"/>
@@ -17897,7 +17882,7 @@
       <w:r>
         <w:t xml:space="preserve"> </w:t>
       </w:r>
-      <w:hyperlink r:id="rId128">
+      <w:hyperlink r:id="rId117">
         <w:r>
           <w:rPr>
             <w:rStyle w:val="Hyperlink"/>
@@ -17909,14 +17894,14 @@
         <w:t xml:space="preserve">.</w:t>
       </w:r>
     </w:p>
-    <w:bookmarkEnd w:id="129"/>
-    <w:bookmarkStart w:id="130" w:name="ref-newman2006"/>
+    <w:bookmarkEnd w:id="118"/>
+    <w:bookmarkStart w:id="119" w:name="ref-newman2006"/>
     <w:p>
       <w:pPr>
         <w:pStyle w:val="Bibliography"/>
       </w:pPr>
       <w:r>
-        <w:t xml:space="preserve">———. 2006.</w:t>
+        <w:t xml:space="preserve">Newman, Mark E. J. 2006.</w:t>
       </w:r>
       <w:r>
         <w:t xml:space="preserve"> </w:t>
@@ -17944,8 +17929,8 @@
         <w:t xml:space="preserve">103 (23): 8577–82.</w:t>
       </w:r>
     </w:p>
-    <w:bookmarkEnd w:id="130"/>
-    <w:bookmarkStart w:id="131" w:name="ref-Opalinski2017"/>
+    <w:bookmarkEnd w:id="119"/>
+    <w:bookmarkStart w:id="120" w:name="ref-Opalinski2017"/>
     <w:p>
       <w:pPr>
         <w:pStyle w:val="Bibliography"/>
@@ -17979,8 +17964,8 @@
         <w:t xml:space="preserve">55 (1): 34–65.</w:t>
       </w:r>
     </w:p>
-    <w:bookmarkEnd w:id="131"/>
-    <w:bookmarkStart w:id="132" w:name="ref-openalex2022"/>
+    <w:bookmarkEnd w:id="120"/>
+    <w:bookmarkStart w:id="121" w:name="ref-openalex2022"/>
     <w:p>
       <w:pPr>
         <w:pStyle w:val="Bibliography"/>
@@ -18011,8 +17996,8 @@
         <w:t xml:space="preserve">.</w:t>
       </w:r>
     </w:p>
-    <w:bookmarkEnd w:id="132"/>
-    <w:bookmarkStart w:id="134" w:name="Xfa806a68882317565cd91e2502e10e0c6dc8daa"/>
+    <w:bookmarkEnd w:id="121"/>
+    <w:bookmarkStart w:id="123" w:name="Xfa806a68882317565cd91e2502e10e0c6dc8daa"/>
     <w:p>
       <w:pPr>
         <w:pStyle w:val="Bibliography"/>
@@ -18067,12 +18052,12 @@
         <w:t xml:space="preserve">ITlib. Informačné technológie a knižnice</w:t>
       </w:r>
       <w:r>
-        <w:t xml:space="preserve">.</w:t>
-      </w:r>
-      <w:r>
-        <w:t xml:space="preserve"> </w:t>
-      </w:r>
-      <w:hyperlink r:id="rId133">
+        <w:t xml:space="preserve">, advance online publication.</w:t>
+      </w:r>
+      <w:r>
+        <w:t xml:space="preserve"> </w:t>
+      </w:r>
+      <w:hyperlink r:id="rId122">
         <w:r>
           <w:rPr>
             <w:rStyle w:val="Hyperlink"/>
@@ -18084,8 +18069,8 @@
         <w:t xml:space="preserve">.</w:t>
       </w:r>
     </w:p>
-    <w:bookmarkEnd w:id="134"/>
-    <w:bookmarkStart w:id="135" w:name="ref-waltman2016review"/>
+    <w:bookmarkEnd w:id="123"/>
+    <w:bookmarkStart w:id="124" w:name="ref-waltman2016review"/>
     <w:p>
       <w:pPr>
         <w:pStyle w:val="Bibliography"/>
@@ -18119,8 +18104,8 @@
         <w:t xml:space="preserve">10 (2): 365–91.</w:t>
       </w:r>
     </w:p>
-    <w:bookmarkEnd w:id="135"/>
-    <w:bookmarkStart w:id="137" w:name="ref-omegapsir2024"/>
+    <w:bookmarkEnd w:id="124"/>
+    <w:bookmarkStart w:id="126" w:name="ref-omegapsir2024"/>
     <w:p>
       <w:pPr>
         <w:pStyle w:val="Bibliography"/>
@@ -18132,7 +18117,11 @@
         <w:t xml:space="preserve"> </w:t>
       </w:r>
       <w:r>
-        <w:t xml:space="preserve">„Omega-PSIR: University Research Information System”</w:t>
+        <w:rPr>
+          <w:i/>
+          <w:iCs/>
+        </w:rPr>
+        <w:t xml:space="preserve">Omega-PSIR: University Research Information System</w:t>
       </w:r>
       <w:r>
         <w:t xml:space="preserve">.</w:t>
@@ -18140,7 +18129,7 @@
       <w:r>
         <w:t xml:space="preserve"> </w:t>
       </w:r>
-      <w:hyperlink r:id="rId136">
+      <w:hyperlink r:id="rId125">
         <w:r>
           <w:rPr>
             <w:rStyle w:val="Hyperlink"/>
@@ -18152,8 +18141,8 @@
         <w:t xml:space="preserve">.</w:t>
       </w:r>
     </w:p>
-    <w:bookmarkEnd w:id="137"/>
-    <w:bookmarkStart w:id="138" w:name="ref-winkler1990"/>
+    <w:bookmarkEnd w:id="126"/>
+    <w:bookmarkStart w:id="127" w:name="ref-winkler1990"/>
     <w:p>
       <w:pPr>
         <w:pStyle w:val="Bibliography"/>
@@ -18196,8 +18185,8 @@
         <w:t xml:space="preserve">, 354–59.</w:t>
       </w:r>
     </w:p>
-    <w:bookmarkEnd w:id="138"/>
-    <w:bookmarkStart w:id="139" w:name="ref-youden1950"/>
+    <w:bookmarkEnd w:id="127"/>
+    <w:bookmarkStart w:id="128" w:name="ref-youden1950"/>
     <w:p>
       <w:pPr>
         <w:pStyle w:val="Bibliography"/>
@@ -18231,9 +18220,9 @@
         <w:t xml:space="preserve">3 (1): 32–35.</w:t>
       </w:r>
     </w:p>
-    <w:bookmarkEnd w:id="139"/>
-    <w:bookmarkEnd w:id="140"/>
-    <w:bookmarkEnd w:id="141"/>
+    <w:bookmarkEnd w:id="128"/>
+    <w:bookmarkEnd w:id="129"/>
+    <w:bookmarkEnd w:id="130"/>
     <w:sectPr>
       <w:footnotePr>
         <w:numRestart w:val="eachSect"/>
@@ -18582,10 +18571,10 @@
   <w:docDefaults>
     <w:rPrDefault>
       <w:rPr>
-        <w:rFonts w:asciiTheme="minorHAnsi" w:cstheme="minorBidi" w:eastAsiaTheme="minorHAnsi" w:hAnsiTheme="minorHAnsi"/>
+        <w:rFonts w:asciiTheme="minorHAnsi" w:cstheme="minorBidi" w:eastAsiaTheme="minorEastAsia" w:hAnsiTheme="minorHAnsi"/>
         <w:sz w:val="24"/>
         <w:szCs w:val="24"/>
-        <w:lang w:bidi="ar-SA" w:eastAsia="en-US" w:val="pl"/>
+        <w:lang w:bidi="ar-SA" w:eastAsia="zh-CN" w:val="pl"/>
       </w:rPr>
     </w:rPrDefault>
     <w:pPrDefault>
@@ -19126,13 +19115,6 @@
       </w:tblCellMar>
     </w:tblPr>
     <w:tblStylePr w:type="firstRow">
-      <w:tblPr>
-        <w:jc w:val="left"/>
-        <w:tblInd w:type="dxa" w:w="0"/>
-      </w:tblPr>
-      <w:trPr>
-        <w:jc w:val="left"/>
-      </w:trPr>
       <w:tcPr>
         <w:tcBorders>
           <w:bottom w:val="single"/>

</xml_diff>

<commit_message>
Auto sync z dom - 2026-06-21 00:07
</commit_message>
<xml_diff>
--- a/Praca_dyplomowa/praca_dyplomowa.docx
+++ b/Praca_dyplomowa/praca_dyplomowa.docx
@@ -39,7 +39,7 @@
         <w:br w:type="page"/>
       </w:r>
     </w:p>
-    <w:bookmarkStart w:id="9" w:name="streszczenie"/>
+    <w:bookmarkStart w:id="20" w:name="streszczenie"/>
     <w:p>
       <w:pPr>
         <w:pStyle w:val="Heading1"/>
@@ -121,8 +121,8 @@
         <w:br w:type="page"/>
       </w:r>
     </w:p>
-    <w:bookmarkEnd w:id="9"/>
-    <w:bookmarkStart w:id="13" w:name="wprowadzenie"/>
+    <w:bookmarkEnd w:id="20"/>
+    <w:bookmarkStart w:id="24" w:name="wprowadzenie"/>
     <w:p>
       <w:pPr>
         <w:pStyle w:val="Heading1"/>
@@ -131,7 +131,7 @@
         <w:t xml:space="preserve">Wprowadzenie</w:t>
       </w:r>
     </w:p>
-    <w:bookmarkStart w:id="10" w:name="Xbef39e353cf405a5f8b815f593e50b94b49cae3"/>
+    <w:bookmarkStart w:id="21" w:name="Xbef39e353cf405a5f8b815f593e50b94b49cae3"/>
     <w:p>
       <w:pPr>
         <w:pStyle w:val="Heading2"/>
@@ -349,7 +349,7 @@
           <w:rPr>
             <w:rStyle w:val="Hyperlink"/>
           </w:rPr>
-          <w:t xml:space="preserve">Grygiel et al. 2009</w:t>
+          <w:t xml:space="preserve">Grygiel, Rębisz, i Humenny 2009</w:t>
         </w:r>
       </w:hyperlink>
       <w:r>
@@ -384,8 +384,8 @@
         <w:br w:type="page"/>
       </w:r>
     </w:p>
-    <w:bookmarkEnd w:id="10"/>
-    <w:bookmarkStart w:id="11" w:name="cel-pracy"/>
+    <w:bookmarkEnd w:id="21"/>
+    <w:bookmarkStart w:id="22" w:name="cel-pracy"/>
     <w:p>
       <w:pPr>
         <w:pStyle w:val="Heading2"/>
@@ -430,7 +430,7 @@
           <w:rPr>
             <w:rStyle w:val="Hyperlink"/>
           </w:rPr>
-          <w:t xml:space="preserve">Koperwas et al. 2015</w:t>
+          <w:t xml:space="preserve">Koperwas i in. 2015</w:t>
         </w:r>
       </w:hyperlink>
       <w:r>
@@ -450,7 +450,7 @@
           <w:rPr>
             <w:rStyle w:val="Hyperlink"/>
           </w:rPr>
-          <w:t xml:space="preserve">Rybiński et al. 2018</w:t>
+          <w:t xml:space="preserve">Rybiński i in. 2018</w:t>
         </w:r>
       </w:hyperlink>
       <w:r>
@@ -549,8 +549,8 @@
         <w:br w:type="page"/>
       </w:r>
     </w:p>
-    <w:bookmarkEnd w:id="11"/>
-    <w:bookmarkStart w:id="12" w:name="pytania-badawcze"/>
+    <w:bookmarkEnd w:id="22"/>
+    <w:bookmarkStart w:id="23" w:name="pytania-badawcze"/>
     <w:p>
       <w:pPr>
         <w:pStyle w:val="Heading2"/>
@@ -631,9 +631,9 @@
         <w:t xml:space="preserve">Czy sieć współautorstwa ma charakter głównie wewnątrzuczelniany, czy widoczne są także wspólnoty międzyuczelniane?</w:t>
       </w:r>
     </w:p>
-    <w:bookmarkEnd w:id="12"/>
-    <w:bookmarkEnd w:id="13"/>
-    <w:bookmarkStart w:id="24" w:name="materiał-i-metodyka"/>
+    <w:bookmarkEnd w:id="23"/>
+    <w:bookmarkEnd w:id="24"/>
+    <w:bookmarkStart w:id="35" w:name="materiał-i-metodyka"/>
     <w:p>
       <w:pPr>
         <w:pStyle w:val="Heading1"/>
@@ -642,7 +642,7 @@
         <w:t xml:space="preserve">Materiał i metodyka</w:t>
       </w:r>
     </w:p>
-    <w:bookmarkStart w:id="14" w:name="źródła-danych"/>
+    <w:bookmarkStart w:id="25" w:name="źródła-danych"/>
     <w:p>
       <w:pPr>
         <w:pStyle w:val="Heading2"/>
@@ -771,7 +771,7 @@
           <w:rPr>
             <w:rStyle w:val="Hyperlink"/>
           </w:rPr>
-          <w:t xml:space="preserve">Priem et al. 2022</w:t>
+          <w:t xml:space="preserve">Priem, Piwowar, i Orr 2022</w:t>
         </w:r>
       </w:hyperlink>
       <w:r>
@@ -827,19 +827,7 @@
           <w:rPr>
             <w:rStyle w:val="Hyperlink"/>
           </w:rPr>
-          <w:t xml:space="preserve">Hicks et al.</w:t>
-        </w:r>
-        <w:r>
-          <w:rPr>
-            <w:rStyle w:val="Hyperlink"/>
-          </w:rPr>
-          <w:t xml:space="preserve"> </w:t>
-        </w:r>
-        <w:r>
-          <w:rPr>
-            <w:rStyle w:val="Hyperlink"/>
-          </w:rPr>
-          <w:t xml:space="preserve">2015</w:t>
+          <w:t xml:space="preserve">Hicks i in. 2015</w:t>
         </w:r>
       </w:hyperlink>
       <w:r>
@@ -877,8 +865,8 @@
         <w:t xml:space="preserve">Wskaźniki wykorzystane w tej pracy wybrano dlatego, że są dostępne w porównywalnej formie dla badanych uczelni i pozwalają opisać profil bibliometryczny naukowca.</w:t>
       </w:r>
     </w:p>
-    <w:bookmarkEnd w:id="14"/>
-    <w:bookmarkStart w:id="19" w:name="procedura-pozyskania-danych"/>
+    <w:bookmarkEnd w:id="25"/>
+    <w:bookmarkStart w:id="30" w:name="procedura-pozyskania-danych"/>
     <w:p>
       <w:pPr>
         <w:pStyle w:val="Heading2"/>
@@ -964,7 +952,7 @@
           <w:rPr>
             <w:rStyle w:val="Hyperlink"/>
           </w:rPr>
-          <w:t xml:space="preserve">Aria et al. 2024</w:t>
+          <w:t xml:space="preserve">Aria i in. 2024</w:t>
         </w:r>
       </w:hyperlink>
       <w:r>
@@ -994,17 +982,17 @@
     <w:tbl>
       <w:tblPr>
         <w:tblStyle w:val="Table"/>
-        <w:tblW w:type="dxa" w:w="9638"/>
-        <w:tblLayout w:type="autofit"/>
+        <w:tblW w:type="pct" w:w="5000"/>
+        <w:tblLayout w:type="fixed"/>
         <w:tblLook w:firstRow="0" w:lastRow="0" w:firstColumn="0" w:lastColumn="0" w:noHBand="0" w:noVBand="0" w:val="0000"/>
       </w:tblPr>
       <w:tblGrid>
-        <w:gridCol w:w="9638"/>
+        <w:gridCol w:w="7920"/>
       </w:tblGrid>
       <w:tr>
         <w:tc>
           <w:tcPr/>
-          <w:bookmarkStart w:id="18" w:name="fig-pipeline"/>
+          <w:bookmarkStart w:id="29" w:name="fig-pipeline"/>
           <w:p>
             <w:pPr>
               <w:pStyle w:val="Compact"/>
@@ -1015,18 +1003,18 @@
                 <wp:inline>
                   <wp:extent cx="4480560" cy="7101092"/>
                   <wp:effectExtent b="0" l="0" r="0" t="0"/>
-                  <wp:docPr descr="" title="" id="16" name="Picture"/>
+                  <wp:docPr descr="" title="" id="27" name="Picture"/>
                   <a:graphic>
                     <a:graphicData uri="http://schemas.openxmlformats.org/drawingml/2006/picture">
                       <pic:pic>
                         <pic:nvPicPr>
-                          <pic:cNvPr descr="../Wykresy/praca/fig_00_pipeline.png" id="17" name="Picture"/>
+                          <pic:cNvPr descr="../Wykresy/praca/fig_00_pipeline.png" id="28" name="Picture"/>
                           <pic:cNvPicPr>
                             <a:picLocks noChangeArrowheads="1" noChangeAspect="1"/>
                           </pic:cNvPicPr>
                         </pic:nvPicPr>
                         <pic:blipFill>
-                          <a:blip r:embed="rId15"/>
+                          <a:blip r:embed="rId26"/>
                           <a:stretch>
                             <a:fillRect/>
                           </a:stretch>
@@ -1058,7 +1046,7 @@
               <w:jc w:val="center"/>
             </w:pPr>
             <w:pPr>
-              <w:jc w:val="left"/>
+              <w:jc w:val="start"/>
               <w:spacing w:before="200"/>
               <w:pStyle w:val="ImageCaption"/>
             </w:pPr>
@@ -1066,12 +1054,12 @@
               <w:t xml:space="preserve">Rysunek 1: Schemat przepływu danych: od czterech instancji Omega-PSIR przez scraping (Python) i przetwarzanie (R) z uzupełnieniem OpenAlex do zbioru analitycznego i warstw modelowania.</w:t>
             </w:r>
           </w:p>
-          <w:bookmarkEnd w:id="18"/>
+          <w:bookmarkEnd w:id="29"/>
         </w:tc>
       </w:tr>
     </w:tbl>
-    <w:bookmarkEnd w:id="19"/>
-    <w:bookmarkStart w:id="20" w:name="metody-analityczne"/>
+    <w:bookmarkEnd w:id="30"/>
+    <w:bookmarkStart w:id="31" w:name="metody-analityczne"/>
     <w:p>
       <w:pPr>
         <w:pStyle w:val="Heading2"/>
@@ -1381,7 +1369,7 @@
           <w:rPr>
             <w:rStyle w:val="Hyperlink"/>
           </w:rPr>
-          <w:t xml:space="preserve">Blondel et al. 2008</w:t>
+          <w:t xml:space="preserve">Blondel i in. 2008</w:t>
         </w:r>
       </w:hyperlink>
       <w:r>
@@ -1414,8 +1402,8 @@
         <w:t xml:space="preserve">wykorzystano do oceny, jak wyraźnie sieć dzieli się na wspólnoty. Dzięki temu można było sprawdzić, czy współpraca przebiega głównie w obrębie jednej uczelni, czy także między uczelniami.</w:t>
       </w:r>
     </w:p>
-    <w:bookmarkEnd w:id="20"/>
-    <w:bookmarkStart w:id="21" w:name="narzędzia-i-środowisko-obliczeniowe"/>
+    <w:bookmarkEnd w:id="31"/>
+    <w:bookmarkStart w:id="32" w:name="narzędzia-i-środowisko-obliczeniowe"/>
     <w:p>
       <w:pPr>
         <w:pStyle w:val="Heading2"/>
@@ -1440,8 +1428,8 @@
         <w:t xml:space="preserve">W pracy pomocniczo wykorzystano duże modele językowe (LLM): Claude (Anthropic), Codex (OpenAI) oraz Gemini (Google). Posłużyły one jako narzędzia wsparcia technicznego i redakcyjnego: do przeglądu i porządkowania kodu, wykrywania niespójności w tekście i danych, redakcyjnego dopracowania języka oraz krytycznej rewizji fragmentów pracy. Modele nie były źródłem danych empirycznych ani nie prowadziły samodzielnego wnioskowania statystycznego; wszystkie obliczenia, decyzje metodyczne i interpretacje wyników pozostają autorskie i wykonano je opisanymi skryptami Python i R. Informacja odnosi się do stanu z okresu przygotowania pracy (2026); wykorzystano model Claude Opus 4.8 (środowisko Claude Code), Codex oparty na modelu GPT-5.5 (OpenAI) oraz model Gemini 3.5 Flash (Gemini CLI, Google).</w:t>
       </w:r>
     </w:p>
-    <w:bookmarkEnd w:id="21"/>
-    <w:bookmarkStart w:id="23" w:name="dostępność-kodu-i-danych"/>
+    <w:bookmarkEnd w:id="32"/>
+    <w:bookmarkStart w:id="34" w:name="dostępność-kodu-i-danych"/>
     <w:p>
       <w:pPr>
         <w:pStyle w:val="Heading2"/>
@@ -1460,7 +1448,7 @@
       <w:r>
         <w:t xml:space="preserve"> </w:t>
       </w:r>
-      <w:hyperlink r:id="rId22">
+      <w:hyperlink r:id="rId33">
         <w:r>
           <w:rPr>
             <w:rStyle w:val="Hyperlink"/>
@@ -1480,9 +1468,9 @@
         <w:t xml:space="preserve">Wykorzystane dane pochodzą z publicznie dostępnych uczelnianych Baz Wiedzy (systemów CRIS Omega-PSIR) oraz z otwartej bazy OpenAlex i dotyczą wyłącznie działalności naukowej pracowników (dorobek publikacyjny, afiliacje, identyfikatory ORCID), czyli danych zawodowych jawnie udostępnionych przez same uczelnie. Nie obejmują one danych szczególnych kategorii w rozumieniu art. 9 RODO. Przetwarzania dokonano wyłącznie w celach naukowo-badawczych i w formie zagregowanej, w oparciu o prawnie uzasadniony interes administratora (art. 6 ust. 1 lit. f RODO) oraz z uwzględnieniem zasad przetwarzania danych do celów badań naukowych (art. 89 RODO); analiza nie służy ocenie ani profilowaniu poszczególnych osób.</w:t>
       </w:r>
     </w:p>
-    <w:bookmarkEnd w:id="23"/>
-    <w:bookmarkEnd w:id="24"/>
-    <w:bookmarkStart w:id="80" w:name="wyniki"/>
+    <w:bookmarkEnd w:id="34"/>
+    <w:bookmarkEnd w:id="35"/>
+    <w:bookmarkStart w:id="91" w:name="wyniki"/>
     <w:p>
       <w:pPr>
         <w:pStyle w:val="Heading1"/>
@@ -1491,7 +1479,7 @@
         <w:t xml:space="preserve">Wyniki</w:t>
       </w:r>
     </w:p>
-    <w:bookmarkStart w:id="26" w:name="charakterystyka-próby"/>
+    <w:bookmarkStart w:id="37" w:name="charakterystyka-próby"/>
     <w:p>
       <w:pPr>
         <w:pStyle w:val="Heading2"/>
@@ -1603,23 +1591,23 @@
     <w:tbl>
       <w:tblPr>
         <w:tblStyle w:val="Table"/>
-        <w:tblW w:type="dxa" w:w="9638"/>
-        <w:tblLayout w:type="autofit"/>
+        <w:tblW w:type="pct" w:w="5000"/>
+        <w:tblLayout w:type="fixed"/>
         <w:tblLook w:firstRow="0" w:lastRow="0" w:firstColumn="0" w:lastColumn="0" w:noHBand="0" w:noVBand="0" w:val="0000"/>
       </w:tblPr>
       <w:tblGrid>
-        <w:gridCol w:w="9638"/>
+        <w:gridCol w:w="7920"/>
       </w:tblGrid>
       <w:tr>
         <w:tc>
           <w:tcPr/>
-          <w:bookmarkStart w:id="25" w:name="tbl-proba"/>
+          <w:bookmarkStart w:id="36" w:name="tbl-proba"/>
           <w:p>
             <w:pPr>
               <w:jc w:val="center"/>
             </w:pPr>
             <w:pPr>
-              <w:jc w:val="left"/>
+              <w:jc w:val="start"/>
               <w:spacing w:before="200"/>
               <w:pStyle w:val="ImageCaption"/>
             </w:pPr>
@@ -1629,28 +1617,29 @@
           </w:p>
           <w:tbl xmlns:w="http://schemas.openxmlformats.org/wordprocessingml/2006/main" xmlns:r="http://schemas.openxmlformats.org/officeDocument/2006/relationships" xmlns:w14="http://schemas.microsoft.com/office/word/2010/wordml" xmlns:wp="http://schemas.openxmlformats.org/drawingml/2006/wordprocessingDrawing" xmlns:a="http://schemas.openxmlformats.org/drawingml/2006/main" xmlns:pic="http://schemas.openxmlformats.org/drawingml/2006/picture">
             <w:tblPr>
-              <w:tblLayout w:type="autofit"/>
+              <w:tblLayout w:type="fixed"/>
               <w:jc w:val="center"/>
               <w:tblLook w:firstRow="1" w:lastRow="0" w:firstColumn="0" w:lastColumn="0" w:noHBand="0" w:noVBand="1"/>
             </w:tblPr>
             <w:tblGrid>
-              <w:gridCol w:w="966"/>
-              <w:gridCol w:w="654"/>
-              <w:gridCol w:w="514"/>
-              <w:gridCol w:w="903"/>
-              <w:gridCol w:w="903"/>
-              <w:gridCol w:w="903"/>
-              <w:gridCol w:w="903"/>
-              <w:gridCol w:w="1183"/>
-              <w:gridCol w:w="997"/>
-              <w:gridCol w:w="810"/>
-              <w:gridCol w:w="902"/>
+              <w:gridCol w:w="893"/>
+              <w:gridCol w:w="605"/>
+              <w:gridCol w:w="475"/>
+              <w:gridCol w:w="835"/>
+              <w:gridCol w:w="835"/>
+              <w:gridCol w:w="835"/>
+              <w:gridCol w:w="835"/>
+              <w:gridCol w:w="1094"/>
+              <w:gridCol w:w="922"/>
+              <w:gridCol w:w="749"/>
+              <w:gridCol w:w="835"/>
             </w:tblGrid>
             <w:tr>
               <w:trPr>
                 <w:trHeight w:val="360" w:hRule="auto"/>
                 <w:tblHeader/>
               </w:trPr>
+              header1
               <w:tc>
                 <w:tcPr>
                   <w:tcBorders>
@@ -2250,6 +2239,7 @@
               <w:trPr>
                 <w:trHeight w:val="360" w:hRule="auto"/>
               </w:trPr>
+              body1
               <w:tc>
                 <w:tcPr>
                   <w:tcBorders>
@@ -2849,6 +2839,7 @@
               <w:trPr>
                 <w:trHeight w:val="360" w:hRule="auto"/>
               </w:trPr>
+              body2
               <w:tc>
                 <w:tcPr>
                   <w:tcBorders>
@@ -3448,6 +3439,7 @@
               <w:trPr>
                 <w:trHeight w:val="360" w:hRule="auto"/>
               </w:trPr>
+              body3
               <w:tc>
                 <w:tcPr>
                   <w:tcBorders>
@@ -4047,6 +4039,7 @@
               <w:trPr>
                 <w:trHeight w:val="360" w:hRule="auto"/>
               </w:trPr>
+              body4
               <w:tc>
                 <w:tcPr>
                   <w:tcBorders>
@@ -4646,6 +4639,7 @@
               <w:trPr>
                 <w:trHeight w:val="360" w:hRule="auto"/>
               </w:trPr>
+              body5
               <w:tc>
                 <w:tcPr>
                   <w:tcBorders>
@@ -5245,6 +5239,7 @@
               <w:trPr>
                 <w:trHeight w:val="360" w:hRule="auto"/>
               </w:trPr>
+              footer1
               <w:tc>
                 <w:tcPr>
                   <w:gridSpan w:val="11"/>
@@ -5305,6 +5300,7 @@
               <w:trPr>
                 <w:trHeight w:val="360" w:hRule="auto"/>
               </w:trPr>
+              footer2
               <w:tc>
                 <w:tcPr>
                   <w:gridSpan w:val="11"/>
@@ -5362,7 +5358,7 @@
               </w:tc>
             </w:tr>
           </w:tbl>
-          <w:bookmarkEnd w:id="25"/>
+          <w:bookmarkEnd w:id="36"/>
         </w:tc>
       </w:tr>
     </w:tbl>
@@ -5388,8 +5384,8 @@
         <w:t xml:space="preserve">. Najmniejsza grupa liczyła 13 osób, więc możliwe było porównanie stanowisk między uczelniami.</w:t>
       </w:r>
     </w:p>
-    <w:bookmarkEnd w:id="26"/>
-    <w:bookmarkStart w:id="31" w:name="X02db023cedd07580e5dfe409dd487ced35067e3"/>
+    <w:bookmarkEnd w:id="37"/>
+    <w:bookmarkStart w:id="42" w:name="X02db023cedd07580e5dfe409dd487ced35067e3"/>
     <w:p>
       <w:pPr>
         <w:pStyle w:val="Heading2"/>
@@ -5452,17 +5448,17 @@
     <w:tbl>
       <w:tblPr>
         <w:tblStyle w:val="Table"/>
-        <w:tblW w:type="dxa" w:w="9638"/>
-        <w:tblLayout w:type="autofit"/>
+        <w:tblW w:type="pct" w:w="5000"/>
+        <w:tblLayout w:type="fixed"/>
         <w:tblLook w:firstRow="0" w:lastRow="0" w:firstColumn="0" w:lastColumn="0" w:noHBand="0" w:noVBand="0" w:val="0000"/>
       </w:tblPr>
       <w:tblGrid>
-        <w:gridCol w:w="9638"/>
+        <w:gridCol w:w="7920"/>
       </w:tblGrid>
       <w:tr>
         <w:tc>
           <w:tcPr/>
-          <w:bookmarkStart w:id="30" w:name="fig-korelacje"/>
+          <w:bookmarkStart w:id="41" w:name="fig-korelacje"/>
           <w:p>
             <w:pPr>
               <w:pStyle w:val="Compact"/>
@@ -5473,18 +5469,18 @@
                 <wp:inline>
                   <wp:extent cx="5334000" cy="4533900"/>
                   <wp:effectExtent b="0" l="0" r="0" t="0"/>
-                  <wp:docPr descr="" title="" id="28" name="Picture"/>
+                  <wp:docPr descr="" title="" id="39" name="Picture"/>
                   <a:graphic>
                     <a:graphicData uri="http://schemas.openxmlformats.org/drawingml/2006/picture">
                       <pic:pic>
                         <pic:nvPicPr>
-                          <pic:cNvPr descr="../Wykresy/praca/fig_01b_korelacje.png" id="29" name="Picture"/>
+                          <pic:cNvPr descr="../Wykresy/praca/fig_01b_korelacje.png" id="40" name="Picture"/>
                           <pic:cNvPicPr>
                             <a:picLocks noChangeArrowheads="1" noChangeAspect="1"/>
                           </pic:cNvPicPr>
                         </pic:nvPicPr>
                         <pic:blipFill>
-                          <a:blip r:embed="rId27"/>
+                          <a:blip r:embed="rId38"/>
                           <a:stretch>
                             <a:fillRect/>
                           </a:stretch>
@@ -5516,7 +5512,7 @@
               <w:jc w:val="center"/>
             </w:pPr>
             <w:pPr>
-              <w:jc w:val="left"/>
+              <w:jc w:val="start"/>
               <w:spacing w:before="200"/>
               <w:pStyle w:val="ImageCaption"/>
             </w:pPr>
@@ -5524,12 +5520,12 @@
               <w:t xml:space="preserve">Rysunek 2: Macierz korelacji Pearsona sześciu wskaźników bibliometrycznych. Wyraźny blok metryk skumulowanego wpływu (h-index, sumaryczny IF, punktacja MEiN; r 0,82–0,95) kontrastuje z liczbą publikacji, powiązaną z nim tylko umiarkowanie (r 0,36–0,44), oraz z IF na publikację, tworzącym odrębną oś jakości, ujemnie skorelowaną z liczbą publikacji.</w:t>
             </w:r>
           </w:p>
-          <w:bookmarkEnd w:id="30"/>
+          <w:bookmarkEnd w:id="41"/>
         </w:tc>
       </w:tr>
     </w:tbl>
-    <w:bookmarkEnd w:id="31"/>
-    <w:bookmarkStart w:id="49" w:name="X149f1659b4627f11ad84fb72c3cc10571fd0864"/>
+    <w:bookmarkEnd w:id="42"/>
+    <w:bookmarkStart w:id="60" w:name="X149f1659b4627f11ad84fb72c3cc10571fd0864"/>
     <w:p>
       <w:pPr>
         <w:pStyle w:val="Heading2"/>
@@ -5571,17 +5567,17 @@
     <w:tbl>
       <w:tblPr>
         <w:tblStyle w:val="Table"/>
-        <w:tblW w:type="dxa" w:w="9638"/>
-        <w:tblLayout w:type="autofit"/>
+        <w:tblW w:type="pct" w:w="5000"/>
+        <w:tblLayout w:type="fixed"/>
         <w:tblLook w:firstRow="0" w:lastRow="0" w:firstColumn="0" w:lastColumn="0" w:noHBand="0" w:noVBand="0" w:val="0000"/>
       </w:tblPr>
       <w:tblGrid>
-        <w:gridCol w:w="9638"/>
+        <w:gridCol w:w="7920"/>
       </w:tblGrid>
       <w:tr>
         <w:tc>
           <w:tcPr/>
-          <w:bookmarkStart w:id="35" w:name="fig-rozklady"/>
+          <w:bookmarkStart w:id="46" w:name="fig-rozklady"/>
           <w:p>
             <w:pPr>
               <w:pStyle w:val="Compact"/>
@@ -5592,18 +5588,18 @@
                 <wp:inline>
                   <wp:extent cx="5334000" cy="3081866"/>
                   <wp:effectExtent b="0" l="0" r="0" t="0"/>
-                  <wp:docPr descr="" title="" id="33" name="Picture"/>
+                  <wp:docPr descr="" title="" id="44" name="Picture"/>
                   <a:graphic>
                     <a:graphicData uri="http://schemas.openxmlformats.org/drawingml/2006/picture">
                       <pic:pic>
                         <pic:nvPicPr>
-                          <pic:cNvPr descr="../Wykresy/praca/fig_01c_rozklady.png" id="34" name="Picture"/>
+                          <pic:cNvPr descr="../Wykresy/praca/fig_01c_rozklady.png" id="45" name="Picture"/>
                           <pic:cNvPicPr>
                             <a:picLocks noChangeArrowheads="1" noChangeAspect="1"/>
                           </pic:cNvPicPr>
                         </pic:nvPicPr>
                         <pic:blipFill>
-                          <a:blip r:embed="rId32"/>
+                          <a:blip r:embed="rId43"/>
                           <a:stretch>
                             <a:fillRect/>
                           </a:stretch>
@@ -5635,7 +5631,7 @@
               <w:jc w:val="center"/>
             </w:pPr>
             <w:pPr>
-              <w:jc w:val="left"/>
+              <w:jc w:val="start"/>
               <w:spacing w:before="200"/>
               <w:pStyle w:val="ImageCaption"/>
             </w:pPr>
@@ -5643,7 +5639,7 @@
               <w:t xml:space="preserve">Rysunek 3: Rozkłady (gęstości jądrowe) sześciu wskaźników bibliometrycznych w całej próbie. Przewaga długich prawych ogonów i położenie mediany (czerwona linia przerywana) poniżej średniej potwierdzają silną prawoskośność, uzasadniającą wybór testów nieparametrycznych.</w:t>
             </w:r>
           </w:p>
-          <w:bookmarkEnd w:id="35"/>
+          <w:bookmarkEnd w:id="46"/>
         </w:tc>
       </w:tr>
     </w:tbl>
@@ -5729,17 +5725,17 @@
     <w:tbl>
       <w:tblPr>
         <w:tblStyle w:val="Table"/>
-        <w:tblW w:type="dxa" w:w="9638"/>
-        <w:tblLayout w:type="autofit"/>
+        <w:tblW w:type="pct" w:w="5000"/>
+        <w:tblLayout w:type="fixed"/>
         <w:tblLook w:firstRow="0" w:lastRow="0" w:firstColumn="0" w:lastColumn="0" w:noHBand="0" w:noVBand="0" w:val="0000"/>
       </w:tblPr>
       <w:tblGrid>
-        <w:gridCol w:w="9638"/>
+        <w:gridCol w:w="7920"/>
       </w:tblGrid>
       <w:tr>
         <w:tc>
           <w:tcPr/>
-          <w:bookmarkStart w:id="39" w:name="fig-hindex"/>
+          <w:bookmarkStart w:id="50" w:name="fig-hindex"/>
           <w:p>
             <w:pPr>
               <w:pStyle w:val="Compact"/>
@@ -5750,18 +5746,18 @@
                 <wp:inline>
                   <wp:extent cx="5334000" cy="3388658"/>
                   <wp:effectExtent b="0" l="0" r="0" t="0"/>
-                  <wp:docPr descr="" title="" id="37" name="Picture"/>
+                  <wp:docPr descr="" title="" id="48" name="Picture"/>
                   <a:graphic>
                     <a:graphicData uri="http://schemas.openxmlformats.org/drawingml/2006/picture">
                       <pic:pic>
                         <pic:nvPicPr>
-                          <pic:cNvPr descr="../Wykresy/praca/fig_02a_hindex.png" id="38" name="Picture"/>
+                          <pic:cNvPr descr="../Wykresy/praca/fig_02a_hindex.png" id="49" name="Picture"/>
                           <pic:cNvPicPr>
                             <a:picLocks noChangeArrowheads="1" noChangeAspect="1"/>
                           </pic:cNvPicPr>
                         </pic:nvPicPr>
                         <pic:blipFill>
-                          <a:blip r:embed="rId36"/>
+                          <a:blip r:embed="rId47"/>
                           <a:stretch>
                             <a:fillRect/>
                           </a:stretch>
@@ -5793,7 +5789,7 @@
               <w:jc w:val="center"/>
             </w:pPr>
             <w:pPr>
-              <w:jc w:val="left"/>
+              <w:jc w:val="start"/>
               <w:spacing w:before="200"/>
               <w:pStyle w:val="ImageCaption"/>
             </w:pPr>
@@ -5801,7 +5797,7 @@
               <w:t xml:space="preserve">Rysunek 4: Wykres pudełkowy h-index (WoS) w dwuczynnikowym układzie uczelnia × stanowisko; oznaczenia grup jednorodnych (CLD) opisano w tekście powyżej.</w:t>
             </w:r>
           </w:p>
-          <w:bookmarkEnd w:id="39"/>
+          <w:bookmarkEnd w:id="50"/>
         </w:tc>
       </w:tr>
     </w:tbl>
@@ -5816,17 +5812,17 @@
     <w:tbl>
       <w:tblPr>
         <w:tblStyle w:val="Table"/>
-        <w:tblW w:type="dxa" w:w="9638"/>
-        <w:tblLayout w:type="autofit"/>
+        <w:tblW w:type="pct" w:w="5000"/>
+        <w:tblLayout w:type="fixed"/>
         <w:tblLook w:firstRow="0" w:lastRow="0" w:firstColumn="0" w:lastColumn="0" w:noHBand="0" w:noVBand="0" w:val="0000"/>
       </w:tblPr>
       <w:tblGrid>
-        <w:gridCol w:w="9638"/>
+        <w:gridCol w:w="7920"/>
       </w:tblGrid>
       <w:tr>
         <w:tc>
           <w:tcPr/>
-          <w:bookmarkStart w:id="43" w:name="fig-sumif"/>
+          <w:bookmarkStart w:id="54" w:name="fig-sumif"/>
           <w:p>
             <w:pPr>
               <w:pStyle w:val="Compact"/>
@@ -5837,18 +5833,18 @@
                 <wp:inline>
                   <wp:extent cx="5334000" cy="3388658"/>
                   <wp:effectExtent b="0" l="0" r="0" t="0"/>
-                  <wp:docPr descr="" title="" id="41" name="Picture"/>
+                  <wp:docPr descr="" title="" id="52" name="Picture"/>
                   <a:graphic>
                     <a:graphicData uri="http://schemas.openxmlformats.org/drawingml/2006/picture">
                       <pic:pic>
                         <pic:nvPicPr>
-                          <pic:cNvPr descr="../Wykresy/praca/fig_02b_sumif.png" id="42" name="Picture"/>
+                          <pic:cNvPr descr="../Wykresy/praca/fig_02b_sumif.png" id="53" name="Picture"/>
                           <pic:cNvPicPr>
                             <a:picLocks noChangeArrowheads="1" noChangeAspect="1"/>
                           </pic:cNvPicPr>
                         </pic:nvPicPr>
                         <pic:blipFill>
-                          <a:blip r:embed="rId40"/>
+                          <a:blip r:embed="rId51"/>
                           <a:stretch>
                             <a:fillRect/>
                           </a:stretch>
@@ -5880,7 +5876,7 @@
               <w:jc w:val="center"/>
             </w:pPr>
             <w:pPr>
-              <w:jc w:val="left"/>
+              <w:jc w:val="start"/>
               <w:spacing w:before="200"/>
               <w:pStyle w:val="ImageCaption"/>
             </w:pPr>
@@ -5888,7 +5884,7 @@
               <w:t xml:space="preserve">Rysunek 5: Wykres pudełkowy sumarycznego Impact Factor w dwuczynnikowym układzie uczelnia × stanowisko; oznaczenia grup jednorodnych (CLD) opisano w tekście powyżej.</w:t>
             </w:r>
           </w:p>
-          <w:bookmarkEnd w:id="43"/>
+          <w:bookmarkEnd w:id="54"/>
         </w:tc>
       </w:tr>
     </w:tbl>
@@ -5903,17 +5899,17 @@
     <w:tbl>
       <w:tblPr>
         <w:tblStyle w:val="Table"/>
-        <w:tblW w:type="dxa" w:w="9638"/>
-        <w:tblLayout w:type="autofit"/>
+        <w:tblW w:type="pct" w:w="5000"/>
+        <w:tblLayout w:type="fixed"/>
         <w:tblLook w:firstRow="0" w:lastRow="0" w:firstColumn="0" w:lastColumn="0" w:noHBand="0" w:noVBand="0" w:val="0000"/>
       </w:tblPr>
       <w:tblGrid>
-        <w:gridCol w:w="9638"/>
+        <w:gridCol w:w="7920"/>
       </w:tblGrid>
       <w:tr>
         <w:tc>
           <w:tcPr/>
-          <w:bookmarkStart w:id="47" w:name="fig-npub"/>
+          <w:bookmarkStart w:id="58" w:name="fig-npub"/>
           <w:p>
             <w:pPr>
               <w:pStyle w:val="Compact"/>
@@ -5924,18 +5920,18 @@
                 <wp:inline>
                   <wp:extent cx="5334000" cy="3388658"/>
                   <wp:effectExtent b="0" l="0" r="0" t="0"/>
-                  <wp:docPr descr="" title="" id="45" name="Picture"/>
+                  <wp:docPr descr="" title="" id="56" name="Picture"/>
                   <a:graphic>
                     <a:graphicData uri="http://schemas.openxmlformats.org/drawingml/2006/picture">
                       <pic:pic>
                         <pic:nvPicPr>
-                          <pic:cNvPr descr="../Wykresy/praca/fig_02c_npub.png" id="46" name="Picture"/>
+                          <pic:cNvPr descr="../Wykresy/praca/fig_02c_npub.png" id="57" name="Picture"/>
                           <pic:cNvPicPr>
                             <a:picLocks noChangeArrowheads="1" noChangeAspect="1"/>
                           </pic:cNvPicPr>
                         </pic:nvPicPr>
                         <pic:blipFill>
-                          <a:blip r:embed="rId44"/>
+                          <a:blip r:embed="rId55"/>
                           <a:stretch>
                             <a:fillRect/>
                           </a:stretch>
@@ -5967,7 +5963,7 @@
               <w:jc w:val="center"/>
             </w:pPr>
             <w:pPr>
-              <w:jc w:val="left"/>
+              <w:jc w:val="start"/>
               <w:spacing w:before="200"/>
               <w:pStyle w:val="ImageCaption"/>
             </w:pPr>
@@ -5975,7 +5971,7 @@
               <w:t xml:space="preserve">Rysunek 6: Wykres pudełkowy liczby publikacji w dwuczynnikowym układzie uczelnia × stanowisko; oznaczenia grup jednorodnych (CLD) opisano w tekście powyżej.</w:t>
             </w:r>
           </w:p>
-          <w:bookmarkEnd w:id="47"/>
+          <w:bookmarkEnd w:id="58"/>
         </w:tc>
       </w:tr>
     </w:tbl>
@@ -6028,23 +6024,23 @@
     <w:tbl>
       <w:tblPr>
         <w:tblStyle w:val="Table"/>
-        <w:tblW w:type="dxa" w:w="9638"/>
-        <w:tblLayout w:type="autofit"/>
+        <w:tblW w:type="pct" w:w="5000"/>
+        <w:tblLayout w:type="fixed"/>
         <w:tblLook w:firstRow="0" w:lastRow="0" w:firstColumn="0" w:lastColumn="0" w:noHBand="0" w:noVBand="0" w:val="0000"/>
       </w:tblPr>
       <w:tblGrid>
-        <w:gridCol w:w="9638"/>
+        <w:gridCol w:w="7920"/>
       </w:tblGrid>
       <w:tr>
         <w:tc>
           <w:tcPr/>
-          <w:bookmarkStart w:id="48" w:name="tbl-roznicowanie"/>
+          <w:bookmarkStart w:id="59" w:name="tbl-roznicowanie"/>
           <w:p>
             <w:pPr>
               <w:jc w:val="center"/>
             </w:pPr>
             <w:pPr>
-              <w:jc w:val="left"/>
+              <w:jc w:val="start"/>
               <w:spacing w:before="200"/>
               <w:pStyle w:val="ImageCaption"/>
             </w:pPr>
@@ -6054,22 +6050,23 @@
           </w:p>
           <w:tbl xmlns:w="http://schemas.openxmlformats.org/wordprocessingml/2006/main" xmlns:r="http://schemas.openxmlformats.org/officeDocument/2006/relationships" xmlns:w14="http://schemas.microsoft.com/office/word/2010/wordml" xmlns:wp="http://schemas.openxmlformats.org/drawingml/2006/wordprocessingDrawing" xmlns:a="http://schemas.openxmlformats.org/drawingml/2006/main" xmlns:pic="http://schemas.openxmlformats.org/drawingml/2006/picture">
             <w:tblPr>
-              <w:tblLayout w:type="autofit"/>
+              <w:tblLayout w:type="fixed"/>
               <w:jc w:val="center"/>
               <w:tblLook w:firstRow="1" w:lastRow="0" w:firstColumn="0" w:lastColumn="0" w:noHBand="0" w:noVBand="1"/>
             </w:tblPr>
             <w:tblGrid>
-              <w:gridCol w:w="3074"/>
-              <w:gridCol w:w="1579"/>
-              <w:gridCol w:w="1412"/>
-              <w:gridCol w:w="1828"/>
-              <w:gridCol w:w="1745"/>
+              <w:gridCol w:w="2664"/>
+              <w:gridCol w:w="1368"/>
+              <w:gridCol w:w="1224"/>
+              <w:gridCol w:w="1584"/>
+              <w:gridCol w:w="1512"/>
             </w:tblGrid>
             <w:tr>
               <w:trPr>
                 <w:trHeight w:val="360" w:hRule="auto"/>
                 <w:tblHeader/>
               </w:trPr>
+              header1
               <w:tc>
                 <w:tcPr>
                   <w:tcBorders>
@@ -6345,6 +6342,7 @@
               <w:trPr>
                 <w:trHeight w:val="360" w:hRule="auto"/>
               </w:trPr>
+              body1
               <w:tc>
                 <w:tcPr>
                   <w:tcBorders>
@@ -6620,6 +6618,7 @@
               <w:trPr>
                 <w:trHeight w:val="360" w:hRule="auto"/>
               </w:trPr>
+              body2
               <w:tc>
                 <w:tcPr>
                   <w:tcBorders>
@@ -6895,6 +6894,7 @@
               <w:trPr>
                 <w:trHeight w:val="360" w:hRule="auto"/>
               </w:trPr>
+              body3
               <w:tc>
                 <w:tcPr>
                   <w:tcBorders>
@@ -7170,6 +7170,7 @@
               <w:trPr>
                 <w:trHeight w:val="360" w:hRule="auto"/>
               </w:trPr>
+              body4
               <w:tc>
                 <w:tcPr>
                   <w:tcBorders>
@@ -7445,6 +7446,7 @@
               <w:trPr>
                 <w:trHeight w:val="360" w:hRule="auto"/>
               </w:trPr>
+              body5
               <w:tc>
                 <w:tcPr>
                   <w:tcBorders>
@@ -7720,6 +7722,7 @@
               <w:trPr>
                 <w:trHeight w:val="360" w:hRule="auto"/>
               </w:trPr>
+              body6
               <w:tc>
                 <w:tcPr>
                   <w:tcBorders>
@@ -7995,6 +7998,7 @@
               <w:trPr>
                 <w:trHeight w:val="360" w:hRule="auto"/>
               </w:trPr>
+              footer1
               <w:tc>
                 <w:tcPr>
                   <w:gridSpan w:val="5"/>
@@ -8052,7 +8056,7 @@
               </w:tc>
             </w:tr>
           </w:tbl>
-          <w:bookmarkEnd w:id="48"/>
+          <w:bookmarkEnd w:id="59"/>
         </w:tc>
       </w:tr>
     </w:tbl>
@@ -8080,8 +8084,8 @@
         <w:t xml:space="preserve">Podsumowując, wraz z wyższym stanowiskiem rosną wartości większości wskaźników bibliometrycznych. Zależność ta była istotna statystycznie dla pięciu z sześciu analizowanych metryk.</w:t>
       </w:r>
     </w:p>
-    <w:bookmarkEnd w:id="49"/>
-    <w:bookmarkStart w:id="57" w:name="X88ab428eb81e048ab5c69c902d08d12ccb60c6c"/>
+    <w:bookmarkEnd w:id="60"/>
+    <w:bookmarkStart w:id="68" w:name="X88ab428eb81e048ab5c69c902d08d12ccb60c6c"/>
     <w:p>
       <w:pPr>
         <w:pStyle w:val="Heading2"/>
@@ -8165,17 +8169,17 @@
     <w:tbl>
       <w:tblPr>
         <w:tblStyle w:val="Table"/>
-        <w:tblW w:type="dxa" w:w="9638"/>
-        <w:tblLayout w:type="autofit"/>
+        <w:tblW w:type="pct" w:w="5000"/>
+        <w:tblLayout w:type="fixed"/>
         <w:tblLook w:firstRow="0" w:lastRow="0" w:firstColumn="0" w:lastColumn="0" w:noHBand="0" w:noVBand="0" w:val="0000"/>
       </w:tblPr>
       <w:tblGrid>
-        <w:gridCol w:w="9638"/>
+        <w:gridCol w:w="7920"/>
       </w:tblGrid>
       <w:tr>
         <w:tc>
           <w:tcPr/>
-          <w:bookmarkStart w:id="53" w:name="fig-klastry"/>
+          <w:bookmarkStart w:id="64" w:name="fig-klastry"/>
           <w:p>
             <w:pPr>
               <w:pStyle w:val="Compact"/>
@@ -8186,18 +8190,18 @@
                 <wp:inline>
                   <wp:extent cx="5334000" cy="4000499"/>
                   <wp:effectExtent b="0" l="0" r="0" t="0"/>
-                  <wp:docPr descr="" title="" id="51" name="Picture"/>
+                  <wp:docPr descr="" title="" id="62" name="Picture"/>
                   <a:graphic>
                     <a:graphicData uri="http://schemas.openxmlformats.org/drawingml/2006/picture">
                       <pic:pic>
                         <pic:nvPicPr>
-                          <pic:cNvPr descr="../Wykresy/praca/fig_03a_klastry.png" id="52" name="Picture"/>
+                          <pic:cNvPr descr="../Wykresy/praca/fig_03a_klastry.png" id="63" name="Picture"/>
                           <pic:cNvPicPr>
                             <a:picLocks noChangeArrowheads="1" noChangeAspect="1"/>
                           </pic:cNvPicPr>
                         </pic:nvPicPr>
                         <pic:blipFill>
-                          <a:blip r:embed="rId50"/>
+                          <a:blip r:embed="rId61"/>
                           <a:stretch>
                             <a:fillRect/>
                           </a:stretch>
@@ -8229,7 +8233,7 @@
               <w:jc w:val="center"/>
             </w:pPr>
             <w:pPr>
-              <w:jc w:val="left"/>
+              <w:jc w:val="start"/>
               <w:spacing w:before="200"/>
               <w:pStyle w:val="ImageCaption"/>
             </w:pPr>
@@ -8237,7 +8241,7 @@
               <w:t xml:space="preserve">Rysunek 7: Klastrowanie k-means w przestrzeni dwóch pierwszych składowych głównych (PCA).</w:t>
             </w:r>
           </w:p>
-          <w:bookmarkEnd w:id="53"/>
+          <w:bookmarkEnd w:id="64"/>
         </w:tc>
       </w:tr>
     </w:tbl>
@@ -8295,23 +8299,23 @@
     <w:tbl>
       <w:tblPr>
         <w:tblStyle w:val="Table"/>
-        <w:tblW w:type="dxa" w:w="9638"/>
-        <w:tblLayout w:type="autofit"/>
+        <w:tblW w:type="pct" w:w="5000"/>
+        <w:tblLayout w:type="fixed"/>
         <w:tblLook w:firstRow="0" w:lastRow="0" w:firstColumn="0" w:lastColumn="0" w:noHBand="0" w:noVBand="0" w:val="0000"/>
       </w:tblPr>
       <w:tblGrid>
-        <w:gridCol w:w="9638"/>
+        <w:gridCol w:w="7920"/>
       </w:tblGrid>
       <w:tr>
         <w:tc>
           <w:tcPr/>
-          <w:bookmarkStart w:id="54" w:name="tbl-klastry2"/>
+          <w:bookmarkStart w:id="65" w:name="tbl-klastry2"/>
           <w:p>
             <w:pPr>
               <w:jc w:val="center"/>
             </w:pPr>
             <w:pPr>
-              <w:jc w:val="left"/>
+              <w:jc w:val="start"/>
               <w:spacing w:before="200"/>
               <w:pStyle w:val="ImageCaption"/>
             </w:pPr>
@@ -8321,23 +8325,24 @@
           </w:p>
           <w:tbl xmlns:w="http://schemas.openxmlformats.org/wordprocessingml/2006/main" xmlns:r="http://schemas.openxmlformats.org/officeDocument/2006/relationships" xmlns:w14="http://schemas.microsoft.com/office/word/2010/wordml" xmlns:wp="http://schemas.openxmlformats.org/drawingml/2006/wordprocessingDrawing" xmlns:a="http://schemas.openxmlformats.org/drawingml/2006/main" xmlns:pic="http://schemas.openxmlformats.org/drawingml/2006/picture">
             <w:tblPr>
-              <w:tblLayout w:type="autofit"/>
+              <w:tblLayout w:type="fixed"/>
               <w:jc w:val="center"/>
               <w:tblLook w:firstRow="1" w:lastRow="0" w:firstColumn="0" w:lastColumn="0" w:noHBand="0" w:noVBand="1"/>
             </w:tblPr>
             <w:tblGrid>
-              <w:gridCol w:w="2429"/>
-              <w:gridCol w:w="784"/>
-              <w:gridCol w:w="1489"/>
-              <w:gridCol w:w="1646"/>
-              <w:gridCol w:w="1646"/>
-              <w:gridCol w:w="1644"/>
+              <w:gridCol w:w="2232"/>
+              <w:gridCol w:w="720"/>
+              <w:gridCol w:w="1368"/>
+              <w:gridCol w:w="1512"/>
+              <w:gridCol w:w="1512"/>
+              <w:gridCol w:w="1512"/>
             </w:tblGrid>
             <w:tr>
               <w:trPr>
                 <w:trHeight w:val="360" w:hRule="auto"/>
                 <w:tblHeader/>
               </w:trPr>
+              header1
               <w:tc>
                 <w:tcPr>
                   <w:tcBorders>
@@ -8667,6 +8672,7 @@
               <w:trPr>
                 <w:trHeight w:val="360" w:hRule="auto"/>
               </w:trPr>
+              body1
               <w:tc>
                 <w:tcPr>
                   <w:tcBorders>
@@ -8996,6 +9002,7 @@
               <w:trPr>
                 <w:trHeight w:val="360" w:hRule="auto"/>
               </w:trPr>
+              body2
               <w:tc>
                 <w:tcPr>
                   <w:tcBorders>
@@ -9322,7 +9329,7 @@
               </w:tc>
             </w:tr>
           </w:tbl>
-          <w:bookmarkEnd w:id="54"/>
+          <w:bookmarkEnd w:id="65"/>
         </w:tc>
       </w:tr>
     </w:tbl>
@@ -9415,23 +9422,23 @@
     <w:tbl>
       <w:tblPr>
         <w:tblStyle w:val="Table"/>
-        <w:tblW w:type="dxa" w:w="9638"/>
-        <w:tblLayout w:type="autofit"/>
+        <w:tblW w:type="pct" w:w="5000"/>
+        <w:tblLayout w:type="fixed"/>
         <w:tblLook w:firstRow="0" w:lastRow="0" w:firstColumn="0" w:lastColumn="0" w:noHBand="0" w:noVBand="0" w:val="0000"/>
       </w:tblPr>
       <w:tblGrid>
-        <w:gridCol w:w="9638"/>
+        <w:gridCol w:w="7920"/>
       </w:tblGrid>
       <w:tr>
         <w:tc>
           <w:tcPr/>
-          <w:bookmarkStart w:id="55" w:name="tbl-replikacja"/>
+          <w:bookmarkStart w:id="66" w:name="tbl-replikacja"/>
           <w:p>
             <w:pPr>
               <w:jc w:val="center"/>
             </w:pPr>
             <w:pPr>
-              <w:jc w:val="left"/>
+              <w:jc w:val="start"/>
               <w:spacing w:before="200"/>
               <w:pStyle w:val="ImageCaption"/>
             </w:pPr>
@@ -9441,23 +9448,24 @@
           </w:p>
           <w:tbl xmlns:w="http://schemas.openxmlformats.org/wordprocessingml/2006/main" xmlns:r="http://schemas.openxmlformats.org/officeDocument/2006/relationships" xmlns:w14="http://schemas.microsoft.com/office/word/2010/wordml" xmlns:wp="http://schemas.openxmlformats.org/drawingml/2006/wordprocessingDrawing" xmlns:a="http://schemas.openxmlformats.org/drawingml/2006/main" xmlns:pic="http://schemas.openxmlformats.org/drawingml/2006/picture">
             <w:tblPr>
-              <w:tblLayout w:type="autofit"/>
+              <w:tblLayout w:type="fixed"/>
               <w:jc w:val="center"/>
               <w:tblLook w:firstRow="1" w:lastRow="0" w:firstColumn="0" w:lastColumn="0" w:noHBand="0" w:noVBand="1"/>
             </w:tblPr>
             <w:tblGrid>
-              <w:gridCol w:w="1501"/>
-              <w:gridCol w:w="1659"/>
-              <w:gridCol w:w="1501"/>
-              <w:gridCol w:w="1580"/>
-              <w:gridCol w:w="1738"/>
-              <w:gridCol w:w="1659"/>
+              <w:gridCol w:w="1368"/>
+              <w:gridCol w:w="1512"/>
+              <w:gridCol w:w="1368"/>
+              <w:gridCol w:w="1440"/>
+              <w:gridCol w:w="1584"/>
+              <w:gridCol w:w="1512"/>
             </w:tblGrid>
             <w:tr>
               <w:trPr>
                 <w:trHeight w:val="360" w:hRule="auto"/>
                 <w:tblHeader/>
               </w:trPr>
+              header1
               <w:tc>
                 <w:tcPr>
                   <w:tcBorders>
@@ -9787,6 +9795,7 @@
               <w:trPr>
                 <w:trHeight w:val="360" w:hRule="auto"/>
               </w:trPr>
+              body1
               <w:tc>
                 <w:tcPr>
                   <w:tcBorders>
@@ -10116,6 +10125,7 @@
               <w:trPr>
                 <w:trHeight w:val="360" w:hRule="auto"/>
               </w:trPr>
+              body2
               <w:tc>
                 <w:tcPr>
                   <w:tcBorders>
@@ -10445,6 +10455,7 @@
               <w:trPr>
                 <w:trHeight w:val="360" w:hRule="auto"/>
               </w:trPr>
+              body3
               <w:tc>
                 <w:tcPr>
                   <w:tcBorders>
@@ -10774,6 +10785,7 @@
               <w:trPr>
                 <w:trHeight w:val="360" w:hRule="auto"/>
               </w:trPr>
+              body4
               <w:tc>
                 <w:tcPr>
                   <w:tcBorders>
@@ -11103,6 +11115,7 @@
               <w:trPr>
                 <w:trHeight w:val="360" w:hRule="auto"/>
               </w:trPr>
+              body5
               <w:tc>
                 <w:tcPr>
                   <w:tcBorders>
@@ -11432,6 +11445,7 @@
               <w:trPr>
                 <w:trHeight w:val="360" w:hRule="auto"/>
               </w:trPr>
+              footer1
               <w:tc>
                 <w:tcPr>
                   <w:gridSpan w:val="6"/>
@@ -11492,6 +11506,7 @@
               <w:trPr>
                 <w:trHeight w:val="360" w:hRule="auto"/>
               </w:trPr>
+              footer2
               <w:tc>
                 <w:tcPr>
                   <w:gridSpan w:val="6"/>
@@ -11549,7 +11564,7 @@
               </w:tc>
             </w:tr>
           </w:tbl>
-          <w:bookmarkEnd w:id="55"/>
+          <w:bookmarkEnd w:id="66"/>
         </w:tc>
       </w:tr>
     </w:tbl>
@@ -11583,23 +11598,23 @@
     <w:tbl>
       <w:tblPr>
         <w:tblStyle w:val="Table"/>
-        <w:tblW w:type="dxa" w:w="9638"/>
-        <w:tblLayout w:type="autofit"/>
+        <w:tblW w:type="pct" w:w="5000"/>
+        <w:tblLayout w:type="fixed"/>
         <w:tblLook w:firstRow="0" w:lastRow="0" w:firstColumn="0" w:lastColumn="0" w:noHBand="0" w:noVBand="0" w:val="0000"/>
       </w:tblPr>
       <w:tblGrid>
-        <w:gridCol w:w="9638"/>
+        <w:gridCol w:w="7920"/>
       </w:tblGrid>
       <w:tr>
         <w:tc>
           <w:tcPr/>
-          <w:bookmarkStart w:id="56" w:name="tbl-klastry3"/>
+          <w:bookmarkStart w:id="67" w:name="tbl-klastry3"/>
           <w:p>
             <w:pPr>
               <w:jc w:val="center"/>
             </w:pPr>
             <w:pPr>
-              <w:jc w:val="left"/>
+              <w:jc w:val="start"/>
               <w:spacing w:before="200"/>
               <w:pStyle w:val="ImageCaption"/>
             </w:pPr>
@@ -11609,23 +11624,24 @@
           </w:p>
           <w:tbl xmlns:w="http://schemas.openxmlformats.org/wordprocessingml/2006/main" xmlns:r="http://schemas.openxmlformats.org/officeDocument/2006/relationships" xmlns:w14="http://schemas.microsoft.com/office/word/2010/wordml" xmlns:wp="http://schemas.openxmlformats.org/drawingml/2006/wordprocessingDrawing" xmlns:a="http://schemas.openxmlformats.org/drawingml/2006/main" xmlns:pic="http://schemas.openxmlformats.org/drawingml/2006/picture">
             <w:tblPr>
-              <w:tblLayout w:type="autofit"/>
+              <w:tblLayout w:type="fixed"/>
               <w:jc w:val="center"/>
               <w:tblLook w:firstRow="1" w:lastRow="0" w:firstColumn="0" w:lastColumn="0" w:noHBand="0" w:noVBand="1"/>
             </w:tblPr>
             <w:tblGrid>
-              <w:gridCol w:w="2907"/>
-              <w:gridCol w:w="612"/>
-              <w:gridCol w:w="1377"/>
-              <w:gridCol w:w="1377"/>
-              <w:gridCol w:w="1224"/>
-              <w:gridCol w:w="2141"/>
+              <w:gridCol w:w="2736"/>
+              <w:gridCol w:w="576"/>
+              <w:gridCol w:w="1296"/>
+              <w:gridCol w:w="1296"/>
+              <w:gridCol w:w="1152"/>
+              <w:gridCol w:w="2016"/>
             </w:tblGrid>
             <w:tr>
               <w:trPr>
                 <w:trHeight w:val="360" w:hRule="auto"/>
                 <w:tblHeader/>
               </w:trPr>
+              header1
               <w:tc>
                 <w:tcPr>
                   <w:tcBorders>
@@ -11955,6 +11971,7 @@
               <w:trPr>
                 <w:trHeight w:val="360" w:hRule="auto"/>
               </w:trPr>
+              body1
               <w:tc>
                 <w:tcPr>
                   <w:tcBorders>
@@ -12284,6 +12301,7 @@
               <w:trPr>
                 <w:trHeight w:val="360" w:hRule="auto"/>
               </w:trPr>
+              body2
               <w:tc>
                 <w:tcPr>
                   <w:tcBorders>
@@ -12613,6 +12631,7 @@
               <w:trPr>
                 <w:trHeight w:val="360" w:hRule="auto"/>
               </w:trPr>
+              body3
               <w:tc>
                 <w:tcPr>
                   <w:tcBorders>
@@ -12942,6 +12961,7 @@
               <w:trPr>
                 <w:trHeight w:val="360" w:hRule="auto"/>
               </w:trPr>
+              footer1
               <w:tc>
                 <w:tcPr>
                   <w:gridSpan w:val="6"/>
@@ -13002,6 +13022,7 @@
               <w:trPr>
                 <w:trHeight w:val="360" w:hRule="auto"/>
               </w:trPr>
+              footer2
               <w:tc>
                 <w:tcPr>
                   <w:gridSpan w:val="6"/>
@@ -13059,7 +13080,7 @@
               </w:tc>
             </w:tr>
           </w:tbl>
-          <w:bookmarkEnd w:id="56"/>
+          <w:bookmarkEnd w:id="67"/>
         </w:tc>
       </w:tr>
     </w:tbl>
@@ -13079,8 +13100,8 @@
         <w:t xml:space="preserve">Wynik ten pokazuje, że wysoki wpływ naukowy nie musi wynikać wyłącznie z długiego stażu i dużej liczby publikacji. Poza wielkością dorobku znaczenie ma także jego jakość: wysokie wartości wskaźników osiągają również młodsi badacze z mniejszą liczbą publikacji. Także w wariancie z trzema klastrami typologia pozostaje niezależna od uczelni (Craméra V = 0,10). Jej związek ze stanowiskiem jest natomiast słabszy niż w podziale na dwa klastry (V = 0,38), ponieważ profil jakościowy obejmuje osoby z różnych poziomów hierarchii akademickiej.</w:t>
       </w:r>
     </w:p>
-    <w:bookmarkEnd w:id="57"/>
-    <w:bookmarkStart w:id="69" w:name="Xbd5b45b451445d4809baed400770e4b8ffa7ad0"/>
+    <w:bookmarkEnd w:id="68"/>
+    <w:bookmarkStart w:id="80" w:name="Xbd5b45b451445d4809baed400770e4b8ffa7ad0"/>
     <w:p>
       <w:pPr>
         <w:pStyle w:val="Heading2"/>
@@ -13173,23 +13194,23 @@
     <w:tbl>
       <w:tblPr>
         <w:tblStyle w:val="Table"/>
-        <w:tblW w:type="dxa" w:w="9638"/>
-        <w:tblLayout w:type="autofit"/>
+        <w:tblW w:type="pct" w:w="5000"/>
+        <w:tblLayout w:type="fixed"/>
         <w:tblLook w:firstRow="0" w:lastRow="0" w:firstColumn="0" w:lastColumn="0" w:noHBand="0" w:noVBand="0" w:val="0000"/>
       </w:tblPr>
       <w:tblGrid>
-        <w:gridCol w:w="9638"/>
+        <w:gridCol w:w="7920"/>
       </w:tblGrid>
       <w:tr>
         <w:tc>
           <w:tcPr/>
-          <w:bookmarkStart w:id="58" w:name="tbl-modele"/>
+          <w:bookmarkStart w:id="69" w:name="tbl-modele"/>
           <w:p>
             <w:pPr>
               <w:jc w:val="center"/>
             </w:pPr>
             <w:pPr>
-              <w:jc w:val="left"/>
+              <w:jc w:val="start"/>
               <w:spacing w:before="200"/>
               <w:pStyle w:val="ImageCaption"/>
             </w:pPr>
@@ -13199,22 +13220,23 @@
           </w:p>
           <w:tbl xmlns:w="http://schemas.openxmlformats.org/wordprocessingml/2006/main" xmlns:r="http://schemas.openxmlformats.org/officeDocument/2006/relationships" xmlns:w14="http://schemas.microsoft.com/office/word/2010/wordml" xmlns:wp="http://schemas.openxmlformats.org/drawingml/2006/wordprocessingDrawing" xmlns:a="http://schemas.openxmlformats.org/drawingml/2006/main" xmlns:pic="http://schemas.openxmlformats.org/drawingml/2006/picture">
             <w:tblPr>
-              <w:tblLayout w:type="autofit"/>
+              <w:tblLayout w:type="fixed"/>
               <w:jc w:val="center"/>
               <w:tblLook w:firstRow="1" w:lastRow="0" w:firstColumn="0" w:lastColumn="0" w:noHBand="0" w:noVBand="1"/>
             </w:tblPr>
             <w:tblGrid>
-              <w:gridCol w:w="2570"/>
-              <w:gridCol w:w="1767"/>
-              <w:gridCol w:w="1767"/>
-              <w:gridCol w:w="1767"/>
-              <w:gridCol w:w="1767"/>
+              <w:gridCol w:w="2304"/>
+              <w:gridCol w:w="1584"/>
+              <w:gridCol w:w="1584"/>
+              <w:gridCol w:w="1584"/>
+              <w:gridCol w:w="1584"/>
             </w:tblGrid>
             <w:tr>
               <w:trPr>
                 <w:trHeight w:val="360" w:hRule="auto"/>
                 <w:tblHeader/>
               </w:trPr>
+              header1
               <w:tc>
                 <w:tcPr>
                   <w:tcBorders>
@@ -13490,6 +13512,7 @@
               <w:trPr>
                 <w:trHeight w:val="360" w:hRule="auto"/>
               </w:trPr>
+              body1
               <w:tc>
                 <w:tcPr>
                   <w:tcBorders>
@@ -13765,6 +13788,7 @@
               <w:trPr>
                 <w:trHeight w:val="360" w:hRule="auto"/>
               </w:trPr>
+              body2
               <w:tc>
                 <w:tcPr>
                   <w:tcBorders>
@@ -14040,6 +14064,7 @@
               <w:trPr>
                 <w:trHeight w:val="360" w:hRule="auto"/>
               </w:trPr>
+              footer1
               <w:tc>
                 <w:tcPr>
                   <w:gridSpan w:val="5"/>
@@ -14100,6 +14125,7 @@
               <w:trPr>
                 <w:trHeight w:val="360" w:hRule="auto"/>
               </w:trPr>
+              footer2
               <w:tc>
                 <w:tcPr>
                   <w:gridSpan w:val="5"/>
@@ -14157,7 +14183,7 @@
               </w:tc>
             </w:tr>
           </w:tbl>
-          <w:bookmarkEnd w:id="58"/>
+          <w:bookmarkEnd w:id="69"/>
         </w:tc>
       </w:tr>
     </w:tbl>
@@ -14235,23 +14261,23 @@
     <w:tbl>
       <w:tblPr>
         <w:tblStyle w:val="Table"/>
-        <w:tblW w:type="dxa" w:w="9638"/>
-        <w:tblLayout w:type="autofit"/>
+        <w:tblW w:type="pct" w:w="5000"/>
+        <w:tblLayout w:type="fixed"/>
         <w:tblLook w:firstRow="0" w:lastRow="0" w:firstColumn="0" w:lastColumn="0" w:noHBand="0" w:noVBand="0" w:val="0000"/>
       </w:tblPr>
       <w:tblGrid>
-        <w:gridCol w:w="9638"/>
+        <w:gridCol w:w="7920"/>
       </w:tblGrid>
       <w:tr>
         <w:tc>
           <w:tcPr/>
-          <w:bookmarkStart w:id="59" w:name="tbl-prog"/>
+          <w:bookmarkStart w:id="70" w:name="tbl-prog"/>
           <w:p>
             <w:pPr>
               <w:jc w:val="center"/>
             </w:pPr>
             <w:pPr>
-              <w:jc w:val="left"/>
+              <w:jc w:val="start"/>
               <w:spacing w:before="200"/>
               <w:pStyle w:val="ImageCaption"/>
             </w:pPr>
@@ -14261,22 +14287,23 @@
           </w:p>
           <w:tbl xmlns:w="http://schemas.openxmlformats.org/wordprocessingml/2006/main" xmlns:r="http://schemas.openxmlformats.org/officeDocument/2006/relationships" xmlns:w14="http://schemas.microsoft.com/office/word/2010/wordml" xmlns:wp="http://schemas.openxmlformats.org/drawingml/2006/wordprocessingDrawing" xmlns:a="http://schemas.openxmlformats.org/drawingml/2006/main" xmlns:pic="http://schemas.openxmlformats.org/drawingml/2006/picture">
             <w:tblPr>
-              <w:tblLayout w:type="autofit"/>
+              <w:tblLayout w:type="fixed"/>
               <w:jc w:val="center"/>
               <w:tblLook w:firstRow="1" w:lastRow="0" w:firstColumn="0" w:lastColumn="0" w:noHBand="0" w:noVBand="1"/>
             </w:tblPr>
             <w:tblGrid>
-              <w:gridCol w:w="2923"/>
-              <w:gridCol w:w="1422"/>
-              <w:gridCol w:w="1580"/>
-              <w:gridCol w:w="1343"/>
-              <w:gridCol w:w="2370"/>
+              <w:gridCol w:w="2664"/>
+              <w:gridCol w:w="1296"/>
+              <w:gridCol w:w="1440"/>
+              <w:gridCol w:w="1224"/>
+              <w:gridCol w:w="2160"/>
             </w:tblGrid>
             <w:tr>
               <w:trPr>
                 <w:trHeight w:val="360" w:hRule="auto"/>
                 <w:tblHeader/>
               </w:trPr>
+              header1
               <w:tc>
                 <w:tcPr>
                   <w:tcBorders>
@@ -14552,6 +14579,7 @@
               <w:trPr>
                 <w:trHeight w:val="360" w:hRule="auto"/>
               </w:trPr>
+              body1
               <w:tc>
                 <w:tcPr>
                   <w:tcBorders>
@@ -14827,6 +14855,7 @@
               <w:trPr>
                 <w:trHeight w:val="360" w:hRule="auto"/>
               </w:trPr>
+              body2
               <w:tc>
                 <w:tcPr>
                   <w:tcBorders>
@@ -15102,6 +15131,7 @@
               <w:trPr>
                 <w:trHeight w:val="360" w:hRule="auto"/>
               </w:trPr>
+              footer1
               <w:tc>
                 <w:tcPr>
                   <w:gridSpan w:val="5"/>
@@ -15162,6 +15192,7 @@
               <w:trPr>
                 <w:trHeight w:val="360" w:hRule="auto"/>
               </w:trPr>
+              footer2
               <w:tc>
                 <w:tcPr>
                   <w:gridSpan w:val="5"/>
@@ -15219,7 +15250,7 @@
               </w:tc>
             </w:tr>
           </w:tbl>
-          <w:bookmarkEnd w:id="59"/>
+          <w:bookmarkEnd w:id="70"/>
         </w:tc>
       </w:tr>
     </w:tbl>
@@ -15264,17 +15295,17 @@
     <w:tbl>
       <w:tblPr>
         <w:tblStyle w:val="Table"/>
-        <w:tblW w:type="dxa" w:w="9638"/>
-        <w:tblLayout w:type="autofit"/>
+        <w:tblW w:type="pct" w:w="5000"/>
+        <w:tblLayout w:type="fixed"/>
         <w:tblLook w:firstRow="0" w:lastRow="0" w:firstColumn="0" w:lastColumn="0" w:noHBand="0" w:noVBand="0" w:val="0000"/>
       </w:tblPr>
       <w:tblGrid>
-        <w:gridCol w:w="9638"/>
+        <w:gridCol w:w="7920"/>
       </w:tblGrid>
       <w:tr>
         <w:tc>
           <w:tcPr/>
-          <w:bookmarkStart w:id="63" w:name="fig-waznosc"/>
+          <w:bookmarkStart w:id="74" w:name="fig-waznosc"/>
           <w:p>
             <w:pPr>
               <w:pStyle w:val="Compact"/>
@@ -15285,18 +15316,18 @@
                 <wp:inline>
                   <wp:extent cx="5334000" cy="3006436"/>
                   <wp:effectExtent b="0" l="0" r="0" t="0"/>
-                  <wp:docPr descr="" title="" id="61" name="Picture"/>
+                  <wp:docPr descr="" title="" id="72" name="Picture"/>
                   <a:graphic>
                     <a:graphicData uri="http://schemas.openxmlformats.org/drawingml/2006/picture">
                       <pic:pic>
                         <pic:nvPicPr>
-                          <pic:cNvPr descr="../Wykresy/praca/fig_04b_waznosc.png" id="62" name="Picture"/>
+                          <pic:cNvPr descr="../Wykresy/praca/fig_04b_waznosc.png" id="73" name="Picture"/>
                           <pic:cNvPicPr>
                             <a:picLocks noChangeArrowheads="1" noChangeAspect="1"/>
                           </pic:cNvPicPr>
                         </pic:nvPicPr>
                         <pic:blipFill>
-                          <a:blip r:embed="rId60"/>
+                          <a:blip r:embed="rId71"/>
                           <a:stretch>
                             <a:fillRect/>
                           </a:stretch>
@@ -15328,7 +15359,7 @@
               <w:jc w:val="center"/>
             </w:pPr>
             <w:pPr>
-              <w:jc w:val="left"/>
+              <w:jc w:val="start"/>
               <w:spacing w:before="200"/>
               <w:pStyle w:val="ImageCaption"/>
             </w:pPr>
@@ -15336,7 +15367,7 @@
               <w:t xml:space="preserve">Rysunek 8: Najważniejsze predyktory wysokiego wpływu publikacyjnego w modelu Random Forest (ważność permutacyjna). Kolor oznacza kategorię cechy: produktywność, współpraca i cytowania oraz cechy formalne (uczelnia, stanowisko).</w:t>
             </w:r>
           </w:p>
-          <w:bookmarkEnd w:id="63"/>
+          <w:bookmarkEnd w:id="74"/>
         </w:tc>
       </w:tr>
     </w:tbl>
@@ -15348,7 +15379,7 @@
         <w:t xml:space="preserve">W odpowiedzi na pytanie 3 wyniki pokazują, że wysoki wpływ naukowy można przewidywać na podstawie cech badacza, takich jak stanowisko, uczelnia, liczba publikacji i współpraca naukowa. Model osiągnął bardzo dobrą zdolność rozróżniania osób o wysokim i niższym wpływie naukowym (AUC ok. 0,97).</w:t>
       </w:r>
     </w:p>
-    <w:bookmarkStart w:id="68" w:name="X799efba27fc6d09a0b5025f13f38b8866705e0f"/>
+    <w:bookmarkStart w:id="79" w:name="X799efba27fc6d09a0b5025f13f38b8866705e0f"/>
     <w:p>
       <w:pPr>
         <w:pStyle w:val="Heading3"/>
@@ -15403,17 +15434,17 @@
     <w:tbl>
       <w:tblPr>
         <w:tblStyle w:val="Table"/>
-        <w:tblW w:type="dxa" w:w="9638"/>
-        <w:tblLayout w:type="autofit"/>
+        <w:tblW w:type="pct" w:w="5000"/>
+        <w:tblLayout w:type="fixed"/>
         <w:tblLook w:firstRow="0" w:lastRow="0" w:firstColumn="0" w:lastColumn="0" w:noHBand="0" w:noVBand="0" w:val="0000"/>
       </w:tblPr>
       <w:tblGrid>
-        <w:gridCol w:w="9638"/>
+        <w:gridCol w:w="7920"/>
       </w:tblGrid>
       <w:tr>
         <w:tc>
           <w:tcPr/>
-          <w:bookmarkStart w:id="67" w:name="fig-waznosc-jakosc"/>
+          <w:bookmarkStart w:id="78" w:name="fig-waznosc-jakosc"/>
           <w:p>
             <w:pPr>
               <w:pStyle w:val="Compact"/>
@@ -15424,18 +15455,18 @@
                 <wp:inline>
                   <wp:extent cx="5334000" cy="3006436"/>
                   <wp:effectExtent b="0" l="0" r="0" t="0"/>
-                  <wp:docPr descr="" title="" id="65" name="Picture"/>
+                  <wp:docPr descr="" title="" id="76" name="Picture"/>
                   <a:graphic>
                     <a:graphicData uri="http://schemas.openxmlformats.org/drawingml/2006/picture">
                       <pic:pic>
                         <pic:nvPicPr>
-                          <pic:cNvPr descr="../Wykresy/praca/fig_04c_waznosc_jakosc.png" id="66" name="Picture"/>
+                          <pic:cNvPr descr="../Wykresy/praca/fig_04c_waznosc_jakosc.png" id="77" name="Picture"/>
                           <pic:cNvPicPr>
                             <a:picLocks noChangeArrowheads="1" noChangeAspect="1"/>
                           </pic:cNvPicPr>
                         </pic:nvPicPr>
                         <pic:blipFill>
-                          <a:blip r:embed="rId64"/>
+                          <a:blip r:embed="rId75"/>
                           <a:stretch>
                             <a:fillRect/>
                           </a:stretch>
@@ -15467,7 +15498,7 @@
               <w:jc w:val="center"/>
             </w:pPr>
             <w:pPr>
-              <w:jc w:val="left"/>
+              <w:jc w:val="start"/>
               <w:spacing w:before="200"/>
               <w:pStyle w:val="ImageCaption"/>
             </w:pPr>
@@ -15475,7 +15506,7 @@
               <w:t xml:space="preserve">Rysunek 9: Najważniejsze predyktory jakości dorobku w modelu Random Forest. Model przewidywał, czy średni FWCI badacza przekracza 1. Największe znaczenie miały cechy współpracy naukowej, zwłaszcza średnia liczba autorów jednej publikacji i liczba unikalnych współautorów. Wiek akademicki, liczba publikacji, stanowisko i uczelnia miały mniejsze znaczenie. Kolor oznacza kategorię zmiennej.</w:t>
             </w:r>
           </w:p>
-          <w:bookmarkEnd w:id="67"/>
+          <w:bookmarkEnd w:id="78"/>
         </w:tc>
       </w:tr>
     </w:tbl>
@@ -15487,9 +15518,9 @@
         <w:t xml:space="preserve">Oznacza to, że wysoki wpływ pojedynczych publikacji częściej wiąże się z pracą w szerszych, wieloautorskich zespołach niż ze stażem, liczbą publikacji czy formalnym stanowiskiem. Podobny wniosek wynikał już z analizy klastrów, w której wyróżniono profil jakościowy obejmujący wielu młodszych badaczy. Pokazuje to, że wysoka jakość dorobku nie musi być związana z długim stażem ani dużą liczbą publikacji.</w:t>
       </w:r>
     </w:p>
-    <w:bookmarkEnd w:id="68"/>
-    <w:bookmarkEnd w:id="69"/>
-    <w:bookmarkStart w:id="79" w:name="sieć-współautorstwa-pytanie-4"/>
+    <w:bookmarkEnd w:id="79"/>
+    <w:bookmarkEnd w:id="80"/>
+    <w:bookmarkStart w:id="90" w:name="sieć-współautorstwa-pytanie-4"/>
     <w:p>
       <w:pPr>
         <w:pStyle w:val="Heading2"/>
@@ -15517,17 +15548,17 @@
     <w:tbl>
       <w:tblPr>
         <w:tblStyle w:val="Table"/>
-        <w:tblW w:type="dxa" w:w="9638"/>
-        <w:tblLayout w:type="autofit"/>
+        <w:tblW w:type="pct" w:w="5000"/>
+        <w:tblLayout w:type="fixed"/>
         <w:tblLook w:firstRow="0" w:lastRow="0" w:firstColumn="0" w:lastColumn="0" w:noHBand="0" w:noVBand="0" w:val="0000"/>
       </w:tblPr>
       <w:tblGrid>
-        <w:gridCol w:w="9638"/>
+        <w:gridCol w:w="7920"/>
       </w:tblGrid>
       <w:tr>
         <w:tc>
           <w:tcPr/>
-          <w:bookmarkStart w:id="73" w:name="fig-siec"/>
+          <w:bookmarkStart w:id="84" w:name="fig-siec"/>
           <w:p>
             <w:pPr>
               <w:pStyle w:val="Compact"/>
@@ -15538,18 +15569,18 @@
                 <wp:inline>
                   <wp:extent cx="5067300" cy="4504266"/>
                   <wp:effectExtent b="0" l="0" r="0" t="0"/>
-                  <wp:docPr descr="" title="" id="71" name="Picture"/>
+                  <wp:docPr descr="" title="" id="82" name="Picture"/>
                   <a:graphic>
                     <a:graphicData uri="http://schemas.openxmlformats.org/drawingml/2006/picture">
                       <pic:pic>
                         <pic:nvPicPr>
-                          <pic:cNvPr descr="../Wykresy/praca/fig_05a_siec.png" id="72" name="Picture"/>
+                          <pic:cNvPr descr="../Wykresy/praca/fig_05a_siec.png" id="83" name="Picture"/>
                           <pic:cNvPicPr>
                             <a:picLocks noChangeArrowheads="1" noChangeAspect="1"/>
                           </pic:cNvPicPr>
                         </pic:nvPicPr>
                         <pic:blipFill>
-                          <a:blip r:embed="rId70"/>
+                          <a:blip r:embed="rId81"/>
                           <a:stretch>
                             <a:fillRect/>
                           </a:stretch>
@@ -15581,7 +15612,7 @@
               <w:jc w:val="center"/>
             </w:pPr>
             <w:pPr>
-              <w:jc w:val="left"/>
+              <w:jc w:val="start"/>
               <w:spacing w:before="200"/>
               <w:pStyle w:val="ImageCaption"/>
             </w:pPr>
@@ -15589,7 +15620,7 @@
               <w:t xml:space="preserve">Rysunek 10: Sieć współautorstwa naukowców badanej dyscypliny. Węzły to badacze (kolor oznacza uczelnię, wielkość liczbę połączeń), a krawędzie wspólne publikacje. Skupiska tej samej barwy pokazują, że współpraca koncentruje się wewnątrz uczelni.</w:t>
             </w:r>
           </w:p>
-          <w:bookmarkEnd w:id="73"/>
+          <w:bookmarkEnd w:id="84"/>
         </w:tc>
       </w:tr>
     </w:tbl>
@@ -15657,23 +15688,23 @@
     <w:tbl>
       <w:tblPr>
         <w:tblStyle w:val="Table"/>
-        <w:tblW w:type="dxa" w:w="9638"/>
-        <w:tblLayout w:type="autofit"/>
+        <w:tblW w:type="pct" w:w="5000"/>
+        <w:tblLayout w:type="fixed"/>
         <w:tblLook w:firstRow="0" w:lastRow="0" w:firstColumn="0" w:lastColumn="0" w:noHBand="0" w:noVBand="0" w:val="0000"/>
       </w:tblPr>
       <w:tblGrid>
-        <w:gridCol w:w="9638"/>
+        <w:gridCol w:w="7920"/>
       </w:tblGrid>
       <w:tr>
         <w:tc>
           <w:tcPr/>
-          <w:bookmarkStart w:id="74" w:name="tbl-spolecznosci"/>
+          <w:bookmarkStart w:id="85" w:name="tbl-spolecznosci"/>
           <w:p>
             <w:pPr>
               <w:jc w:val="center"/>
             </w:pPr>
             <w:pPr>
-              <w:jc w:val="left"/>
+              <w:jc w:val="start"/>
               <w:spacing w:before="200"/>
               <w:pStyle w:val="ImageCaption"/>
             </w:pPr>
@@ -15683,20 +15714,21 @@
           </w:p>
           <w:tbl xmlns:w="http://schemas.openxmlformats.org/wordprocessingml/2006/main" xmlns:r="http://schemas.openxmlformats.org/officeDocument/2006/relationships" xmlns:w14="http://schemas.microsoft.com/office/word/2010/wordml" xmlns:wp="http://schemas.openxmlformats.org/drawingml/2006/wordprocessingDrawing" xmlns:a="http://schemas.openxmlformats.org/drawingml/2006/main" xmlns:pic="http://schemas.openxmlformats.org/drawingml/2006/picture">
             <w:tblPr>
-              <w:tblLayout w:type="autofit"/>
+              <w:tblLayout w:type="fixed"/>
               <w:jc w:val="center"/>
               <w:tblLook w:firstRow="1" w:lastRow="0" w:firstColumn="0" w:lastColumn="0" w:noHBand="0" w:noVBand="1"/>
             </w:tblPr>
             <w:tblGrid>
-              <w:gridCol w:w="5484"/>
-              <w:gridCol w:w="2077"/>
-              <w:gridCol w:w="2077"/>
+              <w:gridCol w:w="4752"/>
+              <w:gridCol w:w="1800"/>
+              <w:gridCol w:w="1800"/>
             </w:tblGrid>
             <w:tr>
               <w:trPr>
                 <w:trHeight w:val="360" w:hRule="auto"/>
                 <w:tblHeader/>
               </w:trPr>
+              header1
               <w:tc>
                 <w:tcPr>
                   <w:tcBorders>
@@ -15864,6 +15896,7 @@
               <w:trPr>
                 <w:trHeight w:val="360" w:hRule="auto"/>
               </w:trPr>
+              body1
               <w:tc>
                 <w:tcPr>
                   <w:tcBorders>
@@ -16031,6 +16064,7 @@
               <w:trPr>
                 <w:trHeight w:val="360" w:hRule="auto"/>
               </w:trPr>
+              body2
               <w:tc>
                 <w:tcPr>
                   <w:tcBorders>
@@ -16198,6 +16232,7 @@
               <w:trPr>
                 <w:trHeight w:val="360" w:hRule="auto"/>
               </w:trPr>
+              footer1
               <w:tc>
                 <w:tcPr>
                   <w:gridSpan w:val="3"/>
@@ -16258,6 +16293,7 @@
               <w:trPr>
                 <w:trHeight w:val="360" w:hRule="auto"/>
               </w:trPr>
+              footer2
               <w:tc>
                 <w:tcPr>
                   <w:gridSpan w:val="3"/>
@@ -16315,24 +16351,24 @@
               </w:tc>
             </w:tr>
           </w:tbl>
-          <w:bookmarkEnd w:id="74"/>
+          <w:bookmarkEnd w:id="85"/>
         </w:tc>
       </w:tr>
     </w:tbl>
     <w:tbl>
       <w:tblPr>
         <w:tblStyle w:val="Table"/>
-        <w:tblW w:type="dxa" w:w="9638"/>
-        <w:tblLayout w:type="autofit"/>
+        <w:tblW w:type="pct" w:w="5000"/>
+        <w:tblLayout w:type="fixed"/>
         <w:tblLook w:firstRow="0" w:lastRow="0" w:firstColumn="0" w:lastColumn="0" w:noHBand="0" w:noVBand="0" w:val="0000"/>
       </w:tblPr>
       <w:tblGrid>
-        <w:gridCol w:w="9638"/>
+        <w:gridCol w:w="7920"/>
       </w:tblGrid>
       <w:tr>
         <w:tc>
           <w:tcPr/>
-          <w:bookmarkStart w:id="78" w:name="fig-spolecznosci"/>
+          <w:bookmarkStart w:id="89" w:name="fig-spolecznosci"/>
           <w:p>
             <w:pPr>
               <w:pStyle w:val="Compact"/>
@@ -16343,18 +16379,18 @@
                 <wp:inline>
                   <wp:extent cx="5334000" cy="6096000"/>
                   <wp:effectExtent b="0" l="0" r="0" t="0"/>
-                  <wp:docPr descr="" title="" id="76" name="Picture"/>
+                  <wp:docPr descr="" title="" id="87" name="Picture"/>
                   <a:graphic>
                     <a:graphicData uri="http://schemas.openxmlformats.org/drawingml/2006/picture">
                       <pic:pic>
                         <pic:nvPicPr>
-                          <pic:cNvPr descr="../Wykresy/praca/fig_05b_spolecznosci.png" id="77" name="Picture"/>
+                          <pic:cNvPr descr="../Wykresy/praca/fig_05b_spolecznosci.png" id="88" name="Picture"/>
                           <pic:cNvPicPr>
                             <a:picLocks noChangeArrowheads="1" noChangeAspect="1"/>
                           </pic:cNvPicPr>
                         </pic:nvPicPr>
                         <pic:blipFill>
-                          <a:blip r:embed="rId75"/>
+                          <a:blip r:embed="rId86"/>
                           <a:stretch>
                             <a:fillRect/>
                           </a:stretch>
@@ -16386,7 +16422,7 @@
               <w:jc w:val="center"/>
             </w:pPr>
             <w:pPr>
-              <w:jc w:val="left"/>
+              <w:jc w:val="start"/>
               <w:spacing w:before="200"/>
               <w:pStyle w:val="ImageCaption"/>
             </w:pPr>
@@ -16394,7 +16430,7 @@
               <w:t xml:space="preserve">Rysunek 11: Zgodność społeczności Louvain z uczelnią. Każdy wiersz to jedna społeczność (uporządkowane według wielkości); wartość i intensywność oznaczają udział danej uczelni, a kolor typ społeczności: czerwień to społeczność jednouczelniana, turkus to społeczność mieszana (współpraca międzyuczelniana). Niemal wszystkie społeczności są jednorodne uczelniano.</w:t>
             </w:r>
           </w:p>
-          <w:bookmarkEnd w:id="78"/>
+          <w:bookmarkEnd w:id="89"/>
         </w:tc>
       </w:tr>
     </w:tbl>
@@ -16433,9 +16469,9 @@
         <w:t xml:space="preserve">Najwyższą centralność stopnia, czyli największą liczbę bezpośrednich powiązań współautorskich, osiąga profesor z URK (S. Smoleń). Wśród najbardziej centralnych osób znajduje się także grupa badaczy gleboznawczych z UPWr.</w:t>
       </w:r>
     </w:p>
-    <w:bookmarkEnd w:id="79"/>
-    <w:bookmarkEnd w:id="80"/>
-    <w:bookmarkStart w:id="90" w:name="dyskusja"/>
+    <w:bookmarkEnd w:id="90"/>
+    <w:bookmarkEnd w:id="91"/>
+    <w:bookmarkStart w:id="101" w:name="dyskusja"/>
     <w:p>
       <w:pPr>
         <w:pStyle w:val="Heading1"/>
@@ -16444,7 +16480,7 @@
         <w:t xml:space="preserve">Dyskusja</w:t>
       </w:r>
     </w:p>
-    <w:bookmarkStart w:id="81" w:name="X8e8cd80b7d1e8d8e23d38bfd67a798253a95b88"/>
+    <w:bookmarkStart w:id="92" w:name="X8e8cd80b7d1e8d8e23d38bfd67a798253a95b88"/>
     <w:p>
       <w:pPr>
         <w:pStyle w:val="Heading2"/>
@@ -16493,8 +16529,8 @@
         <w:t xml:space="preserve">Taki układ może wynikać ze specyfiki nauk rolniczych. W tej dziedzinie część badań jest silnie związana z lokalną infrastrukturą i warunkami prowadzenia eksperymentów, takimi jak pola doświadczalne, stacje badawcze czy lokalne uwarunkowania glebowo-klimatyczne. Może to sprzyjać współpracy w obrębie tej samej uczelni lub ośrodka badawczego.</w:t>
       </w:r>
     </w:p>
-    <w:bookmarkEnd w:id="81"/>
-    <w:bookmarkStart w:id="82" w:name="X55d3951ebce5c318a1ba2b13bef613b3921736b"/>
+    <w:bookmarkEnd w:id="92"/>
+    <w:bookmarkStart w:id="93" w:name="X55d3951ebce5c318a1ba2b13bef613b3921736b"/>
     <w:p>
       <w:pPr>
         <w:pStyle w:val="Heading2"/>
@@ -16543,8 +16579,8 @@
         <w:t xml:space="preserve">Spójny obraz daje też wariant klastrowania k = 3, w którym wyodrębniono profil jakościowy zdominowany przez asystentów i adiunktów o wysokim FWCI i IF na publikację. Może to odzwierciedlać zmianę pokoleniową, w której młodsi badacze częściej publikują w prestiżowych czasopismach o szerokim zasięgu, w ramach większych zespołów współautorskich, zamiast budować dużą liczbę prac o niższym oddziaływaniu. Ponieważ dane mają charakter przekrojowy, interpretację tę należy traktować jako hipotezę: nie można odróżnić rzeczywistego efektu pokoleniowego od efektu etapu kariery ani od selekcji osób pozostających w nauce.</w:t>
       </w:r>
     </w:p>
-    <w:bookmarkEnd w:id="82"/>
-    <w:bookmarkStart w:id="83" w:name="kategoria-ewaluacyjna-mein"/>
+    <w:bookmarkEnd w:id="93"/>
+    <w:bookmarkStart w:id="94" w:name="kategoria-ewaluacyjna-mein"/>
     <w:p>
       <w:pPr>
         <w:pStyle w:val="Heading2"/>
@@ -16577,8 +16613,8 @@
         <w:t xml:space="preserve">Wniosek ten należy jednak traktować ostrożnie. W badaniu uwzględniono tylko jedną uczelnię z kategorią B+, dlatego zależność między kategorią ewaluacyjną a indywidualnym dorobkiem naukowców wymagałaby sprawdzenia na większej próbie uczelni.</w:t>
       </w:r>
     </w:p>
-    <w:bookmarkEnd w:id="83"/>
-    <w:bookmarkStart w:id="88" w:name="Xc8114be83f87911a3e825982079ac6b9186de2d"/>
+    <w:bookmarkEnd w:id="94"/>
+    <w:bookmarkStart w:id="99" w:name="Xc8114be83f87911a3e825982079ac6b9186de2d"/>
     <w:p>
       <w:pPr>
         <w:pStyle w:val="Heading2"/>
@@ -16633,17 +16669,17 @@
     <w:tbl>
       <w:tblPr>
         <w:tblStyle w:val="Table"/>
-        <w:tblW w:type="dxa" w:w="9638"/>
-        <w:tblLayout w:type="autofit"/>
+        <w:tblW w:type="pct" w:w="5000"/>
+        <w:tblLayout w:type="fixed"/>
         <w:tblLook w:firstRow="0" w:lastRow="0" w:firstColumn="0" w:lastColumn="0" w:noHBand="0" w:noVBand="0" w:val="0000"/>
       </w:tblPr>
       <w:tblGrid>
-        <w:gridCol w:w="9638"/>
+        <w:gridCol w:w="7920"/>
       </w:tblGrid>
       <w:tr>
         <w:tc>
           <w:tcPr/>
-          <w:bookmarkStart w:id="87" w:name="fig-dynamika"/>
+          <w:bookmarkStart w:id="98" w:name="fig-dynamika"/>
           <w:p>
             <w:pPr>
               <w:pStyle w:val="Compact"/>
@@ -16654,18 +16690,18 @@
                 <wp:inline>
                   <wp:extent cx="4267200" cy="2607733"/>
                   <wp:effectExtent b="0" l="0" r="0" t="0"/>
-                  <wp:docPr descr="" title="" id="85" name="Picture"/>
+                  <wp:docPr descr="" title="" id="96" name="Picture"/>
                   <a:graphic>
                     <a:graphicData uri="http://schemas.openxmlformats.org/drawingml/2006/picture">
                       <pic:pic>
                         <pic:nvPicPr>
-                          <pic:cNvPr descr="../Wykresy/praca/fig_06_dynamika_porownanie.png" id="86" name="Picture"/>
+                          <pic:cNvPr descr="../Wykresy/praca/fig_06_dynamika_porownanie.png" id="97" name="Picture"/>
                           <pic:cNvPicPr>
                             <a:picLocks noChangeArrowheads="1" noChangeAspect="1"/>
                           </pic:cNvPicPr>
                         </pic:nvPicPr>
                         <pic:blipFill>
-                          <a:blip r:embed="rId84"/>
+                          <a:blip r:embed="rId95"/>
                           <a:stretch>
                             <a:fillRect/>
                           </a:stretch>
@@ -16697,7 +16733,7 @@
               <w:jc w:val="center"/>
             </w:pPr>
             <w:pPr>
-              <w:jc w:val="left"/>
+              <w:jc w:val="start"/>
               <w:spacing w:before="200"/>
               <w:pStyle w:val="ImageCaption"/>
             </w:pPr>
@@ -16705,7 +16741,7 @@
               <w:t xml:space="preserve">Rysunek 12: Roczne tempo wzrostu liczby publikacji na badacza według danych OpenAlex i Omega-PSIR. Linie pokazują 95% przedziały ufności. Wyniki wskazują, że ocena dynamiki rozwoju uczelni zależy od źródła danych.</w:t>
             </w:r>
           </w:p>
-          <w:bookmarkEnd w:id="87"/>
+          <w:bookmarkEnd w:id="98"/>
         </w:tc>
       </w:tr>
     </w:tbl>
@@ -16741,8 +16777,8 @@
         <w:t xml:space="preserve">Różnice między uczelniami należy jednak interpretować ostrożnie, ponieważ przedziały ufności są szerokie i częściowo się nakładają. Bardziej wiarygodny jest ogólny podział na uczelnie o wyższym tempie wzrostu (URK, UWM) oraz uczelnie o bardziej ustabilizowanej produktywności (UPWr, SGGW), niż dokładny ranking uczelni.</w:t>
       </w:r>
     </w:p>
-    <w:bookmarkEnd w:id="88"/>
-    <w:bookmarkStart w:id="89" w:name="ograniczenia-badania"/>
+    <w:bookmarkEnd w:id="99"/>
+    <w:bookmarkStart w:id="100" w:name="ograniczenia-badania"/>
     <w:p>
       <w:pPr>
         <w:pStyle w:val="Heading2"/>
@@ -16913,7 +16949,7 @@
           <w:rPr>
             <w:rStyle w:val="Hyperlink"/>
           </w:rPr>
-          <w:t xml:space="preserve">Culbert et al. 2025</w:t>
+          <w:t xml:space="preserve">Culbert i in. 2025</w:t>
         </w:r>
       </w:hyperlink>
       <w:r>
@@ -16923,9 +16959,9 @@
         <w:t xml:space="preserve">. Dlatego Omega-PSIR przyjęto jako źródło podstawowe, a OpenAlex jako źródło uzupełniające.</w:t>
       </w:r>
     </w:p>
-    <w:bookmarkEnd w:id="89"/>
-    <w:bookmarkEnd w:id="90"/>
-    <w:bookmarkStart w:id="92" w:name="wnioski"/>
+    <w:bookmarkEnd w:id="100"/>
+    <w:bookmarkEnd w:id="101"/>
+    <w:bookmarkStart w:id="103" w:name="wnioski"/>
     <w:p>
       <w:pPr>
         <w:pStyle w:val="Heading1"/>
@@ -16990,7 +17026,7 @@
         <w:t xml:space="preserve">Łącznie wyniki pokazują, że indywidualny dorobek naukowców jest związany głównie z etapem kariery, natomiast współpraca naukowa przebiega przede wszystkim w obrębie uczelni. Praca potwierdza także znaczenie jednorodnego źródła danych. Wykorzystanie systemów Omega-PSIR umożliwiło porównywalne pozyskanie wskaźników bibliometrycznych z czterech uczelni, co byłoby znacznie trudniejsze przy użyciu różnych, niejednolitych repozytoriów.</w:t>
       </w:r>
     </w:p>
-    <w:bookmarkStart w:id="91" w:name="wnioski-dla-praktyki"/>
+    <w:bookmarkStart w:id="102" w:name="wnioski-dla-praktyki"/>
     <w:p>
       <w:pPr>
         <w:pStyle w:val="Heading2"/>
@@ -17036,9 +17072,9 @@
         <w:br w:type="page"/>
       </w:r>
     </w:p>
-    <w:bookmarkEnd w:id="91"/>
-    <w:bookmarkEnd w:id="92"/>
-    <w:bookmarkStart w:id="130" w:name="bibliografia"/>
+    <w:bookmarkEnd w:id="102"/>
+    <w:bookmarkEnd w:id="103"/>
+    <w:bookmarkStart w:id="141" w:name="bibliografia"/>
     <w:p>
       <w:pPr>
         <w:pStyle w:val="Heading1"/>
@@ -17047,8 +17083,8 @@
         <w:t xml:space="preserve">Bibliografia</w:t>
       </w:r>
     </w:p>
-    <w:bookmarkStart w:id="129" w:name="refs"/>
-    <w:bookmarkStart w:id="94" w:name="ref-ariaBibliometrix2017"/>
+    <w:bookmarkStart w:id="140" w:name="refs"/>
+    <w:bookmarkStart w:id="105" w:name="ref-ariaBibliometrix2017"/>
     <w:p>
       <w:pPr>
         <w:pStyle w:val="Bibliography"/>
@@ -17093,7 +17129,7 @@
       <w:r>
         <w:t xml:space="preserve"> </w:t>
       </w:r>
-      <w:hyperlink r:id="rId93">
+      <w:hyperlink r:id="rId104">
         <w:r>
           <w:rPr>
             <w:rStyle w:val="Hyperlink"/>
@@ -17105,8 +17141,8 @@
         <w:t xml:space="preserve">.</w:t>
       </w:r>
     </w:p>
-    <w:bookmarkEnd w:id="94"/>
-    <w:bookmarkStart w:id="96" w:name="ref-ariaOpenalexR2024"/>
+    <w:bookmarkEnd w:id="105"/>
+    <w:bookmarkStart w:id="107" w:name="ref-ariaOpenalexR2024"/>
     <w:p>
       <w:pPr>
         <w:pStyle w:val="Bibliography"/>
@@ -17166,7 +17202,7 @@
       <w:r>
         <w:t xml:space="preserve"> </w:t>
       </w:r>
-      <w:hyperlink r:id="rId95">
+      <w:hyperlink r:id="rId106">
         <w:r>
           <w:rPr>
             <w:rStyle w:val="Hyperlink"/>
@@ -17178,8 +17214,8 @@
         <w:t xml:space="preserve">.</w:t>
       </w:r>
     </w:p>
-    <w:bookmarkEnd w:id="96"/>
-    <w:bookmarkStart w:id="97" w:name="ref-blondel2008"/>
+    <w:bookmarkEnd w:id="107"/>
+    <w:bookmarkStart w:id="108" w:name="ref-blondel2008"/>
     <w:p>
       <w:pPr>
         <w:pStyle w:val="Bibliography"/>
@@ -17213,8 +17249,8 @@
         <w:t xml:space="preserve">2008 (10): P10008.</w:t>
       </w:r>
     </w:p>
-    <w:bookmarkEnd w:id="97"/>
-    <w:bookmarkStart w:id="98" w:name="ref-breiman2001"/>
+    <w:bookmarkEnd w:id="108"/>
+    <w:bookmarkStart w:id="109" w:name="ref-breiman2001"/>
     <w:p>
       <w:pPr>
         <w:pStyle w:val="Bibliography"/>
@@ -17248,8 +17284,8 @@
         <w:t xml:space="preserve">45 (1): 5–32.</w:t>
       </w:r>
     </w:p>
-    <w:bookmarkEnd w:id="98"/>
-    <w:bookmarkStart w:id="99" w:name="ref-chen2016"/>
+    <w:bookmarkEnd w:id="109"/>
+    <w:bookmarkStart w:id="110" w:name="ref-chen2016"/>
     <w:p>
       <w:pPr>
         <w:pStyle w:val="Bibliography"/>
@@ -17270,7 +17306,7 @@
         <w:t xml:space="preserve">: A scalable tree boosting system”</w:t>
       </w:r>
       <w:r>
-        <w:t xml:space="preserve">.</w:t>
+        <w:t xml:space="preserve">. W</w:t>
       </w:r>
       <w:r>
         <w:t xml:space="preserve"> </w:t>
@@ -17286,14 +17322,14 @@
         <w:t xml:space="preserve">, 785–94.</w:t>
       </w:r>
     </w:p>
-    <w:bookmarkEnd w:id="99"/>
-    <w:bookmarkStart w:id="101" w:name="ref-culbertReferenceCoverageAnalysis2025"/>
+    <w:bookmarkEnd w:id="110"/>
+    <w:bookmarkStart w:id="112" w:name="ref-culbertReferenceCoverageAnalysis2025"/>
     <w:p>
       <w:pPr>
         <w:pStyle w:val="Bibliography"/>
       </w:pPr>
       <w:r>
-        <w:t xml:space="preserve">Culbert, Jack H., Anne Hobert, Najko Jahn, et al. 2025.</w:t>
+        <w:t xml:space="preserve">Culbert, Jack H., Anne Hobert, Najko Jahn, Nick Haupka, Marion Schmidt, Paul Donner, i Philipp Mayr. 2025.</w:t>
       </w:r>
       <w:r>
         <w:t xml:space="preserve"> </w:t>
@@ -17356,7 +17392,7 @@
       <w:r>
         <w:t xml:space="preserve"> </w:t>
       </w:r>
-      <w:hyperlink r:id="rId100">
+      <w:hyperlink r:id="rId111">
         <w:r>
           <w:rPr>
             <w:rStyle w:val="Hyperlink"/>
@@ -17368,8 +17404,8 @@
         <w:t xml:space="preserve">.</w:t>
       </w:r>
     </w:p>
-    <w:bookmarkEnd w:id="101"/>
-    <w:bookmarkStart w:id="102" w:name="ref-Drabek2012"/>
+    <w:bookmarkEnd w:id="112"/>
+    <w:bookmarkStart w:id="113" w:name="ref-Drabek2012"/>
     <w:p>
       <w:pPr>
         <w:pStyle w:val="Bibliography"/>
@@ -17403,8 +17439,8 @@
         <w:t xml:space="preserve">130 (3).</w:t>
       </w:r>
     </w:p>
-    <w:bookmarkEnd w:id="102"/>
-    <w:bookmarkStart w:id="103" w:name="ref-garfield2006"/>
+    <w:bookmarkEnd w:id="113"/>
+    <w:bookmarkStart w:id="114" w:name="ref-garfield2006"/>
     <w:p>
       <w:pPr>
         <w:pStyle w:val="Bibliography"/>
@@ -17438,8 +17474,8 @@
         <w:t xml:space="preserve">295 (1): 90–93.</w:t>
       </w:r>
     </w:p>
-    <w:bookmarkEnd w:id="103"/>
-    <w:bookmarkStart w:id="104" w:name="ref-Grygiel2009"/>
+    <w:bookmarkEnd w:id="114"/>
+    <w:bookmarkStart w:id="115" w:name="ref-Grygiel2009"/>
     <w:p>
       <w:pPr>
         <w:pStyle w:val="Bibliography"/>
@@ -17482,17 +17518,14 @@
         <w:t xml:space="preserve">7 (3): 65–84.</w:t>
       </w:r>
     </w:p>
-    <w:bookmarkEnd w:id="104"/>
-    <w:bookmarkStart w:id="106" w:name="X0b33f87ae5ad4597f5248ccd3781f8ded4d6a31"/>
+    <w:bookmarkEnd w:id="115"/>
+    <w:bookmarkStart w:id="117" w:name="X0b33f87ae5ad4597f5248ccd3781f8ded4d6a31"/>
     <w:p>
       <w:pPr>
         <w:pStyle w:val="Bibliography"/>
       </w:pPr>
       <w:r>
-        <w:t xml:space="preserve">Hicks, Diana, Paul Wouters, Ludo Waltman, Sarah de Rijcke, i Ismael Rafols</w:t>
-      </w:r>
-      <w:r>
-        <w:t xml:space="preserve">. 2015.</w:t>
+        <w:t xml:space="preserve">Hicks, Diana, Paul Wouters, Ludo Waltman, Sarah de Rijcke, i Ismael Rafols. 2015.</w:t>
       </w:r>
       <w:r>
         <w:t xml:space="preserve"> </w:t>
@@ -17534,7 +17567,7 @@
       <w:r>
         <w:t xml:space="preserve"> </w:t>
       </w:r>
-      <w:hyperlink r:id="rId105">
+      <w:hyperlink r:id="rId116">
         <w:r>
           <w:rPr>
             <w:rStyle w:val="Hyperlink"/>
@@ -17546,8 +17579,8 @@
         <w:t xml:space="preserve">.</w:t>
       </w:r>
     </w:p>
-    <w:bookmarkEnd w:id="106"/>
-    <w:bookmarkStart w:id="107" w:name="ref-hirsch2005"/>
+    <w:bookmarkEnd w:id="117"/>
+    <w:bookmarkStart w:id="118" w:name="ref-hirsch2005"/>
     <w:p>
       <w:pPr>
         <w:pStyle w:val="Bibliography"/>
@@ -17581,8 +17614,8 @@
         <w:t xml:space="preserve">102 (46): 16569–72.</w:t>
       </w:r>
     </w:p>
-    <w:bookmarkEnd w:id="107"/>
-    <w:bookmarkStart w:id="108" w:name="ref-hubert1985"/>
+    <w:bookmarkEnd w:id="118"/>
+    <w:bookmarkStart w:id="119" w:name="ref-hubert1985"/>
     <w:p>
       <w:pPr>
         <w:pStyle w:val="Bibliography"/>
@@ -17616,8 +17649,8 @@
         <w:t xml:space="preserve">2 (1): 193–218.</w:t>
       </w:r>
     </w:p>
-    <w:bookmarkEnd w:id="108"/>
-    <w:bookmarkStart w:id="110" w:name="ref-koperwas2015omega"/>
+    <w:bookmarkEnd w:id="119"/>
+    <w:bookmarkStart w:id="121" w:name="ref-koperwas2015omega"/>
     <w:p>
       <w:pPr>
         <w:pStyle w:val="Bibliography"/>
@@ -17641,7 +17674,7 @@
         <w:t xml:space="preserve">– a solution for implementing university research knowledge base”</w:t>
       </w:r>
       <w:r>
-        <w:t xml:space="preserve">.</w:t>
+        <w:t xml:space="preserve">. W</w:t>
       </w:r>
       <w:r>
         <w:t xml:space="preserve"> </w:t>
@@ -17654,15 +17687,12 @@
         <w:t xml:space="preserve">Proceedings of the 21st EUNIS Congress</w:t>
       </w:r>
       <w:r>
+        <w:t xml:space="preserve">. Dundee: European University Information Systems Organisation (EUNIS).</w:t>
+      </w:r>
+      <w:r>
         <w:t xml:space="preserve"> </w:t>
       </w:r>
-      <w:r>
-        <w:t xml:space="preserve">(Dundee).</w:t>
-      </w:r>
-      <w:r>
-        <w:t xml:space="preserve"> </w:t>
-      </w:r>
-      <w:hyperlink r:id="rId109">
+      <w:hyperlink r:id="rId120">
         <w:r>
           <w:rPr>
             <w:rStyle w:val="Hyperlink"/>
@@ -17674,8 +17704,8 @@
         <w:t xml:space="preserve">.</w:t>
       </w:r>
     </w:p>
-    <w:bookmarkEnd w:id="110"/>
-    <w:bookmarkStart w:id="111" w:name="ref-Kulczycki2019"/>
+    <w:bookmarkEnd w:id="121"/>
+    <w:bookmarkStart w:id="122" w:name="ref-Kulczycki2019"/>
     <w:p>
       <w:pPr>
         <w:pStyle w:val="Bibliography"/>
@@ -17706,8 +17736,8 @@
         <w:t xml:space="preserve">, nr 6.</w:t>
       </w:r>
     </w:p>
-    <w:bookmarkEnd w:id="111"/>
-    <w:bookmarkStart w:id="112" w:name="ref-lundberg2017"/>
+    <w:bookmarkEnd w:id="122"/>
+    <w:bookmarkStart w:id="123" w:name="ref-lundberg2017"/>
     <w:p>
       <w:pPr>
         <w:pStyle w:val="Bibliography"/>
@@ -17722,7 +17752,7 @@
         <w:t xml:space="preserve">„A unified approach to interpreting model predictions”</w:t>
       </w:r>
       <w:r>
-        <w:t xml:space="preserve">.</w:t>
+        <w:t xml:space="preserve">. W</w:t>
       </w:r>
       <w:r>
         <w:t xml:space="preserve"> </w:t>
@@ -17735,83 +17765,68 @@
         <w:t xml:space="preserve">Advances in Neural Information Processing Systems</w:t>
       </w:r>
       <w:r>
+        <w:t xml:space="preserve">, 30:4765–74.</w:t>
+      </w:r>
+    </w:p>
+    <w:bookmarkEnd w:id="123"/>
+    <w:bookmarkStart w:id="124" w:name="ref-rozp_ewaluacja2022"/>
+    <w:p>
+      <w:pPr>
+        <w:pStyle w:val="Bibliography"/>
+      </w:pPr>
+      <w:r>
+        <w:t xml:space="preserve">Minister Edukacji i Nauki. 2022.</w:t>
+      </w:r>
+      <w:r>
         <w:t xml:space="preserve"> </w:t>
       </w:r>
       <w:r>
-        <w:t xml:space="preserve">30: 4765–74.</w:t>
-      </w:r>
-    </w:p>
-    <w:bookmarkEnd w:id="112"/>
-    <w:bookmarkStart w:id="113" w:name="ref-rozp_ewaluacja2022"/>
+        <w:t xml:space="preserve">„Obwieszczenie Ministra Edukacji i Nauki z dnia 23 lutego 2022 r. w sprawie ogłoszenia jednolitego tekstu rozporządzenia Ministra Nauki i Szkolnictwa Wyższego w sprawie ewaluacji jakości działalności naukowej”</w:t>
+      </w:r>
+      <w:r>
+        <w:t xml:space="preserve">. Dz.U. 2022 poz. 661.</w:t>
+      </w:r>
+    </w:p>
+    <w:bookmarkEnd w:id="124"/>
+    <w:bookmarkStart w:id="125" w:name="ref-rozp_dyscypliny2025"/>
     <w:p>
       <w:pPr>
         <w:pStyle w:val="Bibliography"/>
       </w:pPr>
       <w:r>
-        <w:t xml:space="preserve">Minister Edukacji i Nauki. 2022.</w:t>
+        <w:t xml:space="preserve">Minister Nauki i Szkolnictwa Wyższego. 2025a.</w:t>
       </w:r>
       <w:r>
         <w:t xml:space="preserve"> </w:t>
       </w:r>
       <w:r>
-        <w:rPr>
-          <w:i/>
-          <w:iCs/>
-        </w:rPr>
-        <w:t xml:space="preserve">Obwieszczenie Ministra Edukacji i Nauki z dnia 23 lutego 2022 r. w sprawie ogłoszenia jednolitego tekstu rozporządzenia Ministra Nauki i Szkolnictwa Wyższego w sprawie ewaluacji jakości działalności naukowej</w:t>
-      </w:r>
-      <w:r>
-        <w:t xml:space="preserve">. Dz.U. 2022 poz. 661.</w:t>
-      </w:r>
-    </w:p>
-    <w:bookmarkEnd w:id="113"/>
-    <w:bookmarkStart w:id="114" w:name="ref-rozp_dyscypliny2025"/>
+        <w:t xml:space="preserve">„Obwieszczenie Ministra Nauki i Szkolnictwa Wyższego z dnia 12 lutego 2025 r. w sprawie ogłoszenia jednolitego tekstu rozporządzenia Ministra Edukacji i Nauki w sprawie dziedzin nauki i dyscyplin naukowych oraz dyscyplin artystycznych”</w:t>
+      </w:r>
+      <w:r>
+        <w:t xml:space="preserve">. Dz.U. 2025 poz. 211.</w:t>
+      </w:r>
+    </w:p>
+    <w:bookmarkEnd w:id="125"/>
+    <w:bookmarkStart w:id="126" w:name="ref-rozp_ewaluacja_nowela2025"/>
     <w:p>
       <w:pPr>
         <w:pStyle w:val="Bibliography"/>
       </w:pPr>
       <w:r>
-        <w:t xml:space="preserve">Minister Nauki i Szkolnictwa Wyższego. 2025a.</w:t>
+        <w:t xml:space="preserve">———. 2025b.</w:t>
       </w:r>
       <w:r>
         <w:t xml:space="preserve"> </w:t>
       </w:r>
       <w:r>
-        <w:rPr>
-          <w:i/>
-          <w:iCs/>
-        </w:rPr>
-        <w:t xml:space="preserve">Obwieszczenie Ministra Nauki i Szkolnictwa Wyższego z dnia 12 lutego 2025 r. w sprawie ogłoszenia jednolitego tekstu rozporządzenia Ministra Edukacji i Nauki w sprawie dziedzin nauki i dyscyplin naukowych oraz dyscyplin artystycznych</w:t>
-      </w:r>
-      <w:r>
-        <w:t xml:space="preserve">. Dz.U. 2025 poz. 211.</w:t>
-      </w:r>
-    </w:p>
-    <w:bookmarkEnd w:id="114"/>
-    <w:bookmarkStart w:id="115" w:name="ref-rozp_ewaluacja_nowela2025"/>
-    <w:p>
-      <w:pPr>
-        <w:pStyle w:val="Bibliography"/>
-      </w:pPr>
-      <w:r>
-        <w:t xml:space="preserve">Minister Nauki i Szkolnictwa Wyższego. 2025b.</w:t>
-      </w:r>
-      <w:r>
-        <w:t xml:space="preserve"> </w:t>
-      </w:r>
-      <w:r>
-        <w:rPr>
-          <w:i/>
-          <w:iCs/>
-        </w:rPr>
-        <w:t xml:space="preserve">Rozporządzenie Ministra Nauki i Szkolnictwa Wyższego z dnia 30 lipca 2025 r. zmieniające rozporządzenie w sprawie ewaluacji jakości działalności naukowej</w:t>
+        <w:t xml:space="preserve">„Rozporządzenie Ministra Nauki i Szkolnictwa Wyższego z dnia 30 lipca 2025 r. zmieniające rozporządzenie w sprawie ewaluacji jakości działalności naukowej”</w:t>
       </w:r>
       <w:r>
         <w:t xml:space="preserve">. Dz.U. 2025 poz. 1053.</w:t>
       </w:r>
     </w:p>
-    <w:bookmarkEnd w:id="115"/>
-    <w:bookmarkStart w:id="116" w:name="ref-moed2010snip"/>
+    <w:bookmarkEnd w:id="126"/>
+    <w:bookmarkStart w:id="127" w:name="ref-moed2010snip"/>
     <w:p>
       <w:pPr>
         <w:pStyle w:val="Bibliography"/>
@@ -17845,8 +17860,8 @@
         <w:t xml:space="preserve">4 (3): 265–77.</w:t>
       </w:r>
     </w:p>
-    <w:bookmarkEnd w:id="116"/>
-    <w:bookmarkStart w:id="118" w:name="Xf57435758c1415795137dce9045dde0a68674c8"/>
+    <w:bookmarkEnd w:id="127"/>
+    <w:bookmarkStart w:id="129" w:name="Xf57435758c1415795137dce9045dde0a68674c8"/>
     <w:p>
       <w:pPr>
         <w:pStyle w:val="Bibliography"/>
@@ -17882,7 +17897,7 @@
       <w:r>
         <w:t xml:space="preserve"> </w:t>
       </w:r>
-      <w:hyperlink r:id="rId117">
+      <w:hyperlink r:id="rId128">
         <w:r>
           <w:rPr>
             <w:rStyle w:val="Hyperlink"/>
@@ -17894,14 +17909,14 @@
         <w:t xml:space="preserve">.</w:t>
       </w:r>
     </w:p>
-    <w:bookmarkEnd w:id="118"/>
-    <w:bookmarkStart w:id="119" w:name="ref-newman2006"/>
+    <w:bookmarkEnd w:id="129"/>
+    <w:bookmarkStart w:id="130" w:name="ref-newman2006"/>
     <w:p>
       <w:pPr>
         <w:pStyle w:val="Bibliography"/>
       </w:pPr>
       <w:r>
-        <w:t xml:space="preserve">Newman, Mark E. J. 2006.</w:t>
+        <w:t xml:space="preserve">———. 2006.</w:t>
       </w:r>
       <w:r>
         <w:t xml:space="preserve"> </w:t>
@@ -17929,8 +17944,8 @@
         <w:t xml:space="preserve">103 (23): 8577–82.</w:t>
       </w:r>
     </w:p>
-    <w:bookmarkEnd w:id="119"/>
-    <w:bookmarkStart w:id="120" w:name="ref-Opalinski2017"/>
+    <w:bookmarkEnd w:id="130"/>
+    <w:bookmarkStart w:id="131" w:name="ref-Opalinski2017"/>
     <w:p>
       <w:pPr>
         <w:pStyle w:val="Bibliography"/>
@@ -17964,8 +17979,8 @@
         <w:t xml:space="preserve">55 (1): 34–65.</w:t>
       </w:r>
     </w:p>
-    <w:bookmarkEnd w:id="120"/>
-    <w:bookmarkStart w:id="121" w:name="ref-openalex2022"/>
+    <w:bookmarkEnd w:id="131"/>
+    <w:bookmarkStart w:id="132" w:name="ref-openalex2022"/>
     <w:p>
       <w:pPr>
         <w:pStyle w:val="Bibliography"/>
@@ -17996,8 +18011,8 @@
         <w:t xml:space="preserve">.</w:t>
       </w:r>
     </w:p>
-    <w:bookmarkEnd w:id="121"/>
-    <w:bookmarkStart w:id="123" w:name="Xfa806a68882317565cd91e2502e10e0c6dc8daa"/>
+    <w:bookmarkEnd w:id="132"/>
+    <w:bookmarkStart w:id="134" w:name="Xfa806a68882317565cd91e2502e10e0c6dc8daa"/>
     <w:p>
       <w:pPr>
         <w:pStyle w:val="Bibliography"/>
@@ -18052,12 +18067,12 @@
         <w:t xml:space="preserve">ITlib. Informačné technológie a knižnice</w:t>
       </w:r>
       <w:r>
-        <w:t xml:space="preserve">, advance online publication.</w:t>
+        <w:t xml:space="preserve">.</w:t>
       </w:r>
       <w:r>
         <w:t xml:space="preserve"> </w:t>
       </w:r>
-      <w:hyperlink r:id="rId122">
+      <w:hyperlink r:id="rId133">
         <w:r>
           <w:rPr>
             <w:rStyle w:val="Hyperlink"/>
@@ -18069,8 +18084,8 @@
         <w:t xml:space="preserve">.</w:t>
       </w:r>
     </w:p>
-    <w:bookmarkEnd w:id="123"/>
-    <w:bookmarkStart w:id="124" w:name="ref-waltman2016review"/>
+    <w:bookmarkEnd w:id="134"/>
+    <w:bookmarkStart w:id="135" w:name="ref-waltman2016review"/>
     <w:p>
       <w:pPr>
         <w:pStyle w:val="Bibliography"/>
@@ -18104,8 +18119,8 @@
         <w:t xml:space="preserve">10 (2): 365–91.</w:t>
       </w:r>
     </w:p>
-    <w:bookmarkEnd w:id="124"/>
-    <w:bookmarkStart w:id="126" w:name="ref-omegapsir2024"/>
+    <w:bookmarkEnd w:id="135"/>
+    <w:bookmarkStart w:id="137" w:name="ref-omegapsir2024"/>
     <w:p>
       <w:pPr>
         <w:pStyle w:val="Bibliography"/>
@@ -18117,11 +18132,7 @@
         <w:t xml:space="preserve"> </w:t>
       </w:r>
       <w:r>
-        <w:rPr>
-          <w:i/>
-          <w:iCs/>
-        </w:rPr>
-        <w:t xml:space="preserve">Omega-PSIR: University Research Information System</w:t>
+        <w:t xml:space="preserve">„Omega-PSIR: University Research Information System”</w:t>
       </w:r>
       <w:r>
         <w:t xml:space="preserve">.</w:t>
@@ -18129,7 +18140,7 @@
       <w:r>
         <w:t xml:space="preserve"> </w:t>
       </w:r>
-      <w:hyperlink r:id="rId125">
+      <w:hyperlink r:id="rId136">
         <w:r>
           <w:rPr>
             <w:rStyle w:val="Hyperlink"/>
@@ -18141,8 +18152,8 @@
         <w:t xml:space="preserve">.</w:t>
       </w:r>
     </w:p>
-    <w:bookmarkEnd w:id="126"/>
-    <w:bookmarkStart w:id="127" w:name="ref-winkler1990"/>
+    <w:bookmarkEnd w:id="137"/>
+    <w:bookmarkStart w:id="138" w:name="ref-winkler1990"/>
     <w:p>
       <w:pPr>
         <w:pStyle w:val="Bibliography"/>
@@ -18185,8 +18196,8 @@
         <w:t xml:space="preserve">, 354–59.</w:t>
       </w:r>
     </w:p>
-    <w:bookmarkEnd w:id="127"/>
-    <w:bookmarkStart w:id="128" w:name="ref-youden1950"/>
+    <w:bookmarkEnd w:id="138"/>
+    <w:bookmarkStart w:id="139" w:name="ref-youden1950"/>
     <w:p>
       <w:pPr>
         <w:pStyle w:val="Bibliography"/>
@@ -18220,9 +18231,9 @@
         <w:t xml:space="preserve">3 (1): 32–35.</w:t>
       </w:r>
     </w:p>
-    <w:bookmarkEnd w:id="128"/>
-    <w:bookmarkEnd w:id="129"/>
-    <w:bookmarkEnd w:id="130"/>
+    <w:bookmarkEnd w:id="139"/>
+    <w:bookmarkEnd w:id="140"/>
+    <w:bookmarkEnd w:id="141"/>
     <w:sectPr>
       <w:footnotePr>
         <w:numRestart w:val="eachSect"/>
@@ -18571,10 +18582,10 @@
   <w:docDefaults>
     <w:rPrDefault>
       <w:rPr>
-        <w:rFonts w:asciiTheme="minorHAnsi" w:cstheme="minorBidi" w:eastAsiaTheme="minorEastAsia" w:hAnsiTheme="minorHAnsi"/>
+        <w:rFonts w:asciiTheme="minorHAnsi" w:cstheme="minorBidi" w:eastAsiaTheme="minorHAnsi" w:hAnsiTheme="minorHAnsi"/>
         <w:sz w:val="24"/>
         <w:szCs w:val="24"/>
-        <w:lang w:bidi="ar-SA" w:eastAsia="zh-CN" w:val="pl"/>
+        <w:lang w:bidi="ar-SA" w:eastAsia="en-US" w:val="pl"/>
       </w:rPr>
     </w:rPrDefault>
     <w:pPrDefault>
@@ -19115,6 +19126,13 @@
       </w:tblCellMar>
     </w:tblPr>
     <w:tblStylePr w:type="firstRow">
+      <w:tblPr>
+        <w:jc w:val="left"/>
+        <w:tblInd w:type="dxa" w:w="0"/>
+      </w:tblPr>
+      <w:trPr>
+        <w:jc w:val="left"/>
+      </w:trPr>
       <w:tcPr>
         <w:tcBorders>
           <w:bottom w:val="single"/>

</xml_diff>

<commit_message>
Auto sync z dom - 2026-06-27 09:11
</commit_message>
<xml_diff>
--- a/Praca_dyplomowa/praca_dyplomowa.docx
+++ b/Praca_dyplomowa/praca_dyplomowa.docx
@@ -939,7 +939,7 @@
         <w:pStyle w:val="BodyText"/>
       </w:pPr>
       <w:r>
-        <w:t xml:space="preserve">Po oczyszczeniu danych z Omega-PSIR uzupełniono je informacjami z OpenAlex. Najpierw dopasowano autorów z badanej próby do rekordów w OpenAlex, wykorzystując identyfikator instytucji ROR oraz podobieństwo imienia i nazwiska. Oparcie powiązania na kanonicznych identyfikatorach (ROR dla instytucji, ORCID dla autorów) jest zgodne z podejściem stosowanym w dedykowanych narzędziach integracji danych OpenAlex w środowisku R</w:t>
+        <w:t xml:space="preserve">Po oczyszczeniu danych z Omega-PSIR uzupełniono je informacjami z OpenAlex. Najpierw dopasowano autorów z badanej próby do rekordów w OpenAlex, wykorzystując identyfikator instytucji ROR oraz podobieństwo imienia i nazwiska. Oparcie powiązania na kanonicznym identyfikatorze instytucji (ROR) jest zgodne z podejściem stosowanym w dedykowanych narzędziach integracji danych OpenAlex w środowisku R</w:t>
       </w:r>
       <w:r>
         <w:t xml:space="preserve"> </w:t>
@@ -1639,7 +1639,6 @@
                 <w:trHeight w:val="360" w:hRule="auto"/>
                 <w:tblHeader/>
               </w:trPr>
-              header1
               <w:tc>
                 <w:tcPr>
                   <w:tcBorders>
@@ -2239,7 +2238,6 @@
               <w:trPr>
                 <w:trHeight w:val="360" w:hRule="auto"/>
               </w:trPr>
-              body1
               <w:tc>
                 <w:tcPr>
                   <w:tcBorders>
@@ -2839,7 +2837,6 @@
               <w:trPr>
                 <w:trHeight w:val="360" w:hRule="auto"/>
               </w:trPr>
-              body2
               <w:tc>
                 <w:tcPr>
                   <w:tcBorders>
@@ -3439,7 +3436,6 @@
               <w:trPr>
                 <w:trHeight w:val="360" w:hRule="auto"/>
               </w:trPr>
-              body3
               <w:tc>
                 <w:tcPr>
                   <w:tcBorders>
@@ -4039,7 +4035,6 @@
               <w:trPr>
                 <w:trHeight w:val="360" w:hRule="auto"/>
               </w:trPr>
-              body4
               <w:tc>
                 <w:tcPr>
                   <w:tcBorders>
@@ -4639,7 +4634,6 @@
               <w:trPr>
                 <w:trHeight w:val="360" w:hRule="auto"/>
               </w:trPr>
-              body5
               <w:tc>
                 <w:tcPr>
                   <w:tcBorders>
@@ -5239,7 +5233,6 @@
               <w:trPr>
                 <w:trHeight w:val="360" w:hRule="auto"/>
               </w:trPr>
-              footer1
               <w:tc>
                 <w:tcPr>
                   <w:gridSpan w:val="11"/>
@@ -5300,7 +5293,6 @@
               <w:trPr>
                 <w:trHeight w:val="360" w:hRule="auto"/>
               </w:trPr>
-              footer2
               <w:tc>
                 <w:tcPr>
                   <w:gridSpan w:val="11"/>
@@ -6066,7 +6058,6 @@
                 <w:trHeight w:val="360" w:hRule="auto"/>
                 <w:tblHeader/>
               </w:trPr>
-              header1
               <w:tc>
                 <w:tcPr>
                   <w:tcBorders>
@@ -6342,7 +6333,6 @@
               <w:trPr>
                 <w:trHeight w:val="360" w:hRule="auto"/>
               </w:trPr>
-              body1
               <w:tc>
                 <w:tcPr>
                   <w:tcBorders>
@@ -6618,7 +6608,6 @@
               <w:trPr>
                 <w:trHeight w:val="360" w:hRule="auto"/>
               </w:trPr>
-              body2
               <w:tc>
                 <w:tcPr>
                   <w:tcBorders>
@@ -6894,7 +6883,6 @@
               <w:trPr>
                 <w:trHeight w:val="360" w:hRule="auto"/>
               </w:trPr>
-              body3
               <w:tc>
                 <w:tcPr>
                   <w:tcBorders>
@@ -7170,7 +7158,6 @@
               <w:trPr>
                 <w:trHeight w:val="360" w:hRule="auto"/>
               </w:trPr>
-              body4
               <w:tc>
                 <w:tcPr>
                   <w:tcBorders>
@@ -7446,7 +7433,6 @@
               <w:trPr>
                 <w:trHeight w:val="360" w:hRule="auto"/>
               </w:trPr>
-              body5
               <w:tc>
                 <w:tcPr>
                   <w:tcBorders>
@@ -7722,7 +7708,6 @@
               <w:trPr>
                 <w:trHeight w:val="360" w:hRule="auto"/>
               </w:trPr>
-              body6
               <w:tc>
                 <w:tcPr>
                   <w:tcBorders>
@@ -7998,7 +7983,6 @@
               <w:trPr>
                 <w:trHeight w:val="360" w:hRule="auto"/>
               </w:trPr>
-              footer1
               <w:tc>
                 <w:tcPr>
                   <w:gridSpan w:val="5"/>
@@ -8342,7 +8326,6 @@
                 <w:trHeight w:val="360" w:hRule="auto"/>
                 <w:tblHeader/>
               </w:trPr>
-              header1
               <w:tc>
                 <w:tcPr>
                   <w:tcBorders>
@@ -8672,7 +8655,6 @@
               <w:trPr>
                 <w:trHeight w:val="360" w:hRule="auto"/>
               </w:trPr>
-              body1
               <w:tc>
                 <w:tcPr>
                   <w:tcBorders>
@@ -9002,7 +8984,6 @@
               <w:trPr>
                 <w:trHeight w:val="360" w:hRule="auto"/>
               </w:trPr>
-              body2
               <w:tc>
                 <w:tcPr>
                   <w:tcBorders>
@@ -9465,7 +9446,6 @@
                 <w:trHeight w:val="360" w:hRule="auto"/>
                 <w:tblHeader/>
               </w:trPr>
-              header1
               <w:tc>
                 <w:tcPr>
                   <w:tcBorders>
@@ -9795,7 +9775,6 @@
               <w:trPr>
                 <w:trHeight w:val="360" w:hRule="auto"/>
               </w:trPr>
-              body1
               <w:tc>
                 <w:tcPr>
                   <w:tcBorders>
@@ -10125,7 +10104,6 @@
               <w:trPr>
                 <w:trHeight w:val="360" w:hRule="auto"/>
               </w:trPr>
-              body2
               <w:tc>
                 <w:tcPr>
                   <w:tcBorders>
@@ -10455,7 +10433,6 @@
               <w:trPr>
                 <w:trHeight w:val="360" w:hRule="auto"/>
               </w:trPr>
-              body3
               <w:tc>
                 <w:tcPr>
                   <w:tcBorders>
@@ -10785,7 +10762,6 @@
               <w:trPr>
                 <w:trHeight w:val="360" w:hRule="auto"/>
               </w:trPr>
-              body4
               <w:tc>
                 <w:tcPr>
                   <w:tcBorders>
@@ -11115,7 +11091,6 @@
               <w:trPr>
                 <w:trHeight w:val="360" w:hRule="auto"/>
               </w:trPr>
-              body5
               <w:tc>
                 <w:tcPr>
                   <w:tcBorders>
@@ -11445,7 +11420,6 @@
               <w:trPr>
                 <w:trHeight w:val="360" w:hRule="auto"/>
               </w:trPr>
-              footer1
               <w:tc>
                 <w:tcPr>
                   <w:gridSpan w:val="6"/>
@@ -11506,7 +11480,6 @@
               <w:trPr>
                 <w:trHeight w:val="360" w:hRule="auto"/>
               </w:trPr>
-              footer2
               <w:tc>
                 <w:tcPr>
                   <w:gridSpan w:val="6"/>
@@ -11641,7 +11614,6 @@
                 <w:trHeight w:val="360" w:hRule="auto"/>
                 <w:tblHeader/>
               </w:trPr>
-              header1
               <w:tc>
                 <w:tcPr>
                   <w:tcBorders>
@@ -11971,7 +11943,6 @@
               <w:trPr>
                 <w:trHeight w:val="360" w:hRule="auto"/>
               </w:trPr>
-              body1
               <w:tc>
                 <w:tcPr>
                   <w:tcBorders>
@@ -12301,7 +12272,6 @@
               <w:trPr>
                 <w:trHeight w:val="360" w:hRule="auto"/>
               </w:trPr>
-              body2
               <w:tc>
                 <w:tcPr>
                   <w:tcBorders>
@@ -12631,7 +12601,6 @@
               <w:trPr>
                 <w:trHeight w:val="360" w:hRule="auto"/>
               </w:trPr>
-              body3
               <w:tc>
                 <w:tcPr>
                   <w:tcBorders>
@@ -12961,7 +12930,6 @@
               <w:trPr>
                 <w:trHeight w:val="360" w:hRule="auto"/>
               </w:trPr>
-              footer1
               <w:tc>
                 <w:tcPr>
                   <w:gridSpan w:val="6"/>
@@ -13022,7 +12990,6 @@
               <w:trPr>
                 <w:trHeight w:val="360" w:hRule="auto"/>
               </w:trPr>
-              footer2
               <w:tc>
                 <w:tcPr>
                   <w:gridSpan w:val="6"/>
@@ -13236,7 +13203,6 @@
                 <w:trHeight w:val="360" w:hRule="auto"/>
                 <w:tblHeader/>
               </w:trPr>
-              header1
               <w:tc>
                 <w:tcPr>
                   <w:tcBorders>
@@ -13512,7 +13478,6 @@
               <w:trPr>
                 <w:trHeight w:val="360" w:hRule="auto"/>
               </w:trPr>
-              body1
               <w:tc>
                 <w:tcPr>
                   <w:tcBorders>
@@ -13788,7 +13753,6 @@
               <w:trPr>
                 <w:trHeight w:val="360" w:hRule="auto"/>
               </w:trPr>
-              body2
               <w:tc>
                 <w:tcPr>
                   <w:tcBorders>
@@ -14064,7 +14028,6 @@
               <w:trPr>
                 <w:trHeight w:val="360" w:hRule="auto"/>
               </w:trPr>
-              footer1
               <w:tc>
                 <w:tcPr>
                   <w:gridSpan w:val="5"/>
@@ -14125,7 +14088,6 @@
               <w:trPr>
                 <w:trHeight w:val="360" w:hRule="auto"/>
               </w:trPr>
-              footer2
               <w:tc>
                 <w:tcPr>
                   <w:gridSpan w:val="5"/>
@@ -14303,7 +14265,6 @@
                 <w:trHeight w:val="360" w:hRule="auto"/>
                 <w:tblHeader/>
               </w:trPr>
-              header1
               <w:tc>
                 <w:tcPr>
                   <w:tcBorders>
@@ -14579,7 +14540,6 @@
               <w:trPr>
                 <w:trHeight w:val="360" w:hRule="auto"/>
               </w:trPr>
-              body1
               <w:tc>
                 <w:tcPr>
                   <w:tcBorders>
@@ -14855,7 +14815,6 @@
               <w:trPr>
                 <w:trHeight w:val="360" w:hRule="auto"/>
               </w:trPr>
-              body2
               <w:tc>
                 <w:tcPr>
                   <w:tcBorders>
@@ -15131,7 +15090,6 @@
               <w:trPr>
                 <w:trHeight w:val="360" w:hRule="auto"/>
               </w:trPr>
-              footer1
               <w:tc>
                 <w:tcPr>
                   <w:gridSpan w:val="5"/>
@@ -15192,7 +15150,6 @@
               <w:trPr>
                 <w:trHeight w:val="360" w:hRule="auto"/>
               </w:trPr>
-              footer2
               <w:tc>
                 <w:tcPr>
                   <w:gridSpan w:val="5"/>
@@ -15728,7 +15685,6 @@
                 <w:trHeight w:val="360" w:hRule="auto"/>
                 <w:tblHeader/>
               </w:trPr>
-              header1
               <w:tc>
                 <w:tcPr>
                   <w:tcBorders>
@@ -15896,7 +15852,6 @@
               <w:trPr>
                 <w:trHeight w:val="360" w:hRule="auto"/>
               </w:trPr>
-              body1
               <w:tc>
                 <w:tcPr>
                   <w:tcBorders>
@@ -16064,7 +16019,6 @@
               <w:trPr>
                 <w:trHeight w:val="360" w:hRule="auto"/>
               </w:trPr>
-              body2
               <w:tc>
                 <w:tcPr>
                   <w:tcBorders>
@@ -16232,7 +16186,6 @@
               <w:trPr>
                 <w:trHeight w:val="360" w:hRule="auto"/>
               </w:trPr>
-              footer1
               <w:tc>
                 <w:tcPr>
                   <w:gridSpan w:val="3"/>
@@ -16293,7 +16246,6 @@
               <w:trPr>
                 <w:trHeight w:val="360" w:hRule="auto"/>
               </w:trPr>
-              footer2
               <w:tc>
                 <w:tcPr>
                   <w:gridSpan w:val="3"/>

</xml_diff>

<commit_message>
Auto sync z dom - 2026-07-02 07:45
</commit_message>
<xml_diff>
--- a/Praca_dyplomowa/praca_dyplomowa.docx
+++ b/Praca_dyplomowa/praca_dyplomowa.docx
@@ -39,7 +39,7 @@
         <w:br w:type="page"/>
       </w:r>
     </w:p>
-    <w:bookmarkStart w:id="20" w:name="streszczenie"/>
+    <w:bookmarkStart w:id="9" w:name="streszczenie"/>
     <w:p>
       <w:pPr>
         <w:pStyle w:val="Heading1"/>
@@ -121,8 +121,8 @@
         <w:br w:type="page"/>
       </w:r>
     </w:p>
-    <w:bookmarkEnd w:id="20"/>
-    <w:bookmarkStart w:id="24" w:name="wprowadzenie"/>
+    <w:bookmarkEnd w:id="9"/>
+    <w:bookmarkStart w:id="13" w:name="wprowadzenie"/>
     <w:p>
       <w:pPr>
         <w:pStyle w:val="Heading1"/>
@@ -131,7 +131,7 @@
         <w:t xml:space="preserve">Wprowadzenie</w:t>
       </w:r>
     </w:p>
-    <w:bookmarkStart w:id="21" w:name="Xbef39e353cf405a5f8b815f593e50b94b49cae3"/>
+    <w:bookmarkStart w:id="10" w:name="Xbef39e353cf405a5f8b815f593e50b94b49cae3"/>
     <w:p>
       <w:pPr>
         <w:pStyle w:val="Heading2"/>
@@ -349,7 +349,7 @@
           <w:rPr>
             <w:rStyle w:val="Hyperlink"/>
           </w:rPr>
-          <w:t xml:space="preserve">Grygiel, Rębisz, i Humenny 2009</w:t>
+          <w:t xml:space="preserve">Grygiel et al. 2009</w:t>
         </w:r>
       </w:hyperlink>
       <w:r>
@@ -384,8 +384,8 @@
         <w:br w:type="page"/>
       </w:r>
     </w:p>
-    <w:bookmarkEnd w:id="21"/>
-    <w:bookmarkStart w:id="22" w:name="cel-pracy"/>
+    <w:bookmarkEnd w:id="10"/>
+    <w:bookmarkStart w:id="11" w:name="cel-pracy"/>
     <w:p>
       <w:pPr>
         <w:pStyle w:val="Heading2"/>
@@ -430,7 +430,7 @@
           <w:rPr>
             <w:rStyle w:val="Hyperlink"/>
           </w:rPr>
-          <w:t xml:space="preserve">Koperwas i in. 2015</w:t>
+          <w:t xml:space="preserve">Koperwas et al. 2015</w:t>
         </w:r>
       </w:hyperlink>
       <w:r>
@@ -450,7 +450,7 @@
           <w:rPr>
             <w:rStyle w:val="Hyperlink"/>
           </w:rPr>
-          <w:t xml:space="preserve">Rybiński i in. 2018</w:t>
+          <w:t xml:space="preserve">Rybiński et al. 2018</w:t>
         </w:r>
       </w:hyperlink>
       <w:r>
@@ -549,8 +549,8 @@
         <w:br w:type="page"/>
       </w:r>
     </w:p>
-    <w:bookmarkEnd w:id="22"/>
-    <w:bookmarkStart w:id="23" w:name="pytania-badawcze"/>
+    <w:bookmarkEnd w:id="11"/>
+    <w:bookmarkStart w:id="12" w:name="pytania-badawcze"/>
     <w:p>
       <w:pPr>
         <w:pStyle w:val="Heading2"/>
@@ -631,9 +631,9 @@
         <w:t xml:space="preserve">Czy sieć współautorstwa ma charakter głównie wewnątrzuczelniany, czy widoczne są także wspólnoty międzyuczelniane?</w:t>
       </w:r>
     </w:p>
-    <w:bookmarkEnd w:id="23"/>
-    <w:bookmarkEnd w:id="24"/>
-    <w:bookmarkStart w:id="35" w:name="materiał-i-metodyka"/>
+    <w:bookmarkEnd w:id="12"/>
+    <w:bookmarkEnd w:id="13"/>
+    <w:bookmarkStart w:id="24" w:name="materiał-i-metodyka"/>
     <w:p>
       <w:pPr>
         <w:pStyle w:val="Heading1"/>
@@ -642,7 +642,7 @@
         <w:t xml:space="preserve">Materiał i metodyka</w:t>
       </w:r>
     </w:p>
-    <w:bookmarkStart w:id="25" w:name="źródła-danych"/>
+    <w:bookmarkStart w:id="14" w:name="źródła-danych"/>
     <w:p>
       <w:pPr>
         <w:pStyle w:val="Heading2"/>
@@ -771,7 +771,7 @@
           <w:rPr>
             <w:rStyle w:val="Hyperlink"/>
           </w:rPr>
-          <w:t xml:space="preserve">Priem, Piwowar, i Orr 2022</w:t>
+          <w:t xml:space="preserve">Priem et al. 2022</w:t>
         </w:r>
       </w:hyperlink>
       <w:r>
@@ -827,7 +827,19 @@
           <w:rPr>
             <w:rStyle w:val="Hyperlink"/>
           </w:rPr>
-          <w:t xml:space="preserve">Hicks i in. 2015</w:t>
+          <w:t xml:space="preserve">Hicks et al.</w:t>
+        </w:r>
+        <w:r>
+          <w:rPr>
+            <w:rStyle w:val="Hyperlink"/>
+          </w:rPr>
+          <w:t xml:space="preserve"> </w:t>
+        </w:r>
+        <w:r>
+          <w:rPr>
+            <w:rStyle w:val="Hyperlink"/>
+          </w:rPr>
+          <w:t xml:space="preserve">2015</w:t>
         </w:r>
       </w:hyperlink>
       <w:r>
@@ -865,8 +877,8 @@
         <w:t xml:space="preserve">Wskaźniki wykorzystane w tej pracy wybrano dlatego, że są dostępne w porównywalnej formie dla badanych uczelni i pozwalają opisać profil bibliometryczny naukowca.</w:t>
       </w:r>
     </w:p>
-    <w:bookmarkEnd w:id="25"/>
-    <w:bookmarkStart w:id="30" w:name="procedura-pozyskania-danych"/>
+    <w:bookmarkEnd w:id="14"/>
+    <w:bookmarkStart w:id="19" w:name="procedura-pozyskania-danych"/>
     <w:p>
       <w:pPr>
         <w:pStyle w:val="Heading2"/>
@@ -952,7 +964,7 @@
           <w:rPr>
             <w:rStyle w:val="Hyperlink"/>
           </w:rPr>
-          <w:t xml:space="preserve">Aria i in. 2024</w:t>
+          <w:t xml:space="preserve">Aria et al. 2024</w:t>
         </w:r>
       </w:hyperlink>
       <w:r>
@@ -982,17 +994,17 @@
     <w:tbl>
       <w:tblPr>
         <w:tblStyle w:val="Table"/>
-        <w:tblW w:type="pct" w:w="5000"/>
-        <w:tblLayout w:type="fixed"/>
+        <w:tblW w:type="dxa" w:w="9638"/>
+        <w:tblLayout w:type="autofit"/>
         <w:tblLook w:firstRow="0" w:lastRow="0" w:firstColumn="0" w:lastColumn="0" w:noHBand="0" w:noVBand="0" w:val="0000"/>
       </w:tblPr>
       <w:tblGrid>
-        <w:gridCol w:w="7920"/>
+        <w:gridCol w:w="9638"/>
       </w:tblGrid>
       <w:tr>
         <w:tc>
           <w:tcPr/>
-          <w:bookmarkStart w:id="29" w:name="fig-pipeline"/>
+          <w:bookmarkStart w:id="18" w:name="fig-pipeline"/>
           <w:p>
             <w:pPr>
               <w:pStyle w:val="Compact"/>
@@ -1003,18 +1015,18 @@
                 <wp:inline>
                   <wp:extent cx="4480560" cy="7101092"/>
                   <wp:effectExtent b="0" l="0" r="0" t="0"/>
-                  <wp:docPr descr="" title="" id="27" name="Picture"/>
+                  <wp:docPr descr="" title="" id="16" name="Picture"/>
                   <a:graphic>
                     <a:graphicData uri="http://schemas.openxmlformats.org/drawingml/2006/picture">
                       <pic:pic>
                         <pic:nvPicPr>
-                          <pic:cNvPr descr="../Wykresy/praca/fig_00_pipeline.png" id="28" name="Picture"/>
+                          <pic:cNvPr descr="../Wykresy/praca/fig_00_pipeline.png" id="17" name="Picture"/>
                           <pic:cNvPicPr>
                             <a:picLocks noChangeArrowheads="1" noChangeAspect="1"/>
                           </pic:cNvPicPr>
                         </pic:nvPicPr>
                         <pic:blipFill>
-                          <a:blip r:embed="rId26"/>
+                          <a:blip r:embed="rId15"/>
                           <a:stretch>
                             <a:fillRect/>
                           </a:stretch>
@@ -1046,7 +1058,7 @@
               <w:jc w:val="center"/>
             </w:pPr>
             <w:pPr>
-              <w:jc w:val="start"/>
+              <w:jc w:val="left"/>
               <w:spacing w:before="200"/>
               <w:pStyle w:val="ImageCaption"/>
             </w:pPr>
@@ -1054,12 +1066,12 @@
               <w:t xml:space="preserve">Rysunek 1: Schemat przepływu danych: od czterech instancji Omega-PSIR przez scraping (Python) i przetwarzanie (R) z uzupełnieniem OpenAlex do zbioru analitycznego i warstw modelowania.</w:t>
             </w:r>
           </w:p>
-          <w:bookmarkEnd w:id="29"/>
+          <w:bookmarkEnd w:id="18"/>
         </w:tc>
       </w:tr>
     </w:tbl>
-    <w:bookmarkEnd w:id="30"/>
-    <w:bookmarkStart w:id="31" w:name="metody-analityczne"/>
+    <w:bookmarkEnd w:id="19"/>
+    <w:bookmarkStart w:id="20" w:name="metody-analityczne"/>
     <w:p>
       <w:pPr>
         <w:pStyle w:val="Heading2"/>
@@ -1369,7 +1381,7 @@
           <w:rPr>
             <w:rStyle w:val="Hyperlink"/>
           </w:rPr>
-          <w:t xml:space="preserve">Blondel i in. 2008</w:t>
+          <w:t xml:space="preserve">Blondel et al. 2008</w:t>
         </w:r>
       </w:hyperlink>
       <w:r>
@@ -1402,8 +1414,8 @@
         <w:t xml:space="preserve">wykorzystano do oceny, jak wyraźnie sieć dzieli się na wspólnoty. Dzięki temu można było sprawdzić, czy współpraca przebiega głównie w obrębie jednej uczelni, czy także między uczelniami.</w:t>
       </w:r>
     </w:p>
-    <w:bookmarkEnd w:id="31"/>
-    <w:bookmarkStart w:id="32" w:name="narzędzia-i-środowisko-obliczeniowe"/>
+    <w:bookmarkEnd w:id="20"/>
+    <w:bookmarkStart w:id="21" w:name="narzędzia-i-środowisko-obliczeniowe"/>
     <w:p>
       <w:pPr>
         <w:pStyle w:val="Heading2"/>
@@ -1428,8 +1440,8 @@
         <w:t xml:space="preserve">W pracy pomocniczo wykorzystano duże modele językowe (LLM): Claude (Anthropic), Codex (OpenAI) oraz Gemini (Google). Posłużyły one jako narzędzia wsparcia technicznego i redakcyjnego: do przeglądu i porządkowania kodu, wykrywania niespójności w tekście i danych, redakcyjnego dopracowania języka oraz krytycznej rewizji fragmentów pracy. Modele nie były źródłem danych empirycznych ani nie prowadziły samodzielnego wnioskowania statystycznego; wszystkie obliczenia, decyzje metodyczne i interpretacje wyników pozostają autorskie i wykonano je opisanymi skryptami Python i R. Informacja odnosi się do stanu z okresu przygotowania pracy (2026); wykorzystano model Claude Opus 4.8 (środowisko Claude Code), Codex oparty na modelu GPT-5.5 (OpenAI) oraz model Gemini 3.5 Flash (Gemini CLI, Google).</w:t>
       </w:r>
     </w:p>
-    <w:bookmarkEnd w:id="32"/>
-    <w:bookmarkStart w:id="34" w:name="dostępność-kodu-i-danych"/>
+    <w:bookmarkEnd w:id="21"/>
+    <w:bookmarkStart w:id="23" w:name="dostępność-kodu-i-danych"/>
     <w:p>
       <w:pPr>
         <w:pStyle w:val="Heading2"/>
@@ -1448,7 +1460,7 @@
       <w:r>
         <w:t xml:space="preserve"> </w:t>
       </w:r>
-      <w:hyperlink r:id="rId33">
+      <w:hyperlink r:id="rId22">
         <w:r>
           <w:rPr>
             <w:rStyle w:val="Hyperlink"/>
@@ -1468,9 +1480,9 @@
         <w:t xml:space="preserve">Wykorzystane dane pochodzą z publicznie dostępnych uczelnianych Baz Wiedzy (systemów CRIS Omega-PSIR) oraz z otwartej bazy OpenAlex i dotyczą wyłącznie działalności naukowej pracowników (dorobek publikacyjny, afiliacje, identyfikatory ORCID), czyli danych zawodowych jawnie udostępnionych przez same uczelnie. Nie obejmują one danych szczególnych kategorii w rozumieniu art. 9 RODO. Przetwarzania dokonano wyłącznie w celach naukowo-badawczych i w formie zagregowanej, w oparciu o prawnie uzasadniony interes administratora (art. 6 ust. 1 lit. f RODO) oraz z uwzględnieniem zasad przetwarzania danych do celów badań naukowych (art. 89 RODO); analiza nie służy ocenie ani profilowaniu poszczególnych osób.</w:t>
       </w:r>
     </w:p>
-    <w:bookmarkEnd w:id="34"/>
-    <w:bookmarkEnd w:id="35"/>
-    <w:bookmarkStart w:id="91" w:name="wyniki"/>
+    <w:bookmarkEnd w:id="23"/>
+    <w:bookmarkEnd w:id="24"/>
+    <w:bookmarkStart w:id="80" w:name="wyniki"/>
     <w:p>
       <w:pPr>
         <w:pStyle w:val="Heading1"/>
@@ -1479,7 +1491,7 @@
         <w:t xml:space="preserve">Wyniki</w:t>
       </w:r>
     </w:p>
-    <w:bookmarkStart w:id="37" w:name="charakterystyka-próby"/>
+    <w:bookmarkStart w:id="26" w:name="charakterystyka-próby"/>
     <w:p>
       <w:pPr>
         <w:pStyle w:val="Heading2"/>
@@ -1591,23 +1603,23 @@
     <w:tbl>
       <w:tblPr>
         <w:tblStyle w:val="Table"/>
-        <w:tblW w:type="pct" w:w="5000"/>
-        <w:tblLayout w:type="fixed"/>
+        <w:tblW w:type="dxa" w:w="9638"/>
+        <w:tblLayout w:type="autofit"/>
         <w:tblLook w:firstRow="0" w:lastRow="0" w:firstColumn="0" w:lastColumn="0" w:noHBand="0" w:noVBand="0" w:val="0000"/>
       </w:tblPr>
       <w:tblGrid>
-        <w:gridCol w:w="7920"/>
+        <w:gridCol w:w="9638"/>
       </w:tblGrid>
       <w:tr>
         <w:tc>
           <w:tcPr/>
-          <w:bookmarkStart w:id="36" w:name="tbl-proba"/>
+          <w:bookmarkStart w:id="25" w:name="tbl-proba"/>
           <w:p>
             <w:pPr>
               <w:jc w:val="center"/>
             </w:pPr>
             <w:pPr>
-              <w:jc w:val="start"/>
+              <w:jc w:val="left"/>
               <w:spacing w:before="200"/>
               <w:pStyle w:val="ImageCaption"/>
             </w:pPr>
@@ -1617,22 +1629,22 @@
           </w:p>
           <w:tbl xmlns:w="http://schemas.openxmlformats.org/wordprocessingml/2006/main" xmlns:r="http://schemas.openxmlformats.org/officeDocument/2006/relationships" xmlns:w14="http://schemas.microsoft.com/office/word/2010/wordml" xmlns:wp="http://schemas.openxmlformats.org/drawingml/2006/wordprocessingDrawing" xmlns:a="http://schemas.openxmlformats.org/drawingml/2006/main" xmlns:pic="http://schemas.openxmlformats.org/drawingml/2006/picture">
             <w:tblPr>
-              <w:tblLayout w:type="fixed"/>
+              <w:tblLayout w:type="autofit"/>
               <w:jc w:val="center"/>
               <w:tblLook w:firstRow="1" w:lastRow="0" w:firstColumn="0" w:lastColumn="0" w:noHBand="0" w:noVBand="1"/>
             </w:tblPr>
             <w:tblGrid>
-              <w:gridCol w:w="893"/>
-              <w:gridCol w:w="605"/>
-              <w:gridCol w:w="475"/>
-              <w:gridCol w:w="835"/>
-              <w:gridCol w:w="835"/>
-              <w:gridCol w:w="835"/>
-              <w:gridCol w:w="835"/>
-              <w:gridCol w:w="1094"/>
-              <w:gridCol w:w="922"/>
-              <w:gridCol w:w="749"/>
-              <w:gridCol w:w="835"/>
+              <w:gridCol w:w="966"/>
+              <w:gridCol w:w="654"/>
+              <w:gridCol w:w="514"/>
+              <w:gridCol w:w="903"/>
+              <w:gridCol w:w="903"/>
+              <w:gridCol w:w="903"/>
+              <w:gridCol w:w="903"/>
+              <w:gridCol w:w="1183"/>
+              <w:gridCol w:w="997"/>
+              <w:gridCol w:w="810"/>
+              <w:gridCol w:w="902"/>
             </w:tblGrid>
             <w:tr>
               <w:trPr>
@@ -5350,7 +5362,7 @@
               </w:tc>
             </w:tr>
           </w:tbl>
-          <w:bookmarkEnd w:id="36"/>
+          <w:bookmarkEnd w:id="25"/>
         </w:tc>
       </w:tr>
     </w:tbl>
@@ -5376,8 +5388,8 @@
         <w:t xml:space="preserve">. Najmniejsza grupa liczyła 13 osób, więc możliwe było porównanie stanowisk między uczelniami.</w:t>
       </w:r>
     </w:p>
-    <w:bookmarkEnd w:id="37"/>
-    <w:bookmarkStart w:id="42" w:name="X02db023cedd07580e5dfe409dd487ced35067e3"/>
+    <w:bookmarkEnd w:id="26"/>
+    <w:bookmarkStart w:id="31" w:name="X02db023cedd07580e5dfe409dd487ced35067e3"/>
     <w:p>
       <w:pPr>
         <w:pStyle w:val="Heading2"/>
@@ -5440,17 +5452,17 @@
     <w:tbl>
       <w:tblPr>
         <w:tblStyle w:val="Table"/>
-        <w:tblW w:type="pct" w:w="5000"/>
-        <w:tblLayout w:type="fixed"/>
+        <w:tblW w:type="dxa" w:w="9638"/>
+        <w:tblLayout w:type="autofit"/>
         <w:tblLook w:firstRow="0" w:lastRow="0" w:firstColumn="0" w:lastColumn="0" w:noHBand="0" w:noVBand="0" w:val="0000"/>
       </w:tblPr>
       <w:tblGrid>
-        <w:gridCol w:w="7920"/>
+        <w:gridCol w:w="9638"/>
       </w:tblGrid>
       <w:tr>
         <w:tc>
           <w:tcPr/>
-          <w:bookmarkStart w:id="41" w:name="fig-korelacje"/>
+          <w:bookmarkStart w:id="30" w:name="fig-korelacje"/>
           <w:p>
             <w:pPr>
               <w:pStyle w:val="Compact"/>
@@ -5461,18 +5473,18 @@
                 <wp:inline>
                   <wp:extent cx="5334000" cy="4533900"/>
                   <wp:effectExtent b="0" l="0" r="0" t="0"/>
-                  <wp:docPr descr="" title="" id="39" name="Picture"/>
+                  <wp:docPr descr="" title="" id="28" name="Picture"/>
                   <a:graphic>
                     <a:graphicData uri="http://schemas.openxmlformats.org/drawingml/2006/picture">
                       <pic:pic>
                         <pic:nvPicPr>
-                          <pic:cNvPr descr="../Wykresy/praca/fig_01b_korelacje.png" id="40" name="Picture"/>
+                          <pic:cNvPr descr="../Wykresy/praca/fig_01b_korelacje.png" id="29" name="Picture"/>
                           <pic:cNvPicPr>
                             <a:picLocks noChangeArrowheads="1" noChangeAspect="1"/>
                           </pic:cNvPicPr>
                         </pic:nvPicPr>
                         <pic:blipFill>
-                          <a:blip r:embed="rId38"/>
+                          <a:blip r:embed="rId27"/>
                           <a:stretch>
                             <a:fillRect/>
                           </a:stretch>
@@ -5504,7 +5516,7 @@
               <w:jc w:val="center"/>
             </w:pPr>
             <w:pPr>
-              <w:jc w:val="start"/>
+              <w:jc w:val="left"/>
               <w:spacing w:before="200"/>
               <w:pStyle w:val="ImageCaption"/>
             </w:pPr>
@@ -5512,12 +5524,12 @@
               <w:t xml:space="preserve">Rysunek 2: Macierz korelacji Pearsona sześciu wskaźników bibliometrycznych. Wyraźny blok metryk skumulowanego wpływu (h-index, sumaryczny IF, punktacja MEiN; r 0,82–0,95) kontrastuje z liczbą publikacji, powiązaną z nim tylko umiarkowanie (r 0,36–0,44), oraz z IF na publikację, tworzącym odrębną oś jakości, ujemnie skorelowaną z liczbą publikacji.</w:t>
             </w:r>
           </w:p>
-          <w:bookmarkEnd w:id="41"/>
+          <w:bookmarkEnd w:id="30"/>
         </w:tc>
       </w:tr>
     </w:tbl>
-    <w:bookmarkEnd w:id="42"/>
-    <w:bookmarkStart w:id="60" w:name="X149f1659b4627f11ad84fb72c3cc10571fd0864"/>
+    <w:bookmarkEnd w:id="31"/>
+    <w:bookmarkStart w:id="49" w:name="X149f1659b4627f11ad84fb72c3cc10571fd0864"/>
     <w:p>
       <w:pPr>
         <w:pStyle w:val="Heading2"/>
@@ -5559,17 +5571,17 @@
     <w:tbl>
       <w:tblPr>
         <w:tblStyle w:val="Table"/>
-        <w:tblW w:type="pct" w:w="5000"/>
-        <w:tblLayout w:type="fixed"/>
+        <w:tblW w:type="dxa" w:w="9638"/>
+        <w:tblLayout w:type="autofit"/>
         <w:tblLook w:firstRow="0" w:lastRow="0" w:firstColumn="0" w:lastColumn="0" w:noHBand="0" w:noVBand="0" w:val="0000"/>
       </w:tblPr>
       <w:tblGrid>
-        <w:gridCol w:w="7920"/>
+        <w:gridCol w:w="9638"/>
       </w:tblGrid>
       <w:tr>
         <w:tc>
           <w:tcPr/>
-          <w:bookmarkStart w:id="46" w:name="fig-rozklady"/>
+          <w:bookmarkStart w:id="35" w:name="fig-rozklady"/>
           <w:p>
             <w:pPr>
               <w:pStyle w:val="Compact"/>
@@ -5580,18 +5592,18 @@
                 <wp:inline>
                   <wp:extent cx="5334000" cy="3081866"/>
                   <wp:effectExtent b="0" l="0" r="0" t="0"/>
-                  <wp:docPr descr="" title="" id="44" name="Picture"/>
+                  <wp:docPr descr="" title="" id="33" name="Picture"/>
                   <a:graphic>
                     <a:graphicData uri="http://schemas.openxmlformats.org/drawingml/2006/picture">
                       <pic:pic>
                         <pic:nvPicPr>
-                          <pic:cNvPr descr="../Wykresy/praca/fig_01c_rozklady.png" id="45" name="Picture"/>
+                          <pic:cNvPr descr="../Wykresy/praca/fig_01c_rozklady.png" id="34" name="Picture"/>
                           <pic:cNvPicPr>
                             <a:picLocks noChangeArrowheads="1" noChangeAspect="1"/>
                           </pic:cNvPicPr>
                         </pic:nvPicPr>
                         <pic:blipFill>
-                          <a:blip r:embed="rId43"/>
+                          <a:blip r:embed="rId32"/>
                           <a:stretch>
                             <a:fillRect/>
                           </a:stretch>
@@ -5623,7 +5635,7 @@
               <w:jc w:val="center"/>
             </w:pPr>
             <w:pPr>
-              <w:jc w:val="start"/>
+              <w:jc w:val="left"/>
               <w:spacing w:before="200"/>
               <w:pStyle w:val="ImageCaption"/>
             </w:pPr>
@@ -5631,7 +5643,7 @@
               <w:t xml:space="preserve">Rysunek 3: Rozkłady (gęstości jądrowe) sześciu wskaźników bibliometrycznych w całej próbie. Przewaga długich prawych ogonów i położenie mediany (czerwona linia przerywana) poniżej średniej potwierdzają silną prawoskośność, uzasadniającą wybór testów nieparametrycznych.</w:t>
             </w:r>
           </w:p>
-          <w:bookmarkEnd w:id="46"/>
+          <w:bookmarkEnd w:id="35"/>
         </w:tc>
       </w:tr>
     </w:tbl>
@@ -5717,17 +5729,17 @@
     <w:tbl>
       <w:tblPr>
         <w:tblStyle w:val="Table"/>
-        <w:tblW w:type="pct" w:w="5000"/>
-        <w:tblLayout w:type="fixed"/>
+        <w:tblW w:type="dxa" w:w="9638"/>
+        <w:tblLayout w:type="autofit"/>
         <w:tblLook w:firstRow="0" w:lastRow="0" w:firstColumn="0" w:lastColumn="0" w:noHBand="0" w:noVBand="0" w:val="0000"/>
       </w:tblPr>
       <w:tblGrid>
-        <w:gridCol w:w="7920"/>
+        <w:gridCol w:w="9638"/>
       </w:tblGrid>
       <w:tr>
         <w:tc>
           <w:tcPr/>
-          <w:bookmarkStart w:id="50" w:name="fig-hindex"/>
+          <w:bookmarkStart w:id="39" w:name="fig-hindex"/>
           <w:p>
             <w:pPr>
               <w:pStyle w:val="Compact"/>
@@ -5738,18 +5750,18 @@
                 <wp:inline>
                   <wp:extent cx="5334000" cy="3388658"/>
                   <wp:effectExtent b="0" l="0" r="0" t="0"/>
-                  <wp:docPr descr="" title="" id="48" name="Picture"/>
+                  <wp:docPr descr="" title="" id="37" name="Picture"/>
                   <a:graphic>
                     <a:graphicData uri="http://schemas.openxmlformats.org/drawingml/2006/picture">
                       <pic:pic>
                         <pic:nvPicPr>
-                          <pic:cNvPr descr="../Wykresy/praca/fig_02a_hindex.png" id="49" name="Picture"/>
+                          <pic:cNvPr descr="../Wykresy/praca/fig_02a_hindex.png" id="38" name="Picture"/>
                           <pic:cNvPicPr>
                             <a:picLocks noChangeArrowheads="1" noChangeAspect="1"/>
                           </pic:cNvPicPr>
                         </pic:nvPicPr>
                         <pic:blipFill>
-                          <a:blip r:embed="rId47"/>
+                          <a:blip r:embed="rId36"/>
                           <a:stretch>
                             <a:fillRect/>
                           </a:stretch>
@@ -5781,7 +5793,7 @@
               <w:jc w:val="center"/>
             </w:pPr>
             <w:pPr>
-              <w:jc w:val="start"/>
+              <w:jc w:val="left"/>
               <w:spacing w:before="200"/>
               <w:pStyle w:val="ImageCaption"/>
             </w:pPr>
@@ -5789,7 +5801,7 @@
               <w:t xml:space="preserve">Rysunek 4: Wykres pudełkowy h-index (WoS) w dwuczynnikowym układzie uczelnia × stanowisko; oznaczenia grup jednorodnych (CLD) opisano w tekście powyżej.</w:t>
             </w:r>
           </w:p>
-          <w:bookmarkEnd w:id="50"/>
+          <w:bookmarkEnd w:id="39"/>
         </w:tc>
       </w:tr>
     </w:tbl>
@@ -5804,17 +5816,17 @@
     <w:tbl>
       <w:tblPr>
         <w:tblStyle w:val="Table"/>
-        <w:tblW w:type="pct" w:w="5000"/>
-        <w:tblLayout w:type="fixed"/>
+        <w:tblW w:type="dxa" w:w="9638"/>
+        <w:tblLayout w:type="autofit"/>
         <w:tblLook w:firstRow="0" w:lastRow="0" w:firstColumn="0" w:lastColumn="0" w:noHBand="0" w:noVBand="0" w:val="0000"/>
       </w:tblPr>
       <w:tblGrid>
-        <w:gridCol w:w="7920"/>
+        <w:gridCol w:w="9638"/>
       </w:tblGrid>
       <w:tr>
         <w:tc>
           <w:tcPr/>
-          <w:bookmarkStart w:id="54" w:name="fig-sumif"/>
+          <w:bookmarkStart w:id="43" w:name="fig-sumif"/>
           <w:p>
             <w:pPr>
               <w:pStyle w:val="Compact"/>
@@ -5825,18 +5837,18 @@
                 <wp:inline>
                   <wp:extent cx="5334000" cy="3388658"/>
                   <wp:effectExtent b="0" l="0" r="0" t="0"/>
-                  <wp:docPr descr="" title="" id="52" name="Picture"/>
+                  <wp:docPr descr="" title="" id="41" name="Picture"/>
                   <a:graphic>
                     <a:graphicData uri="http://schemas.openxmlformats.org/drawingml/2006/picture">
                       <pic:pic>
                         <pic:nvPicPr>
-                          <pic:cNvPr descr="../Wykresy/praca/fig_02b_sumif.png" id="53" name="Picture"/>
+                          <pic:cNvPr descr="../Wykresy/praca/fig_02b_sumif.png" id="42" name="Picture"/>
                           <pic:cNvPicPr>
                             <a:picLocks noChangeArrowheads="1" noChangeAspect="1"/>
                           </pic:cNvPicPr>
                         </pic:nvPicPr>
                         <pic:blipFill>
-                          <a:blip r:embed="rId51"/>
+                          <a:blip r:embed="rId40"/>
                           <a:stretch>
                             <a:fillRect/>
                           </a:stretch>
@@ -5868,7 +5880,7 @@
               <w:jc w:val="center"/>
             </w:pPr>
             <w:pPr>
-              <w:jc w:val="start"/>
+              <w:jc w:val="left"/>
               <w:spacing w:before="200"/>
               <w:pStyle w:val="ImageCaption"/>
             </w:pPr>
@@ -5876,7 +5888,7 @@
               <w:t xml:space="preserve">Rysunek 5: Wykres pudełkowy sumarycznego Impact Factor w dwuczynnikowym układzie uczelnia × stanowisko; oznaczenia grup jednorodnych (CLD) opisano w tekście powyżej.</w:t>
             </w:r>
           </w:p>
-          <w:bookmarkEnd w:id="54"/>
+          <w:bookmarkEnd w:id="43"/>
         </w:tc>
       </w:tr>
     </w:tbl>
@@ -5891,17 +5903,17 @@
     <w:tbl>
       <w:tblPr>
         <w:tblStyle w:val="Table"/>
-        <w:tblW w:type="pct" w:w="5000"/>
-        <w:tblLayout w:type="fixed"/>
+        <w:tblW w:type="dxa" w:w="9638"/>
+        <w:tblLayout w:type="autofit"/>
         <w:tblLook w:firstRow="0" w:lastRow="0" w:firstColumn="0" w:lastColumn="0" w:noHBand="0" w:noVBand="0" w:val="0000"/>
       </w:tblPr>
       <w:tblGrid>
-        <w:gridCol w:w="7920"/>
+        <w:gridCol w:w="9638"/>
       </w:tblGrid>
       <w:tr>
         <w:tc>
           <w:tcPr/>
-          <w:bookmarkStart w:id="58" w:name="fig-npub"/>
+          <w:bookmarkStart w:id="47" w:name="fig-npub"/>
           <w:p>
             <w:pPr>
               <w:pStyle w:val="Compact"/>
@@ -5912,18 +5924,18 @@
                 <wp:inline>
                   <wp:extent cx="5334000" cy="3388658"/>
                   <wp:effectExtent b="0" l="0" r="0" t="0"/>
-                  <wp:docPr descr="" title="" id="56" name="Picture"/>
+                  <wp:docPr descr="" title="" id="45" name="Picture"/>
                   <a:graphic>
                     <a:graphicData uri="http://schemas.openxmlformats.org/drawingml/2006/picture">
                       <pic:pic>
                         <pic:nvPicPr>
-                          <pic:cNvPr descr="../Wykresy/praca/fig_02c_npub.png" id="57" name="Picture"/>
+                          <pic:cNvPr descr="../Wykresy/praca/fig_02c_npub.png" id="46" name="Picture"/>
                           <pic:cNvPicPr>
                             <a:picLocks noChangeArrowheads="1" noChangeAspect="1"/>
                           </pic:cNvPicPr>
                         </pic:nvPicPr>
                         <pic:blipFill>
-                          <a:blip r:embed="rId55"/>
+                          <a:blip r:embed="rId44"/>
                           <a:stretch>
                             <a:fillRect/>
                           </a:stretch>
@@ -5955,7 +5967,7 @@
               <w:jc w:val="center"/>
             </w:pPr>
             <w:pPr>
-              <w:jc w:val="start"/>
+              <w:jc w:val="left"/>
               <w:spacing w:before="200"/>
               <w:pStyle w:val="ImageCaption"/>
             </w:pPr>
@@ -5963,7 +5975,7 @@
               <w:t xml:space="preserve">Rysunek 6: Wykres pudełkowy liczby publikacji w dwuczynnikowym układzie uczelnia × stanowisko; oznaczenia grup jednorodnych (CLD) opisano w tekście powyżej.</w:t>
             </w:r>
           </w:p>
-          <w:bookmarkEnd w:id="58"/>
+          <w:bookmarkEnd w:id="47"/>
         </w:tc>
       </w:tr>
     </w:tbl>
@@ -6016,23 +6028,23 @@
     <w:tbl>
       <w:tblPr>
         <w:tblStyle w:val="Table"/>
-        <w:tblW w:type="pct" w:w="5000"/>
-        <w:tblLayout w:type="fixed"/>
+        <w:tblW w:type="dxa" w:w="9638"/>
+        <w:tblLayout w:type="autofit"/>
         <w:tblLook w:firstRow="0" w:lastRow="0" w:firstColumn="0" w:lastColumn="0" w:noHBand="0" w:noVBand="0" w:val="0000"/>
       </w:tblPr>
       <w:tblGrid>
-        <w:gridCol w:w="7920"/>
+        <w:gridCol w:w="9638"/>
       </w:tblGrid>
       <w:tr>
         <w:tc>
           <w:tcPr/>
-          <w:bookmarkStart w:id="59" w:name="tbl-roznicowanie"/>
+          <w:bookmarkStart w:id="48" w:name="tbl-roznicowanie"/>
           <w:p>
             <w:pPr>
               <w:jc w:val="center"/>
             </w:pPr>
             <w:pPr>
-              <w:jc w:val="start"/>
+              <w:jc w:val="left"/>
               <w:spacing w:before="200"/>
               <w:pStyle w:val="ImageCaption"/>
             </w:pPr>
@@ -6042,16 +6054,16 @@
           </w:p>
           <w:tbl xmlns:w="http://schemas.openxmlformats.org/wordprocessingml/2006/main" xmlns:r="http://schemas.openxmlformats.org/officeDocument/2006/relationships" xmlns:w14="http://schemas.microsoft.com/office/word/2010/wordml" xmlns:wp="http://schemas.openxmlformats.org/drawingml/2006/wordprocessingDrawing" xmlns:a="http://schemas.openxmlformats.org/drawingml/2006/main" xmlns:pic="http://schemas.openxmlformats.org/drawingml/2006/picture">
             <w:tblPr>
-              <w:tblLayout w:type="fixed"/>
+              <w:tblLayout w:type="autofit"/>
               <w:jc w:val="center"/>
               <w:tblLook w:firstRow="1" w:lastRow="0" w:firstColumn="0" w:lastColumn="0" w:noHBand="0" w:noVBand="1"/>
             </w:tblPr>
             <w:tblGrid>
-              <w:gridCol w:w="2664"/>
-              <w:gridCol w:w="1368"/>
-              <w:gridCol w:w="1224"/>
-              <w:gridCol w:w="1584"/>
-              <w:gridCol w:w="1512"/>
+              <w:gridCol w:w="3074"/>
+              <w:gridCol w:w="1579"/>
+              <w:gridCol w:w="1412"/>
+              <w:gridCol w:w="1828"/>
+              <w:gridCol w:w="1745"/>
             </w:tblGrid>
             <w:tr>
               <w:trPr>
@@ -8040,7 +8052,7 @@
               </w:tc>
             </w:tr>
           </w:tbl>
-          <w:bookmarkEnd w:id="59"/>
+          <w:bookmarkEnd w:id="48"/>
         </w:tc>
       </w:tr>
     </w:tbl>
@@ -8068,8 +8080,8 @@
         <w:t xml:space="preserve">Podsumowując, wraz z wyższym stanowiskiem rosną wartości większości wskaźników bibliometrycznych. Zależność ta była istotna statystycznie dla pięciu z sześciu analizowanych metryk.</w:t>
       </w:r>
     </w:p>
-    <w:bookmarkEnd w:id="60"/>
-    <w:bookmarkStart w:id="68" w:name="X88ab428eb81e048ab5c69c902d08d12ccb60c6c"/>
+    <w:bookmarkEnd w:id="49"/>
+    <w:bookmarkStart w:id="57" w:name="X88ab428eb81e048ab5c69c902d08d12ccb60c6c"/>
     <w:p>
       <w:pPr>
         <w:pStyle w:val="Heading2"/>
@@ -8153,17 +8165,17 @@
     <w:tbl>
       <w:tblPr>
         <w:tblStyle w:val="Table"/>
-        <w:tblW w:type="pct" w:w="5000"/>
-        <w:tblLayout w:type="fixed"/>
+        <w:tblW w:type="dxa" w:w="9638"/>
+        <w:tblLayout w:type="autofit"/>
         <w:tblLook w:firstRow="0" w:lastRow="0" w:firstColumn="0" w:lastColumn="0" w:noHBand="0" w:noVBand="0" w:val="0000"/>
       </w:tblPr>
       <w:tblGrid>
-        <w:gridCol w:w="7920"/>
+        <w:gridCol w:w="9638"/>
       </w:tblGrid>
       <w:tr>
         <w:tc>
           <w:tcPr/>
-          <w:bookmarkStart w:id="64" w:name="fig-klastry"/>
+          <w:bookmarkStart w:id="53" w:name="fig-klastry"/>
           <w:p>
             <w:pPr>
               <w:pStyle w:val="Compact"/>
@@ -8174,18 +8186,18 @@
                 <wp:inline>
                   <wp:extent cx="5334000" cy="4000499"/>
                   <wp:effectExtent b="0" l="0" r="0" t="0"/>
-                  <wp:docPr descr="" title="" id="62" name="Picture"/>
+                  <wp:docPr descr="" title="" id="51" name="Picture"/>
                   <a:graphic>
                     <a:graphicData uri="http://schemas.openxmlformats.org/drawingml/2006/picture">
                       <pic:pic>
                         <pic:nvPicPr>
-                          <pic:cNvPr descr="../Wykresy/praca/fig_03a_klastry.png" id="63" name="Picture"/>
+                          <pic:cNvPr descr="../Wykresy/praca/fig_03a_klastry.png" id="52" name="Picture"/>
                           <pic:cNvPicPr>
                             <a:picLocks noChangeArrowheads="1" noChangeAspect="1"/>
                           </pic:cNvPicPr>
                         </pic:nvPicPr>
                         <pic:blipFill>
-                          <a:blip r:embed="rId61"/>
+                          <a:blip r:embed="rId50"/>
                           <a:stretch>
                             <a:fillRect/>
                           </a:stretch>
@@ -8217,7 +8229,7 @@
               <w:jc w:val="center"/>
             </w:pPr>
             <w:pPr>
-              <w:jc w:val="start"/>
+              <w:jc w:val="left"/>
               <w:spacing w:before="200"/>
               <w:pStyle w:val="ImageCaption"/>
             </w:pPr>
@@ -8225,7 +8237,7 @@
               <w:t xml:space="preserve">Rysunek 7: Klastrowanie k-means w przestrzeni dwóch pierwszych składowych głównych (PCA).</w:t>
             </w:r>
           </w:p>
-          <w:bookmarkEnd w:id="64"/>
+          <w:bookmarkEnd w:id="53"/>
         </w:tc>
       </w:tr>
     </w:tbl>
@@ -8283,23 +8295,23 @@
     <w:tbl>
       <w:tblPr>
         <w:tblStyle w:val="Table"/>
-        <w:tblW w:type="pct" w:w="5000"/>
-        <w:tblLayout w:type="fixed"/>
+        <w:tblW w:type="dxa" w:w="9638"/>
+        <w:tblLayout w:type="autofit"/>
         <w:tblLook w:firstRow="0" w:lastRow="0" w:firstColumn="0" w:lastColumn="0" w:noHBand="0" w:noVBand="0" w:val="0000"/>
       </w:tblPr>
       <w:tblGrid>
-        <w:gridCol w:w="7920"/>
+        <w:gridCol w:w="9638"/>
       </w:tblGrid>
       <w:tr>
         <w:tc>
           <w:tcPr/>
-          <w:bookmarkStart w:id="65" w:name="tbl-klastry2"/>
+          <w:bookmarkStart w:id="54" w:name="tbl-klastry2"/>
           <w:p>
             <w:pPr>
               <w:jc w:val="center"/>
             </w:pPr>
             <w:pPr>
-              <w:jc w:val="start"/>
+              <w:jc w:val="left"/>
               <w:spacing w:before="200"/>
               <w:pStyle w:val="ImageCaption"/>
             </w:pPr>
@@ -8309,17 +8321,17 @@
           </w:p>
           <w:tbl xmlns:w="http://schemas.openxmlformats.org/wordprocessingml/2006/main" xmlns:r="http://schemas.openxmlformats.org/officeDocument/2006/relationships" xmlns:w14="http://schemas.microsoft.com/office/word/2010/wordml" xmlns:wp="http://schemas.openxmlformats.org/drawingml/2006/wordprocessingDrawing" xmlns:a="http://schemas.openxmlformats.org/drawingml/2006/main" xmlns:pic="http://schemas.openxmlformats.org/drawingml/2006/picture">
             <w:tblPr>
-              <w:tblLayout w:type="fixed"/>
+              <w:tblLayout w:type="autofit"/>
               <w:jc w:val="center"/>
               <w:tblLook w:firstRow="1" w:lastRow="0" w:firstColumn="0" w:lastColumn="0" w:noHBand="0" w:noVBand="1"/>
             </w:tblPr>
             <w:tblGrid>
-              <w:gridCol w:w="2232"/>
-              <w:gridCol w:w="720"/>
-              <w:gridCol w:w="1368"/>
-              <w:gridCol w:w="1512"/>
-              <w:gridCol w:w="1512"/>
-              <w:gridCol w:w="1512"/>
+              <w:gridCol w:w="2429"/>
+              <w:gridCol w:w="784"/>
+              <w:gridCol w:w="1489"/>
+              <w:gridCol w:w="1646"/>
+              <w:gridCol w:w="1646"/>
+              <w:gridCol w:w="1644"/>
             </w:tblGrid>
             <w:tr>
               <w:trPr>
@@ -9310,7 +9322,7 @@
               </w:tc>
             </w:tr>
           </w:tbl>
-          <w:bookmarkEnd w:id="65"/>
+          <w:bookmarkEnd w:id="54"/>
         </w:tc>
       </w:tr>
     </w:tbl>
@@ -9403,23 +9415,23 @@
     <w:tbl>
       <w:tblPr>
         <w:tblStyle w:val="Table"/>
-        <w:tblW w:type="pct" w:w="5000"/>
-        <w:tblLayout w:type="fixed"/>
+        <w:tblW w:type="dxa" w:w="9638"/>
+        <w:tblLayout w:type="autofit"/>
         <w:tblLook w:firstRow="0" w:lastRow="0" w:firstColumn="0" w:lastColumn="0" w:noHBand="0" w:noVBand="0" w:val="0000"/>
       </w:tblPr>
       <w:tblGrid>
-        <w:gridCol w:w="7920"/>
+        <w:gridCol w:w="9638"/>
       </w:tblGrid>
       <w:tr>
         <w:tc>
           <w:tcPr/>
-          <w:bookmarkStart w:id="66" w:name="tbl-replikacja"/>
+          <w:bookmarkStart w:id="55" w:name="tbl-replikacja"/>
           <w:p>
             <w:pPr>
               <w:jc w:val="center"/>
             </w:pPr>
             <w:pPr>
-              <w:jc w:val="start"/>
+              <w:jc w:val="left"/>
               <w:spacing w:before="200"/>
               <w:pStyle w:val="ImageCaption"/>
             </w:pPr>
@@ -9429,17 +9441,17 @@
           </w:p>
           <w:tbl xmlns:w="http://schemas.openxmlformats.org/wordprocessingml/2006/main" xmlns:r="http://schemas.openxmlformats.org/officeDocument/2006/relationships" xmlns:w14="http://schemas.microsoft.com/office/word/2010/wordml" xmlns:wp="http://schemas.openxmlformats.org/drawingml/2006/wordprocessingDrawing" xmlns:a="http://schemas.openxmlformats.org/drawingml/2006/main" xmlns:pic="http://schemas.openxmlformats.org/drawingml/2006/picture">
             <w:tblPr>
-              <w:tblLayout w:type="fixed"/>
+              <w:tblLayout w:type="autofit"/>
               <w:jc w:val="center"/>
               <w:tblLook w:firstRow="1" w:lastRow="0" w:firstColumn="0" w:lastColumn="0" w:noHBand="0" w:noVBand="1"/>
             </w:tblPr>
             <w:tblGrid>
-              <w:gridCol w:w="1368"/>
-              <w:gridCol w:w="1512"/>
-              <w:gridCol w:w="1368"/>
-              <w:gridCol w:w="1440"/>
-              <w:gridCol w:w="1584"/>
-              <w:gridCol w:w="1512"/>
+              <w:gridCol w:w="1501"/>
+              <w:gridCol w:w="1659"/>
+              <w:gridCol w:w="1501"/>
+              <w:gridCol w:w="1580"/>
+              <w:gridCol w:w="1738"/>
+              <w:gridCol w:w="1659"/>
             </w:tblGrid>
             <w:tr>
               <w:trPr>
@@ -11537,7 +11549,7 @@
               </w:tc>
             </w:tr>
           </w:tbl>
-          <w:bookmarkEnd w:id="66"/>
+          <w:bookmarkEnd w:id="55"/>
         </w:tc>
       </w:tr>
     </w:tbl>
@@ -11571,23 +11583,23 @@
     <w:tbl>
       <w:tblPr>
         <w:tblStyle w:val="Table"/>
-        <w:tblW w:type="pct" w:w="5000"/>
-        <w:tblLayout w:type="fixed"/>
+        <w:tblW w:type="dxa" w:w="9638"/>
+        <w:tblLayout w:type="autofit"/>
         <w:tblLook w:firstRow="0" w:lastRow="0" w:firstColumn="0" w:lastColumn="0" w:noHBand="0" w:noVBand="0" w:val="0000"/>
       </w:tblPr>
       <w:tblGrid>
-        <w:gridCol w:w="7920"/>
+        <w:gridCol w:w="9638"/>
       </w:tblGrid>
       <w:tr>
         <w:tc>
           <w:tcPr/>
-          <w:bookmarkStart w:id="67" w:name="tbl-klastry3"/>
+          <w:bookmarkStart w:id="56" w:name="tbl-klastry3"/>
           <w:p>
             <w:pPr>
               <w:jc w:val="center"/>
             </w:pPr>
             <w:pPr>
-              <w:jc w:val="start"/>
+              <w:jc w:val="left"/>
               <w:spacing w:before="200"/>
               <w:pStyle w:val="ImageCaption"/>
             </w:pPr>
@@ -11597,17 +11609,17 @@
           </w:p>
           <w:tbl xmlns:w="http://schemas.openxmlformats.org/wordprocessingml/2006/main" xmlns:r="http://schemas.openxmlformats.org/officeDocument/2006/relationships" xmlns:w14="http://schemas.microsoft.com/office/word/2010/wordml" xmlns:wp="http://schemas.openxmlformats.org/drawingml/2006/wordprocessingDrawing" xmlns:a="http://schemas.openxmlformats.org/drawingml/2006/main" xmlns:pic="http://schemas.openxmlformats.org/drawingml/2006/picture">
             <w:tblPr>
-              <w:tblLayout w:type="fixed"/>
+              <w:tblLayout w:type="autofit"/>
               <w:jc w:val="center"/>
               <w:tblLook w:firstRow="1" w:lastRow="0" w:firstColumn="0" w:lastColumn="0" w:noHBand="0" w:noVBand="1"/>
             </w:tblPr>
             <w:tblGrid>
-              <w:gridCol w:w="2736"/>
-              <w:gridCol w:w="576"/>
-              <w:gridCol w:w="1296"/>
-              <w:gridCol w:w="1296"/>
-              <w:gridCol w:w="1152"/>
-              <w:gridCol w:w="2016"/>
+              <w:gridCol w:w="2907"/>
+              <w:gridCol w:w="612"/>
+              <w:gridCol w:w="1377"/>
+              <w:gridCol w:w="1377"/>
+              <w:gridCol w:w="1224"/>
+              <w:gridCol w:w="2141"/>
             </w:tblGrid>
             <w:tr>
               <w:trPr>
@@ -13047,7 +13059,7 @@
               </w:tc>
             </w:tr>
           </w:tbl>
-          <w:bookmarkEnd w:id="67"/>
+          <w:bookmarkEnd w:id="56"/>
         </w:tc>
       </w:tr>
     </w:tbl>
@@ -13067,8 +13079,8 @@
         <w:t xml:space="preserve">Wynik ten pokazuje, że wysoki wpływ naukowy nie musi wynikać wyłącznie z długiego stażu i dużej liczby publikacji. Poza wielkością dorobku znaczenie ma także jego jakość: wysokie wartości wskaźników osiągają również młodsi badacze z mniejszą liczbą publikacji. Także w wariancie z trzema klastrami typologia pozostaje niezależna od uczelni (Craméra V = 0,10). Jej związek ze stanowiskiem jest natomiast słabszy niż w podziale na dwa klastry (V = 0,38), ponieważ profil jakościowy obejmuje osoby z różnych poziomów hierarchii akademickiej.</w:t>
       </w:r>
     </w:p>
-    <w:bookmarkEnd w:id="68"/>
-    <w:bookmarkStart w:id="80" w:name="Xbd5b45b451445d4809baed400770e4b8ffa7ad0"/>
+    <w:bookmarkEnd w:id="57"/>
+    <w:bookmarkStart w:id="69" w:name="Xbd5b45b451445d4809baed400770e4b8ffa7ad0"/>
     <w:p>
       <w:pPr>
         <w:pStyle w:val="Heading2"/>
@@ -13161,23 +13173,23 @@
     <w:tbl>
       <w:tblPr>
         <w:tblStyle w:val="Table"/>
-        <w:tblW w:type="pct" w:w="5000"/>
-        <w:tblLayout w:type="fixed"/>
+        <w:tblW w:type="dxa" w:w="9638"/>
+        <w:tblLayout w:type="autofit"/>
         <w:tblLook w:firstRow="0" w:lastRow="0" w:firstColumn="0" w:lastColumn="0" w:noHBand="0" w:noVBand="0" w:val="0000"/>
       </w:tblPr>
       <w:tblGrid>
-        <w:gridCol w:w="7920"/>
+        <w:gridCol w:w="9638"/>
       </w:tblGrid>
       <w:tr>
         <w:tc>
           <w:tcPr/>
-          <w:bookmarkStart w:id="69" w:name="tbl-modele"/>
+          <w:bookmarkStart w:id="58" w:name="tbl-modele"/>
           <w:p>
             <w:pPr>
               <w:jc w:val="center"/>
             </w:pPr>
             <w:pPr>
-              <w:jc w:val="start"/>
+              <w:jc w:val="left"/>
               <w:spacing w:before="200"/>
               <w:pStyle w:val="ImageCaption"/>
             </w:pPr>
@@ -13187,16 +13199,16 @@
           </w:p>
           <w:tbl xmlns:w="http://schemas.openxmlformats.org/wordprocessingml/2006/main" xmlns:r="http://schemas.openxmlformats.org/officeDocument/2006/relationships" xmlns:w14="http://schemas.microsoft.com/office/word/2010/wordml" xmlns:wp="http://schemas.openxmlformats.org/drawingml/2006/wordprocessingDrawing" xmlns:a="http://schemas.openxmlformats.org/drawingml/2006/main" xmlns:pic="http://schemas.openxmlformats.org/drawingml/2006/picture">
             <w:tblPr>
-              <w:tblLayout w:type="fixed"/>
+              <w:tblLayout w:type="autofit"/>
               <w:jc w:val="center"/>
               <w:tblLook w:firstRow="1" w:lastRow="0" w:firstColumn="0" w:lastColumn="0" w:noHBand="0" w:noVBand="1"/>
             </w:tblPr>
             <w:tblGrid>
-              <w:gridCol w:w="2304"/>
-              <w:gridCol w:w="1584"/>
-              <w:gridCol w:w="1584"/>
-              <w:gridCol w:w="1584"/>
-              <w:gridCol w:w="1584"/>
+              <w:gridCol w:w="2570"/>
+              <w:gridCol w:w="1767"/>
+              <w:gridCol w:w="1767"/>
+              <w:gridCol w:w="1767"/>
+              <w:gridCol w:w="1767"/>
             </w:tblGrid>
             <w:tr>
               <w:trPr>
@@ -14145,7 +14157,7 @@
               </w:tc>
             </w:tr>
           </w:tbl>
-          <w:bookmarkEnd w:id="69"/>
+          <w:bookmarkEnd w:id="58"/>
         </w:tc>
       </w:tr>
     </w:tbl>
@@ -14223,23 +14235,23 @@
     <w:tbl>
       <w:tblPr>
         <w:tblStyle w:val="Table"/>
-        <w:tblW w:type="pct" w:w="5000"/>
-        <w:tblLayout w:type="fixed"/>
+        <w:tblW w:type="dxa" w:w="9638"/>
+        <w:tblLayout w:type="autofit"/>
         <w:tblLook w:firstRow="0" w:lastRow="0" w:firstColumn="0" w:lastColumn="0" w:noHBand="0" w:noVBand="0" w:val="0000"/>
       </w:tblPr>
       <w:tblGrid>
-        <w:gridCol w:w="7920"/>
+        <w:gridCol w:w="9638"/>
       </w:tblGrid>
       <w:tr>
         <w:tc>
           <w:tcPr/>
-          <w:bookmarkStart w:id="70" w:name="tbl-prog"/>
+          <w:bookmarkStart w:id="59" w:name="tbl-prog"/>
           <w:p>
             <w:pPr>
               <w:jc w:val="center"/>
             </w:pPr>
             <w:pPr>
-              <w:jc w:val="start"/>
+              <w:jc w:val="left"/>
               <w:spacing w:before="200"/>
               <w:pStyle w:val="ImageCaption"/>
             </w:pPr>
@@ -14249,16 +14261,16 @@
           </w:p>
           <w:tbl xmlns:w="http://schemas.openxmlformats.org/wordprocessingml/2006/main" xmlns:r="http://schemas.openxmlformats.org/officeDocument/2006/relationships" xmlns:w14="http://schemas.microsoft.com/office/word/2010/wordml" xmlns:wp="http://schemas.openxmlformats.org/drawingml/2006/wordprocessingDrawing" xmlns:a="http://schemas.openxmlformats.org/drawingml/2006/main" xmlns:pic="http://schemas.openxmlformats.org/drawingml/2006/picture">
             <w:tblPr>
-              <w:tblLayout w:type="fixed"/>
+              <w:tblLayout w:type="autofit"/>
               <w:jc w:val="center"/>
               <w:tblLook w:firstRow="1" w:lastRow="0" w:firstColumn="0" w:lastColumn="0" w:noHBand="0" w:noVBand="1"/>
             </w:tblPr>
             <w:tblGrid>
-              <w:gridCol w:w="2664"/>
-              <w:gridCol w:w="1296"/>
-              <w:gridCol w:w="1440"/>
-              <w:gridCol w:w="1224"/>
-              <w:gridCol w:w="2160"/>
+              <w:gridCol w:w="2923"/>
+              <w:gridCol w:w="1422"/>
+              <w:gridCol w:w="1580"/>
+              <w:gridCol w:w="1343"/>
+              <w:gridCol w:w="2370"/>
             </w:tblGrid>
             <w:tr>
               <w:trPr>
@@ -15207,7 +15219,7 @@
               </w:tc>
             </w:tr>
           </w:tbl>
-          <w:bookmarkEnd w:id="70"/>
+          <w:bookmarkEnd w:id="59"/>
         </w:tc>
       </w:tr>
     </w:tbl>
@@ -15252,17 +15264,17 @@
     <w:tbl>
       <w:tblPr>
         <w:tblStyle w:val="Table"/>
-        <w:tblW w:type="pct" w:w="5000"/>
-        <w:tblLayout w:type="fixed"/>
+        <w:tblW w:type="dxa" w:w="9638"/>
+        <w:tblLayout w:type="autofit"/>
         <w:tblLook w:firstRow="0" w:lastRow="0" w:firstColumn="0" w:lastColumn="0" w:noHBand="0" w:noVBand="0" w:val="0000"/>
       </w:tblPr>
       <w:tblGrid>
-        <w:gridCol w:w="7920"/>
+        <w:gridCol w:w="9638"/>
       </w:tblGrid>
       <w:tr>
         <w:tc>
           <w:tcPr/>
-          <w:bookmarkStart w:id="74" w:name="fig-waznosc"/>
+          <w:bookmarkStart w:id="63" w:name="fig-waznosc"/>
           <w:p>
             <w:pPr>
               <w:pStyle w:val="Compact"/>
@@ -15273,18 +15285,18 @@
                 <wp:inline>
                   <wp:extent cx="5334000" cy="3006436"/>
                   <wp:effectExtent b="0" l="0" r="0" t="0"/>
-                  <wp:docPr descr="" title="" id="72" name="Picture"/>
+                  <wp:docPr descr="" title="" id="61" name="Picture"/>
                   <a:graphic>
                     <a:graphicData uri="http://schemas.openxmlformats.org/drawingml/2006/picture">
                       <pic:pic>
                         <pic:nvPicPr>
-                          <pic:cNvPr descr="../Wykresy/praca/fig_04b_waznosc.png" id="73" name="Picture"/>
+                          <pic:cNvPr descr="../Wykresy/praca/fig_04b_waznosc.png" id="62" name="Picture"/>
                           <pic:cNvPicPr>
                             <a:picLocks noChangeArrowheads="1" noChangeAspect="1"/>
                           </pic:cNvPicPr>
                         </pic:nvPicPr>
                         <pic:blipFill>
-                          <a:blip r:embed="rId71"/>
+                          <a:blip r:embed="rId60"/>
                           <a:stretch>
                             <a:fillRect/>
                           </a:stretch>
@@ -15316,7 +15328,7 @@
               <w:jc w:val="center"/>
             </w:pPr>
             <w:pPr>
-              <w:jc w:val="start"/>
+              <w:jc w:val="left"/>
               <w:spacing w:before="200"/>
               <w:pStyle w:val="ImageCaption"/>
             </w:pPr>
@@ -15324,7 +15336,7 @@
               <w:t xml:space="preserve">Rysunek 8: Najważniejsze predyktory wysokiego wpływu publikacyjnego w modelu Random Forest (ważność permutacyjna). Kolor oznacza kategorię cechy: produktywność, współpraca i cytowania oraz cechy formalne (uczelnia, stanowisko).</w:t>
             </w:r>
           </w:p>
-          <w:bookmarkEnd w:id="74"/>
+          <w:bookmarkEnd w:id="63"/>
         </w:tc>
       </w:tr>
     </w:tbl>
@@ -15336,7 +15348,7 @@
         <w:t xml:space="preserve">W odpowiedzi na pytanie 3 wyniki pokazują, że wysoki wpływ naukowy można przewidywać na podstawie cech badacza, takich jak stanowisko, uczelnia, liczba publikacji i współpraca naukowa. Model osiągnął bardzo dobrą zdolność rozróżniania osób o wysokim i niższym wpływie naukowym (AUC ok. 0,97).</w:t>
       </w:r>
     </w:p>
-    <w:bookmarkStart w:id="79" w:name="X799efba27fc6d09a0b5025f13f38b8866705e0f"/>
+    <w:bookmarkStart w:id="68" w:name="X799efba27fc6d09a0b5025f13f38b8866705e0f"/>
     <w:p>
       <w:pPr>
         <w:pStyle w:val="Heading3"/>
@@ -15391,17 +15403,17 @@
     <w:tbl>
       <w:tblPr>
         <w:tblStyle w:val="Table"/>
-        <w:tblW w:type="pct" w:w="5000"/>
-        <w:tblLayout w:type="fixed"/>
+        <w:tblW w:type="dxa" w:w="9638"/>
+        <w:tblLayout w:type="autofit"/>
         <w:tblLook w:firstRow="0" w:lastRow="0" w:firstColumn="0" w:lastColumn="0" w:noHBand="0" w:noVBand="0" w:val="0000"/>
       </w:tblPr>
       <w:tblGrid>
-        <w:gridCol w:w="7920"/>
+        <w:gridCol w:w="9638"/>
       </w:tblGrid>
       <w:tr>
         <w:tc>
           <w:tcPr/>
-          <w:bookmarkStart w:id="78" w:name="fig-waznosc-jakosc"/>
+          <w:bookmarkStart w:id="67" w:name="fig-waznosc-jakosc"/>
           <w:p>
             <w:pPr>
               <w:pStyle w:val="Compact"/>
@@ -15412,18 +15424,18 @@
                 <wp:inline>
                   <wp:extent cx="5334000" cy="3006436"/>
                   <wp:effectExtent b="0" l="0" r="0" t="0"/>
-                  <wp:docPr descr="" title="" id="76" name="Picture"/>
+                  <wp:docPr descr="" title="" id="65" name="Picture"/>
                   <a:graphic>
                     <a:graphicData uri="http://schemas.openxmlformats.org/drawingml/2006/picture">
                       <pic:pic>
                         <pic:nvPicPr>
-                          <pic:cNvPr descr="../Wykresy/praca/fig_04c_waznosc_jakosc.png" id="77" name="Picture"/>
+                          <pic:cNvPr descr="../Wykresy/praca/fig_04c_waznosc_jakosc.png" id="66" name="Picture"/>
                           <pic:cNvPicPr>
                             <a:picLocks noChangeArrowheads="1" noChangeAspect="1"/>
                           </pic:cNvPicPr>
                         </pic:nvPicPr>
                         <pic:blipFill>
-                          <a:blip r:embed="rId75"/>
+                          <a:blip r:embed="rId64"/>
                           <a:stretch>
                             <a:fillRect/>
                           </a:stretch>
@@ -15455,7 +15467,7 @@
               <w:jc w:val="center"/>
             </w:pPr>
             <w:pPr>
-              <w:jc w:val="start"/>
+              <w:jc w:val="left"/>
               <w:spacing w:before="200"/>
               <w:pStyle w:val="ImageCaption"/>
             </w:pPr>
@@ -15463,7 +15475,7 @@
               <w:t xml:space="preserve">Rysunek 9: Najważniejsze predyktory jakości dorobku w modelu Random Forest. Model przewidywał, czy średni FWCI badacza przekracza 1. Największe znaczenie miały cechy współpracy naukowej, zwłaszcza średnia liczba autorów jednej publikacji i liczba unikalnych współautorów. Wiek akademicki, liczba publikacji, stanowisko i uczelnia miały mniejsze znaczenie. Kolor oznacza kategorię zmiennej.</w:t>
             </w:r>
           </w:p>
-          <w:bookmarkEnd w:id="78"/>
+          <w:bookmarkEnd w:id="67"/>
         </w:tc>
       </w:tr>
     </w:tbl>
@@ -15475,9 +15487,9 @@
         <w:t xml:space="preserve">Oznacza to, że wysoki wpływ pojedynczych publikacji częściej wiąże się z pracą w szerszych, wieloautorskich zespołach niż ze stażem, liczbą publikacji czy formalnym stanowiskiem. Podobny wniosek wynikał już z analizy klastrów, w której wyróżniono profil jakościowy obejmujący wielu młodszych badaczy. Pokazuje to, że wysoka jakość dorobku nie musi być związana z długim stażem ani dużą liczbą publikacji.</w:t>
       </w:r>
     </w:p>
-    <w:bookmarkEnd w:id="79"/>
-    <w:bookmarkEnd w:id="80"/>
-    <w:bookmarkStart w:id="90" w:name="sieć-współautorstwa-pytanie-4"/>
+    <w:bookmarkEnd w:id="68"/>
+    <w:bookmarkEnd w:id="69"/>
+    <w:bookmarkStart w:id="79" w:name="sieć-współautorstwa-pytanie-4"/>
     <w:p>
       <w:pPr>
         <w:pStyle w:val="Heading2"/>
@@ -15505,17 +15517,17 @@
     <w:tbl>
       <w:tblPr>
         <w:tblStyle w:val="Table"/>
-        <w:tblW w:type="pct" w:w="5000"/>
-        <w:tblLayout w:type="fixed"/>
+        <w:tblW w:type="dxa" w:w="9638"/>
+        <w:tblLayout w:type="autofit"/>
         <w:tblLook w:firstRow="0" w:lastRow="0" w:firstColumn="0" w:lastColumn="0" w:noHBand="0" w:noVBand="0" w:val="0000"/>
       </w:tblPr>
       <w:tblGrid>
-        <w:gridCol w:w="7920"/>
+        <w:gridCol w:w="9638"/>
       </w:tblGrid>
       <w:tr>
         <w:tc>
           <w:tcPr/>
-          <w:bookmarkStart w:id="84" w:name="fig-siec"/>
+          <w:bookmarkStart w:id="73" w:name="fig-siec"/>
           <w:p>
             <w:pPr>
               <w:pStyle w:val="Compact"/>
@@ -15526,18 +15538,18 @@
                 <wp:inline>
                   <wp:extent cx="5067300" cy="4504266"/>
                   <wp:effectExtent b="0" l="0" r="0" t="0"/>
-                  <wp:docPr descr="" title="" id="82" name="Picture"/>
+                  <wp:docPr descr="" title="" id="71" name="Picture"/>
                   <a:graphic>
                     <a:graphicData uri="http://schemas.openxmlformats.org/drawingml/2006/picture">
                       <pic:pic>
                         <pic:nvPicPr>
-                          <pic:cNvPr descr="../Wykresy/praca/fig_05a_siec.png" id="83" name="Picture"/>
+                          <pic:cNvPr descr="../Wykresy/praca/fig_05a_siec.png" id="72" name="Picture"/>
                           <pic:cNvPicPr>
                             <a:picLocks noChangeArrowheads="1" noChangeAspect="1"/>
                           </pic:cNvPicPr>
                         </pic:nvPicPr>
                         <pic:blipFill>
-                          <a:blip r:embed="rId81"/>
+                          <a:blip r:embed="rId70"/>
                           <a:stretch>
                             <a:fillRect/>
                           </a:stretch>
@@ -15569,7 +15581,7 @@
               <w:jc w:val="center"/>
             </w:pPr>
             <w:pPr>
-              <w:jc w:val="start"/>
+              <w:jc w:val="left"/>
               <w:spacing w:before="200"/>
               <w:pStyle w:val="ImageCaption"/>
             </w:pPr>
@@ -15577,7 +15589,7 @@
               <w:t xml:space="preserve">Rysunek 10: Sieć współautorstwa naukowców badanej dyscypliny. Węzły to badacze (kolor oznacza uczelnię, wielkość liczbę połączeń), a krawędzie wspólne publikacje. Skupiska tej samej barwy pokazują, że współpraca koncentruje się wewnątrz uczelni.</w:t>
             </w:r>
           </w:p>
-          <w:bookmarkEnd w:id="84"/>
+          <w:bookmarkEnd w:id="73"/>
         </w:tc>
       </w:tr>
     </w:tbl>
@@ -15645,23 +15657,23 @@
     <w:tbl>
       <w:tblPr>
         <w:tblStyle w:val="Table"/>
-        <w:tblW w:type="pct" w:w="5000"/>
-        <w:tblLayout w:type="fixed"/>
+        <w:tblW w:type="dxa" w:w="9638"/>
+        <w:tblLayout w:type="autofit"/>
         <w:tblLook w:firstRow="0" w:lastRow="0" w:firstColumn="0" w:lastColumn="0" w:noHBand="0" w:noVBand="0" w:val="0000"/>
       </w:tblPr>
       <w:tblGrid>
-        <w:gridCol w:w="7920"/>
+        <w:gridCol w:w="9638"/>
       </w:tblGrid>
       <w:tr>
         <w:tc>
           <w:tcPr/>
-          <w:bookmarkStart w:id="85" w:name="tbl-spolecznosci"/>
+          <w:bookmarkStart w:id="74" w:name="tbl-spolecznosci"/>
           <w:p>
             <w:pPr>
               <w:jc w:val="center"/>
             </w:pPr>
             <w:pPr>
-              <w:jc w:val="start"/>
+              <w:jc w:val="left"/>
               <w:spacing w:before="200"/>
               <w:pStyle w:val="ImageCaption"/>
             </w:pPr>
@@ -15671,14 +15683,14 @@
           </w:p>
           <w:tbl xmlns:w="http://schemas.openxmlformats.org/wordprocessingml/2006/main" xmlns:r="http://schemas.openxmlformats.org/officeDocument/2006/relationships" xmlns:w14="http://schemas.microsoft.com/office/word/2010/wordml" xmlns:wp="http://schemas.openxmlformats.org/drawingml/2006/wordprocessingDrawing" xmlns:a="http://schemas.openxmlformats.org/drawingml/2006/main" xmlns:pic="http://schemas.openxmlformats.org/drawingml/2006/picture">
             <w:tblPr>
-              <w:tblLayout w:type="fixed"/>
+              <w:tblLayout w:type="autofit"/>
               <w:jc w:val="center"/>
               <w:tblLook w:firstRow="1" w:lastRow="0" w:firstColumn="0" w:lastColumn="0" w:noHBand="0" w:noVBand="1"/>
             </w:tblPr>
             <w:tblGrid>
-              <w:gridCol w:w="4752"/>
-              <w:gridCol w:w="1800"/>
-              <w:gridCol w:w="1800"/>
+              <w:gridCol w:w="5484"/>
+              <w:gridCol w:w="2077"/>
+              <w:gridCol w:w="2077"/>
             </w:tblGrid>
             <w:tr>
               <w:trPr>
@@ -16303,24 +16315,24 @@
               </w:tc>
             </w:tr>
           </w:tbl>
-          <w:bookmarkEnd w:id="85"/>
+          <w:bookmarkEnd w:id="74"/>
         </w:tc>
       </w:tr>
     </w:tbl>
     <w:tbl>
       <w:tblPr>
         <w:tblStyle w:val="Table"/>
-        <w:tblW w:type="pct" w:w="5000"/>
-        <w:tblLayout w:type="fixed"/>
+        <w:tblW w:type="dxa" w:w="9638"/>
+        <w:tblLayout w:type="autofit"/>
         <w:tblLook w:firstRow="0" w:lastRow="0" w:firstColumn="0" w:lastColumn="0" w:noHBand="0" w:noVBand="0" w:val="0000"/>
       </w:tblPr>
       <w:tblGrid>
-        <w:gridCol w:w="7920"/>
+        <w:gridCol w:w="9638"/>
       </w:tblGrid>
       <w:tr>
         <w:tc>
           <w:tcPr/>
-          <w:bookmarkStart w:id="89" w:name="fig-spolecznosci"/>
+          <w:bookmarkStart w:id="78" w:name="fig-spolecznosci"/>
           <w:p>
             <w:pPr>
               <w:pStyle w:val="Compact"/>
@@ -16331,18 +16343,18 @@
                 <wp:inline>
                   <wp:extent cx="5334000" cy="6096000"/>
                   <wp:effectExtent b="0" l="0" r="0" t="0"/>
-                  <wp:docPr descr="" title="" id="87" name="Picture"/>
+                  <wp:docPr descr="" title="" id="76" name="Picture"/>
                   <a:graphic>
                     <a:graphicData uri="http://schemas.openxmlformats.org/drawingml/2006/picture">
                       <pic:pic>
                         <pic:nvPicPr>
-                          <pic:cNvPr descr="../Wykresy/praca/fig_05b_spolecznosci.png" id="88" name="Picture"/>
+                          <pic:cNvPr descr="../Wykresy/praca/fig_05b_spolecznosci.png" id="77" name="Picture"/>
                           <pic:cNvPicPr>
                             <a:picLocks noChangeArrowheads="1" noChangeAspect="1"/>
                           </pic:cNvPicPr>
                         </pic:nvPicPr>
                         <pic:blipFill>
-                          <a:blip r:embed="rId86"/>
+                          <a:blip r:embed="rId75"/>
                           <a:stretch>
                             <a:fillRect/>
                           </a:stretch>
@@ -16374,7 +16386,7 @@
               <w:jc w:val="center"/>
             </w:pPr>
             <w:pPr>
-              <w:jc w:val="start"/>
+              <w:jc w:val="left"/>
               <w:spacing w:before="200"/>
               <w:pStyle w:val="ImageCaption"/>
             </w:pPr>
@@ -16382,7 +16394,7 @@
               <w:t xml:space="preserve">Rysunek 11: Zgodność społeczności Louvain z uczelnią. Każdy wiersz to jedna społeczność (uporządkowane według wielkości); wartość i intensywność oznaczają udział danej uczelni, a kolor typ społeczności: czerwień to społeczność jednouczelniana, turkus to społeczność mieszana (współpraca międzyuczelniana). Niemal wszystkie społeczności są jednorodne uczelniano.</w:t>
             </w:r>
           </w:p>
-          <w:bookmarkEnd w:id="89"/>
+          <w:bookmarkEnd w:id="78"/>
         </w:tc>
       </w:tr>
     </w:tbl>
@@ -16421,9 +16433,9 @@
         <w:t xml:space="preserve">Najwyższą centralność stopnia, czyli największą liczbę bezpośrednich powiązań współautorskich, osiąga profesor z URK (S. Smoleń). Wśród najbardziej centralnych osób znajduje się także grupa badaczy gleboznawczych z UPWr.</w:t>
       </w:r>
     </w:p>
-    <w:bookmarkEnd w:id="90"/>
-    <w:bookmarkEnd w:id="91"/>
-    <w:bookmarkStart w:id="101" w:name="dyskusja"/>
+    <w:bookmarkEnd w:id="79"/>
+    <w:bookmarkEnd w:id="80"/>
+    <w:bookmarkStart w:id="90" w:name="dyskusja"/>
     <w:p>
       <w:pPr>
         <w:pStyle w:val="Heading1"/>
@@ -16432,7 +16444,7 @@
         <w:t xml:space="preserve">Dyskusja</w:t>
       </w:r>
     </w:p>
-    <w:bookmarkStart w:id="92" w:name="X8e8cd80b7d1e8d8e23d38bfd67a798253a95b88"/>
+    <w:bookmarkStart w:id="81" w:name="X8e8cd80b7d1e8d8e23d38bfd67a798253a95b88"/>
     <w:p>
       <w:pPr>
         <w:pStyle w:val="Heading2"/>
@@ -16481,8 +16493,8 @@
         <w:t xml:space="preserve">Taki układ może wynikać ze specyfiki nauk rolniczych. W tej dziedzinie część badań jest silnie związana z lokalną infrastrukturą i warunkami prowadzenia eksperymentów, takimi jak pola doświadczalne, stacje badawcze czy lokalne uwarunkowania glebowo-klimatyczne. Może to sprzyjać współpracy w obrębie tej samej uczelni lub ośrodka badawczego.</w:t>
       </w:r>
     </w:p>
-    <w:bookmarkEnd w:id="92"/>
-    <w:bookmarkStart w:id="93" w:name="X55d3951ebce5c318a1ba2b13bef613b3921736b"/>
+    <w:bookmarkEnd w:id="81"/>
+    <w:bookmarkStart w:id="82" w:name="X55d3951ebce5c318a1ba2b13bef613b3921736b"/>
     <w:p>
       <w:pPr>
         <w:pStyle w:val="Heading2"/>
@@ -16531,8 +16543,8 @@
         <w:t xml:space="preserve">Spójny obraz daje też wariant klastrowania k = 3, w którym wyodrębniono profil jakościowy zdominowany przez asystentów i adiunktów o wysokim FWCI i IF na publikację. Może to odzwierciedlać zmianę pokoleniową, w której młodsi badacze częściej publikują w prestiżowych czasopismach o szerokim zasięgu, w ramach większych zespołów współautorskich, zamiast budować dużą liczbę prac o niższym oddziaływaniu. Ponieważ dane mają charakter przekrojowy, interpretację tę należy traktować jako hipotezę: nie można odróżnić rzeczywistego efektu pokoleniowego od efektu etapu kariery ani od selekcji osób pozostających w nauce.</w:t>
       </w:r>
     </w:p>
-    <w:bookmarkEnd w:id="93"/>
-    <w:bookmarkStart w:id="94" w:name="kategoria-ewaluacyjna-mein"/>
+    <w:bookmarkEnd w:id="82"/>
+    <w:bookmarkStart w:id="83" w:name="kategoria-ewaluacyjna-mein"/>
     <w:p>
       <w:pPr>
         <w:pStyle w:val="Heading2"/>
@@ -16565,8 +16577,8 @@
         <w:t xml:space="preserve">Wniosek ten należy jednak traktować ostrożnie. W badaniu uwzględniono tylko jedną uczelnię z kategorią B+, dlatego zależność między kategorią ewaluacyjną a indywidualnym dorobkiem naukowców wymagałaby sprawdzenia na większej próbie uczelni.</w:t>
       </w:r>
     </w:p>
-    <w:bookmarkEnd w:id="94"/>
-    <w:bookmarkStart w:id="99" w:name="Xc8114be83f87911a3e825982079ac6b9186de2d"/>
+    <w:bookmarkEnd w:id="83"/>
+    <w:bookmarkStart w:id="88" w:name="Xc8114be83f87911a3e825982079ac6b9186de2d"/>
     <w:p>
       <w:pPr>
         <w:pStyle w:val="Heading2"/>
@@ -16621,17 +16633,17 @@
     <w:tbl>
       <w:tblPr>
         <w:tblStyle w:val="Table"/>
-        <w:tblW w:type="pct" w:w="5000"/>
-        <w:tblLayout w:type="fixed"/>
+        <w:tblW w:type="dxa" w:w="9638"/>
+        <w:tblLayout w:type="autofit"/>
         <w:tblLook w:firstRow="0" w:lastRow="0" w:firstColumn="0" w:lastColumn="0" w:noHBand="0" w:noVBand="0" w:val="0000"/>
       </w:tblPr>
       <w:tblGrid>
-        <w:gridCol w:w="7920"/>
+        <w:gridCol w:w="9638"/>
       </w:tblGrid>
       <w:tr>
         <w:tc>
           <w:tcPr/>
-          <w:bookmarkStart w:id="98" w:name="fig-dynamika"/>
+          <w:bookmarkStart w:id="87" w:name="fig-dynamika"/>
           <w:p>
             <w:pPr>
               <w:pStyle w:val="Compact"/>
@@ -16642,18 +16654,18 @@
                 <wp:inline>
                   <wp:extent cx="4267200" cy="2607733"/>
                   <wp:effectExtent b="0" l="0" r="0" t="0"/>
-                  <wp:docPr descr="" title="" id="96" name="Picture"/>
+                  <wp:docPr descr="" title="" id="85" name="Picture"/>
                   <a:graphic>
                     <a:graphicData uri="http://schemas.openxmlformats.org/drawingml/2006/picture">
                       <pic:pic>
                         <pic:nvPicPr>
-                          <pic:cNvPr descr="../Wykresy/praca/fig_06_dynamika_porownanie.png" id="97" name="Picture"/>
+                          <pic:cNvPr descr="../Wykresy/praca/fig_06_dynamika_porownanie.png" id="86" name="Picture"/>
                           <pic:cNvPicPr>
                             <a:picLocks noChangeArrowheads="1" noChangeAspect="1"/>
                           </pic:cNvPicPr>
                         </pic:nvPicPr>
                         <pic:blipFill>
-                          <a:blip r:embed="rId95"/>
+                          <a:blip r:embed="rId84"/>
                           <a:stretch>
                             <a:fillRect/>
                           </a:stretch>
@@ -16685,7 +16697,7 @@
               <w:jc w:val="center"/>
             </w:pPr>
             <w:pPr>
-              <w:jc w:val="start"/>
+              <w:jc w:val="left"/>
               <w:spacing w:before="200"/>
               <w:pStyle w:val="ImageCaption"/>
             </w:pPr>
@@ -16693,7 +16705,7 @@
               <w:t xml:space="preserve">Rysunek 12: Roczne tempo wzrostu liczby publikacji na badacza według danych OpenAlex i Omega-PSIR. Linie pokazują 95% przedziały ufności. Wyniki wskazują, że ocena dynamiki rozwoju uczelni zależy od źródła danych.</w:t>
             </w:r>
           </w:p>
-          <w:bookmarkEnd w:id="98"/>
+          <w:bookmarkEnd w:id="87"/>
         </w:tc>
       </w:tr>
     </w:tbl>
@@ -16729,8 +16741,8 @@
         <w:t xml:space="preserve">Różnice między uczelniami należy jednak interpretować ostrożnie, ponieważ przedziały ufności są szerokie i częściowo się nakładają. Bardziej wiarygodny jest ogólny podział na uczelnie o wyższym tempie wzrostu (URK, UWM) oraz uczelnie o bardziej ustabilizowanej produktywności (UPWr, SGGW), niż dokładny ranking uczelni.</w:t>
       </w:r>
     </w:p>
-    <w:bookmarkEnd w:id="99"/>
-    <w:bookmarkStart w:id="100" w:name="ograniczenia-badania"/>
+    <w:bookmarkEnd w:id="88"/>
+    <w:bookmarkStart w:id="89" w:name="ograniczenia-badania"/>
     <w:p>
       <w:pPr>
         <w:pStyle w:val="Heading2"/>
@@ -16901,7 +16913,7 @@
           <w:rPr>
             <w:rStyle w:val="Hyperlink"/>
           </w:rPr>
-          <w:t xml:space="preserve">Culbert i in. 2025</w:t>
+          <w:t xml:space="preserve">Culbert et al. 2025</w:t>
         </w:r>
       </w:hyperlink>
       <w:r>
@@ -16911,9 +16923,9 @@
         <w:t xml:space="preserve">. Dlatego Omega-PSIR przyjęto jako źródło podstawowe, a OpenAlex jako źródło uzupełniające.</w:t>
       </w:r>
     </w:p>
-    <w:bookmarkEnd w:id="100"/>
-    <w:bookmarkEnd w:id="101"/>
-    <w:bookmarkStart w:id="103" w:name="wnioski"/>
+    <w:bookmarkEnd w:id="89"/>
+    <w:bookmarkEnd w:id="90"/>
+    <w:bookmarkStart w:id="92" w:name="wnioski"/>
     <w:p>
       <w:pPr>
         <w:pStyle w:val="Heading1"/>
@@ -16978,7 +16990,7 @@
         <w:t xml:space="preserve">Łącznie wyniki pokazują, że indywidualny dorobek naukowców jest związany głównie z etapem kariery, natomiast współpraca naukowa przebiega przede wszystkim w obrębie uczelni. Praca potwierdza także znaczenie jednorodnego źródła danych. Wykorzystanie systemów Omega-PSIR umożliwiło porównywalne pozyskanie wskaźników bibliometrycznych z czterech uczelni, co byłoby znacznie trudniejsze przy użyciu różnych, niejednolitych repozytoriów.</w:t>
       </w:r>
     </w:p>
-    <w:bookmarkStart w:id="102" w:name="wnioski-dla-praktyki"/>
+    <w:bookmarkStart w:id="91" w:name="wnioski-dla-praktyki"/>
     <w:p>
       <w:pPr>
         <w:pStyle w:val="Heading2"/>
@@ -17024,9 +17036,9 @@
         <w:br w:type="page"/>
       </w:r>
     </w:p>
-    <w:bookmarkEnd w:id="102"/>
-    <w:bookmarkEnd w:id="103"/>
-    <w:bookmarkStart w:id="141" w:name="bibliografia"/>
+    <w:bookmarkEnd w:id="91"/>
+    <w:bookmarkEnd w:id="92"/>
+    <w:bookmarkStart w:id="130" w:name="bibliografia"/>
     <w:p>
       <w:pPr>
         <w:pStyle w:val="Heading1"/>
@@ -17035,8 +17047,8 @@
         <w:t xml:space="preserve">Bibliografia</w:t>
       </w:r>
     </w:p>
-    <w:bookmarkStart w:id="140" w:name="refs"/>
-    <w:bookmarkStart w:id="105" w:name="ref-ariaBibliometrix2017"/>
+    <w:bookmarkStart w:id="129" w:name="refs"/>
+    <w:bookmarkStart w:id="94" w:name="ref-ariaBibliometrix2017"/>
     <w:p>
       <w:pPr>
         <w:pStyle w:val="Bibliography"/>
@@ -17081,7 +17093,7 @@
       <w:r>
         <w:t xml:space="preserve"> </w:t>
       </w:r>
-      <w:hyperlink r:id="rId104">
+      <w:hyperlink r:id="rId93">
         <w:r>
           <w:rPr>
             <w:rStyle w:val="Hyperlink"/>
@@ -17093,8 +17105,8 @@
         <w:t xml:space="preserve">.</w:t>
       </w:r>
     </w:p>
-    <w:bookmarkEnd w:id="105"/>
-    <w:bookmarkStart w:id="107" w:name="ref-ariaOpenalexR2024"/>
+    <w:bookmarkEnd w:id="94"/>
+    <w:bookmarkStart w:id="96" w:name="ref-ariaOpenalexR2024"/>
     <w:p>
       <w:pPr>
         <w:pStyle w:val="Bibliography"/>
@@ -17154,7 +17166,7 @@
       <w:r>
         <w:t xml:space="preserve"> </w:t>
       </w:r>
-      <w:hyperlink r:id="rId106">
+      <w:hyperlink r:id="rId95">
         <w:r>
           <w:rPr>
             <w:rStyle w:val="Hyperlink"/>
@@ -17166,8 +17178,8 @@
         <w:t xml:space="preserve">.</w:t>
       </w:r>
     </w:p>
-    <w:bookmarkEnd w:id="107"/>
-    <w:bookmarkStart w:id="108" w:name="ref-blondel2008"/>
+    <w:bookmarkEnd w:id="96"/>
+    <w:bookmarkStart w:id="97" w:name="ref-blondel2008"/>
     <w:p>
       <w:pPr>
         <w:pStyle w:val="Bibliography"/>
@@ -17201,8 +17213,8 @@
         <w:t xml:space="preserve">2008 (10): P10008.</w:t>
       </w:r>
     </w:p>
-    <w:bookmarkEnd w:id="108"/>
-    <w:bookmarkStart w:id="109" w:name="ref-breiman2001"/>
+    <w:bookmarkEnd w:id="97"/>
+    <w:bookmarkStart w:id="98" w:name="ref-breiman2001"/>
     <w:p>
       <w:pPr>
         <w:pStyle w:val="Bibliography"/>
@@ -17236,8 +17248,8 @@
         <w:t xml:space="preserve">45 (1): 5–32.</w:t>
       </w:r>
     </w:p>
-    <w:bookmarkEnd w:id="109"/>
-    <w:bookmarkStart w:id="110" w:name="ref-chen2016"/>
+    <w:bookmarkEnd w:id="98"/>
+    <w:bookmarkStart w:id="99" w:name="ref-chen2016"/>
     <w:p>
       <w:pPr>
         <w:pStyle w:val="Bibliography"/>
@@ -17258,7 +17270,7 @@
         <w:t xml:space="preserve">: A scalable tree boosting system”</w:t>
       </w:r>
       <w:r>
-        <w:t xml:space="preserve">. W</w:t>
+        <w:t xml:space="preserve">.</w:t>
       </w:r>
       <w:r>
         <w:t xml:space="preserve"> </w:t>
@@ -17274,14 +17286,14 @@
         <w:t xml:space="preserve">, 785–94.</w:t>
       </w:r>
     </w:p>
-    <w:bookmarkEnd w:id="110"/>
-    <w:bookmarkStart w:id="112" w:name="ref-culbertReferenceCoverageAnalysis2025"/>
+    <w:bookmarkEnd w:id="99"/>
+    <w:bookmarkStart w:id="101" w:name="ref-culbertReferenceCoverageAnalysis2025"/>
     <w:p>
       <w:pPr>
         <w:pStyle w:val="Bibliography"/>
       </w:pPr>
       <w:r>
-        <w:t xml:space="preserve">Culbert, Jack H., Anne Hobert, Najko Jahn, Nick Haupka, Marion Schmidt, Paul Donner, i Philipp Mayr. 2025.</w:t>
+        <w:t xml:space="preserve">Culbert, Jack H., Anne Hobert, Najko Jahn, et al. 2025.</w:t>
       </w:r>
       <w:r>
         <w:t xml:space="preserve"> </w:t>
@@ -17344,7 +17356,7 @@
       <w:r>
         <w:t xml:space="preserve"> </w:t>
       </w:r>
-      <w:hyperlink r:id="rId111">
+      <w:hyperlink r:id="rId100">
         <w:r>
           <w:rPr>
             <w:rStyle w:val="Hyperlink"/>
@@ -17356,8 +17368,8 @@
         <w:t xml:space="preserve">.</w:t>
       </w:r>
     </w:p>
-    <w:bookmarkEnd w:id="112"/>
-    <w:bookmarkStart w:id="113" w:name="ref-Drabek2012"/>
+    <w:bookmarkEnd w:id="101"/>
+    <w:bookmarkStart w:id="102" w:name="ref-Drabek2012"/>
     <w:p>
       <w:pPr>
         <w:pStyle w:val="Bibliography"/>
@@ -17391,8 +17403,8 @@
         <w:t xml:space="preserve">130 (3).</w:t>
       </w:r>
     </w:p>
-    <w:bookmarkEnd w:id="113"/>
-    <w:bookmarkStart w:id="114" w:name="ref-garfield2006"/>
+    <w:bookmarkEnd w:id="102"/>
+    <w:bookmarkStart w:id="103" w:name="ref-garfield2006"/>
     <w:p>
       <w:pPr>
         <w:pStyle w:val="Bibliography"/>
@@ -17426,8 +17438,8 @@
         <w:t xml:space="preserve">295 (1): 90–93.</w:t>
       </w:r>
     </w:p>
-    <w:bookmarkEnd w:id="114"/>
-    <w:bookmarkStart w:id="115" w:name="ref-Grygiel2009"/>
+    <w:bookmarkEnd w:id="103"/>
+    <w:bookmarkStart w:id="104" w:name="ref-Grygiel2009"/>
     <w:p>
       <w:pPr>
         <w:pStyle w:val="Bibliography"/>
@@ -17470,14 +17482,17 @@
         <w:t xml:space="preserve">7 (3): 65–84.</w:t>
       </w:r>
     </w:p>
-    <w:bookmarkEnd w:id="115"/>
-    <w:bookmarkStart w:id="117" w:name="X0b33f87ae5ad4597f5248ccd3781f8ded4d6a31"/>
+    <w:bookmarkEnd w:id="104"/>
+    <w:bookmarkStart w:id="106" w:name="X0b33f87ae5ad4597f5248ccd3781f8ded4d6a31"/>
     <w:p>
       <w:pPr>
         <w:pStyle w:val="Bibliography"/>
       </w:pPr>
       <w:r>
-        <w:t xml:space="preserve">Hicks, Diana, Paul Wouters, Ludo Waltman, Sarah de Rijcke, i Ismael Rafols. 2015.</w:t>
+        <w:t xml:space="preserve">Hicks, Diana, Paul Wouters, Ludo Waltman, Sarah de Rijcke, i Ismael Rafols</w:t>
+      </w:r>
+      <w:r>
+        <w:t xml:space="preserve">. 2015.</w:t>
       </w:r>
       <w:r>
         <w:t xml:space="preserve"> </w:t>
@@ -17519,7 +17534,7 @@
       <w:r>
         <w:t xml:space="preserve"> </w:t>
       </w:r>
-      <w:hyperlink r:id="rId116">
+      <w:hyperlink r:id="rId105">
         <w:r>
           <w:rPr>
             <w:rStyle w:val="Hyperlink"/>
@@ -17531,8 +17546,8 @@
         <w:t xml:space="preserve">.</w:t>
       </w:r>
     </w:p>
-    <w:bookmarkEnd w:id="117"/>
-    <w:bookmarkStart w:id="118" w:name="ref-hirsch2005"/>
+    <w:bookmarkEnd w:id="106"/>
+    <w:bookmarkStart w:id="107" w:name="ref-hirsch2005"/>
     <w:p>
       <w:pPr>
         <w:pStyle w:val="Bibliography"/>
@@ -17566,8 +17581,8 @@
         <w:t xml:space="preserve">102 (46): 16569–72.</w:t>
       </w:r>
     </w:p>
-    <w:bookmarkEnd w:id="118"/>
-    <w:bookmarkStart w:id="119" w:name="ref-hubert1985"/>
+    <w:bookmarkEnd w:id="107"/>
+    <w:bookmarkStart w:id="108" w:name="ref-hubert1985"/>
     <w:p>
       <w:pPr>
         <w:pStyle w:val="Bibliography"/>
@@ -17601,8 +17616,8 @@
         <w:t xml:space="preserve">2 (1): 193–218.</w:t>
       </w:r>
     </w:p>
-    <w:bookmarkEnd w:id="119"/>
-    <w:bookmarkStart w:id="121" w:name="ref-koperwas2015omega"/>
+    <w:bookmarkEnd w:id="108"/>
+    <w:bookmarkStart w:id="110" w:name="ref-koperwas2015omega"/>
     <w:p>
       <w:pPr>
         <w:pStyle w:val="Bibliography"/>
@@ -17626,7 +17641,7 @@
         <w:t xml:space="preserve">– a solution for implementing university research knowledge base”</w:t>
       </w:r>
       <w:r>
-        <w:t xml:space="preserve">. W</w:t>
+        <w:t xml:space="preserve">.</w:t>
       </w:r>
       <w:r>
         <w:t xml:space="preserve"> </w:t>
@@ -17639,12 +17654,15 @@
         <w:t xml:space="preserve">Proceedings of the 21st EUNIS Congress</w:t>
       </w:r>
       <w:r>
-        <w:t xml:space="preserve">. Dundee: European University Information Systems Organisation (EUNIS).</w:t>
-      </w:r>
-      <w:r>
-        <w:t xml:space="preserve"> </w:t>
-      </w:r>
-      <w:hyperlink r:id="rId120">
+        <w:t xml:space="preserve"> </w:t>
+      </w:r>
+      <w:r>
+        <w:t xml:space="preserve">(Dundee).</w:t>
+      </w:r>
+      <w:r>
+        <w:t xml:space="preserve"> </w:t>
+      </w:r>
+      <w:hyperlink r:id="rId109">
         <w:r>
           <w:rPr>
             <w:rStyle w:val="Hyperlink"/>
@@ -17656,8 +17674,8 @@
         <w:t xml:space="preserve">.</w:t>
       </w:r>
     </w:p>
-    <w:bookmarkEnd w:id="121"/>
-    <w:bookmarkStart w:id="122" w:name="ref-Kulczycki2019"/>
+    <w:bookmarkEnd w:id="110"/>
+    <w:bookmarkStart w:id="111" w:name="ref-Kulczycki2019"/>
     <w:p>
       <w:pPr>
         <w:pStyle w:val="Bibliography"/>
@@ -17688,8 +17706,8 @@
         <w:t xml:space="preserve">, nr 6.</w:t>
       </w:r>
     </w:p>
-    <w:bookmarkEnd w:id="122"/>
-    <w:bookmarkStart w:id="123" w:name="ref-lundberg2017"/>
+    <w:bookmarkEnd w:id="111"/>
+    <w:bookmarkStart w:id="112" w:name="ref-lundberg2017"/>
     <w:p>
       <w:pPr>
         <w:pStyle w:val="Bibliography"/>
@@ -17704,7 +17722,7 @@
         <w:t xml:space="preserve">„A unified approach to interpreting model predictions”</w:t>
       </w:r>
       <w:r>
-        <w:t xml:space="preserve">. W</w:t>
+        <w:t xml:space="preserve">.</w:t>
       </w:r>
       <w:r>
         <w:t xml:space="preserve"> </w:t>
@@ -17717,11 +17735,14 @@
         <w:t xml:space="preserve">Advances in Neural Information Processing Systems</w:t>
       </w:r>
       <w:r>
-        <w:t xml:space="preserve">, 30:4765–74.</w:t>
-      </w:r>
-    </w:p>
-    <w:bookmarkEnd w:id="123"/>
-    <w:bookmarkStart w:id="124" w:name="ref-rozp_ewaluacja2022"/>
+        <w:t xml:space="preserve"> </w:t>
+      </w:r>
+      <w:r>
+        <w:t xml:space="preserve">30: 4765–74.</w:t>
+      </w:r>
+    </w:p>
+    <w:bookmarkEnd w:id="112"/>
+    <w:bookmarkStart w:id="113" w:name="ref-rozp_ewaluacja2022"/>
     <w:p>
       <w:pPr>
         <w:pStyle w:val="Bibliography"/>
@@ -17733,14 +17754,18 @@
         <w:t xml:space="preserve"> </w:t>
       </w:r>
       <w:r>
-        <w:t xml:space="preserve">„Obwieszczenie Ministra Edukacji i Nauki z dnia 23 lutego 2022 r. w sprawie ogłoszenia jednolitego tekstu rozporządzenia Ministra Nauki i Szkolnictwa Wyższego w sprawie ewaluacji jakości działalności naukowej”</w:t>
+        <w:rPr>
+          <w:i/>
+          <w:iCs/>
+        </w:rPr>
+        <w:t xml:space="preserve">Obwieszczenie Ministra Edukacji i Nauki z dnia 23 lutego 2022 r. w sprawie ogłoszenia jednolitego tekstu rozporządzenia Ministra Nauki i Szkolnictwa Wyższego w sprawie ewaluacji jakości działalności naukowej</w:t>
       </w:r>
       <w:r>
         <w:t xml:space="preserve">. Dz.U. 2022 poz. 661.</w:t>
       </w:r>
     </w:p>
-    <w:bookmarkEnd w:id="124"/>
-    <w:bookmarkStart w:id="125" w:name="ref-rozp_dyscypliny2025"/>
+    <w:bookmarkEnd w:id="113"/>
+    <w:bookmarkStart w:id="114" w:name="ref-rozp_dyscypliny2025"/>
     <w:p>
       <w:pPr>
         <w:pStyle w:val="Bibliography"/>
@@ -17752,33 +17777,41 @@
         <w:t xml:space="preserve"> </w:t>
       </w:r>
       <w:r>
-        <w:t xml:space="preserve">„Obwieszczenie Ministra Nauki i Szkolnictwa Wyższego z dnia 12 lutego 2025 r. w sprawie ogłoszenia jednolitego tekstu rozporządzenia Ministra Edukacji i Nauki w sprawie dziedzin nauki i dyscyplin naukowych oraz dyscyplin artystycznych”</w:t>
+        <w:rPr>
+          <w:i/>
+          <w:iCs/>
+        </w:rPr>
+        <w:t xml:space="preserve">Obwieszczenie Ministra Nauki i Szkolnictwa Wyższego z dnia 12 lutego 2025 r. w sprawie ogłoszenia jednolitego tekstu rozporządzenia Ministra Edukacji i Nauki w sprawie dziedzin nauki i dyscyplin naukowych oraz dyscyplin artystycznych</w:t>
       </w:r>
       <w:r>
         <w:t xml:space="preserve">. Dz.U. 2025 poz. 211.</w:t>
       </w:r>
     </w:p>
-    <w:bookmarkEnd w:id="125"/>
-    <w:bookmarkStart w:id="126" w:name="ref-rozp_ewaluacja_nowela2025"/>
+    <w:bookmarkEnd w:id="114"/>
+    <w:bookmarkStart w:id="115" w:name="ref-rozp_ewaluacja_nowela2025"/>
     <w:p>
       <w:pPr>
         <w:pStyle w:val="Bibliography"/>
       </w:pPr>
       <w:r>
-        <w:t xml:space="preserve">———. 2025b.</w:t>
-      </w:r>
-      <w:r>
-        <w:t xml:space="preserve"> </w:t>
-      </w:r>
-      <w:r>
-        <w:t xml:space="preserve">„Rozporządzenie Ministra Nauki i Szkolnictwa Wyższego z dnia 30 lipca 2025 r. zmieniające rozporządzenie w sprawie ewaluacji jakości działalności naukowej”</w:t>
+        <w:t xml:space="preserve">Minister Nauki i Szkolnictwa Wyższego. 2025b.</w:t>
+      </w:r>
+      <w:r>
+        <w:t xml:space="preserve"> </w:t>
+      </w:r>
+      <w:r>
+        <w:rPr>
+          <w:i/>
+          <w:iCs/>
+        </w:rPr>
+        <w:t xml:space="preserve">Rozporządzenie Ministra Nauki i Szkolnictwa Wyższego z dnia 30 lipca 2025 r. zmieniające rozporządzenie w sprawie ewaluacji jakości działalności naukowej</w:t>
       </w:r>
       <w:r>
         <w:t xml:space="preserve">. Dz.U. 2025 poz. 1053.</w:t>
       </w:r>
     </w:p>
-    <w:bookmarkEnd w:id="126"/>
-    <w:bookmarkStart w:id="127" w:name="ref-moed2010snip"/>
+    <w:bookmarkEnd w:id="115"/>
+    <w:bookmarkStart w:id="116" w:name="ref-moed2010snip"/>
     <w:p>
       <w:pPr>
         <w:pStyle w:val="Bibliography"/>
@@ -17812,8 +17845,8 @@
         <w:t xml:space="preserve">4 (3): 265–77.</w:t>
       </w:r>
     </w:p>
-    <w:bookmarkEnd w:id="127"/>
-    <w:bookmarkStart w:id="129" w:name="Xf57435758c1415795137dce9045dde0a68674c8"/>
+    <w:bookmarkEnd w:id="116"/>
+    <w:bookmarkStart w:id="118" w:name="Xf57435758c1415795137dce9045dde0a68674c8"/>
     <w:p>
       <w:pPr>
         <w:pStyle w:val="Bibliography"/>
@@ -17849,7 +17882,7 @@
       <w:r>
         <w:t xml:space="preserve"> </w:t>
       </w:r>
-      <w:hyperlink r:id="rId128">
+      <w:hyperlink r:id="rId117">
         <w:r>
           <w:rPr>
             <w:rStyle w:val="Hyperlink"/>
@@ -17861,14 +17894,14 @@
         <w:t xml:space="preserve">.</w:t>
       </w:r>
     </w:p>
-    <w:bookmarkEnd w:id="129"/>
-    <w:bookmarkStart w:id="130" w:name="ref-newman2006"/>
+    <w:bookmarkEnd w:id="118"/>
+    <w:bookmarkStart w:id="119" w:name="ref-newman2006"/>
     <w:p>
       <w:pPr>
         <w:pStyle w:val="Bibliography"/>
       </w:pPr>
       <w:r>
-        <w:t xml:space="preserve">———. 2006.</w:t>
+        <w:t xml:space="preserve">Newman, Mark E. J. 2006.</w:t>
       </w:r>
       <w:r>
         <w:t xml:space="preserve"> </w:t>
@@ -17896,8 +17929,8 @@
         <w:t xml:space="preserve">103 (23): 8577–82.</w:t>
       </w:r>
     </w:p>
-    <w:bookmarkEnd w:id="130"/>
-    <w:bookmarkStart w:id="131" w:name="ref-Opalinski2017"/>
+    <w:bookmarkEnd w:id="119"/>
+    <w:bookmarkStart w:id="120" w:name="ref-Opalinski2017"/>
     <w:p>
       <w:pPr>
         <w:pStyle w:val="Bibliography"/>
@@ -17931,8 +17964,8 @@
         <w:t xml:space="preserve">55 (1): 34–65.</w:t>
       </w:r>
     </w:p>
-    <w:bookmarkEnd w:id="131"/>
-    <w:bookmarkStart w:id="132" w:name="ref-openalex2022"/>
+    <w:bookmarkEnd w:id="120"/>
+    <w:bookmarkStart w:id="121" w:name="ref-openalex2022"/>
     <w:p>
       <w:pPr>
         <w:pStyle w:val="Bibliography"/>
@@ -17963,8 +17996,8 @@
         <w:t xml:space="preserve">.</w:t>
       </w:r>
     </w:p>
-    <w:bookmarkEnd w:id="132"/>
-    <w:bookmarkStart w:id="134" w:name="Xfa806a68882317565cd91e2502e10e0c6dc8daa"/>
+    <w:bookmarkEnd w:id="121"/>
+    <w:bookmarkStart w:id="123" w:name="Xfa806a68882317565cd91e2502e10e0c6dc8daa"/>
     <w:p>
       <w:pPr>
         <w:pStyle w:val="Bibliography"/>
@@ -18019,12 +18052,12 @@
         <w:t xml:space="preserve">ITlib. Informačné technológie a knižnice</w:t>
       </w:r>
       <w:r>
-        <w:t xml:space="preserve">.</w:t>
-      </w:r>
-      <w:r>
-        <w:t xml:space="preserve"> </w:t>
-      </w:r>
-      <w:hyperlink r:id="rId133">
+        <w:t xml:space="preserve">, advance online publication.</w:t>
+      </w:r>
+      <w:r>
+        <w:t xml:space="preserve"> </w:t>
+      </w:r>
+      <w:hyperlink r:id="rId122">
         <w:r>
           <w:rPr>
             <w:rStyle w:val="Hyperlink"/>
@@ -18036,8 +18069,8 @@
         <w:t xml:space="preserve">.</w:t>
       </w:r>
     </w:p>
-    <w:bookmarkEnd w:id="134"/>
-    <w:bookmarkStart w:id="135" w:name="ref-waltman2016review"/>
+    <w:bookmarkEnd w:id="123"/>
+    <w:bookmarkStart w:id="124" w:name="ref-waltman2016review"/>
     <w:p>
       <w:pPr>
         <w:pStyle w:val="Bibliography"/>
@@ -18071,8 +18104,8 @@
         <w:t xml:space="preserve">10 (2): 365–91.</w:t>
       </w:r>
     </w:p>
-    <w:bookmarkEnd w:id="135"/>
-    <w:bookmarkStart w:id="137" w:name="ref-omegapsir2024"/>
+    <w:bookmarkEnd w:id="124"/>
+    <w:bookmarkStart w:id="126" w:name="ref-omegapsir2024"/>
     <w:p>
       <w:pPr>
         <w:pStyle w:val="Bibliography"/>
@@ -18084,7 +18117,11 @@
         <w:t xml:space="preserve"> </w:t>
       </w:r>
       <w:r>
-        <w:t xml:space="preserve">„Omega-PSIR: University Research Information System”</w:t>
+        <w:rPr>
+          <w:i/>
+          <w:iCs/>
+        </w:rPr>
+        <w:t xml:space="preserve">Omega-PSIR: University Research Information System</w:t>
       </w:r>
       <w:r>
         <w:t xml:space="preserve">.</w:t>
@@ -18092,7 +18129,7 @@
       <w:r>
         <w:t xml:space="preserve"> </w:t>
       </w:r>
-      <w:hyperlink r:id="rId136">
+      <w:hyperlink r:id="rId125">
         <w:r>
           <w:rPr>
             <w:rStyle w:val="Hyperlink"/>
@@ -18104,8 +18141,8 @@
         <w:t xml:space="preserve">.</w:t>
       </w:r>
     </w:p>
-    <w:bookmarkEnd w:id="137"/>
-    <w:bookmarkStart w:id="138" w:name="ref-winkler1990"/>
+    <w:bookmarkEnd w:id="126"/>
+    <w:bookmarkStart w:id="127" w:name="ref-winkler1990"/>
     <w:p>
       <w:pPr>
         <w:pStyle w:val="Bibliography"/>
@@ -18148,8 +18185,8 @@
         <w:t xml:space="preserve">, 354–59.</w:t>
       </w:r>
     </w:p>
-    <w:bookmarkEnd w:id="138"/>
-    <w:bookmarkStart w:id="139" w:name="ref-youden1950"/>
+    <w:bookmarkEnd w:id="127"/>
+    <w:bookmarkStart w:id="128" w:name="ref-youden1950"/>
     <w:p>
       <w:pPr>
         <w:pStyle w:val="Bibliography"/>
@@ -18183,9 +18220,9 @@
         <w:t xml:space="preserve">3 (1): 32–35.</w:t>
       </w:r>
     </w:p>
-    <w:bookmarkEnd w:id="139"/>
-    <w:bookmarkEnd w:id="140"/>
-    <w:bookmarkEnd w:id="141"/>
+    <w:bookmarkEnd w:id="128"/>
+    <w:bookmarkEnd w:id="129"/>
+    <w:bookmarkEnd w:id="130"/>
     <w:sectPr>
       <w:footnotePr>
         <w:numRestart w:val="eachSect"/>
@@ -18534,10 +18571,10 @@
   <w:docDefaults>
     <w:rPrDefault>
       <w:rPr>
-        <w:rFonts w:asciiTheme="minorHAnsi" w:cstheme="minorBidi" w:eastAsiaTheme="minorHAnsi" w:hAnsiTheme="minorHAnsi"/>
+        <w:rFonts w:asciiTheme="minorHAnsi" w:cstheme="minorBidi" w:eastAsiaTheme="minorEastAsia" w:hAnsiTheme="minorHAnsi"/>
         <w:sz w:val="24"/>
         <w:szCs w:val="24"/>
-        <w:lang w:bidi="ar-SA" w:eastAsia="en-US" w:val="pl"/>
+        <w:lang w:bidi="ar-SA" w:eastAsia="zh-CN" w:val="pl"/>
       </w:rPr>
     </w:rPrDefault>
     <w:pPrDefault>
@@ -19078,13 +19115,6 @@
       </w:tblCellMar>
     </w:tblPr>
     <w:tblStylePr w:type="firstRow">
-      <w:tblPr>
-        <w:jc w:val="left"/>
-        <w:tblInd w:type="dxa" w:w="0"/>
-      </w:tblPr>
-      <w:trPr>
-        <w:jc w:val="left"/>
-      </w:trPr>
       <w:tcPr>
         <w:tcBorders>
           <w:bottom w:val="single"/>

</xml_diff>